<commit_message>
Map checkbox states and support dynamic rows
Add mapping for used/not-used radio values to generate checkbox placeholders (including both "reseach" and "research" spellings) via mapUsedCheckboxes; enhance expandDynamicRows to clone research rows beyond 5 and to expand education history rows. Update the admin form (doc_form_1.html) to add used/not-used radio controls, wrap year/level inputs in a year-level-group class, adjust dynamic-row JS to include radios when adding items, and add client-side logic to toggle/hide year-level inputs based on selection. Update DOCX templates and uploaded docx files and remove temporary editor artifacts.
</commit_message>
<xml_diff>
--- a/HRCP-KKU-Academic/src/main/resources/templates/docx/Phase2/p2doc_1.docx
+++ b/HRCP-KKU-Academic/src/main/resources/templates/docx/Phase2/p2doc_1.docx
@@ -104,7 +104,7 @@
     <w:p>
       <w:pPr>
         <w:rPr>
-          <w:rFonts w:ascii="TH Sarabun New" w:hAnsi="TH Sarabun New" w:cs="TH Sarabun New" w:hint="cs"/>
+          <w:rFonts w:ascii="TH Sarabun New" w:hAnsi="TH Sarabun New" w:cs="TH Sarabun New"/>
           <w:b/>
           <w:bCs/>
           <w:sz w:val="32"/>
@@ -131,7 +131,7 @@
         <w:ind w:left="7920"/>
         <w:jc w:val="center"/>
         <w:rPr>
-          <w:rFonts w:ascii="TH Sarabun New" w:hAnsi="TH Sarabun New" w:cs="TH Sarabun New" w:hint="cs"/>
+          <w:rFonts w:ascii="TH Sarabun New" w:hAnsi="TH Sarabun New" w:cs="TH Sarabun New"/>
           <w:b/>
           <w:bCs/>
           <w:sz w:val="32"/>
@@ -201,7 +201,7 @@
         <w:ind w:left="7920"/>
         <w:jc w:val="center"/>
         <w:rPr>
-          <w:rFonts w:ascii="TH Sarabun New" w:hAnsi="TH Sarabun New" w:cs="TH Sarabun New" w:hint="cs"/>
+          <w:rFonts w:ascii="TH Sarabun New" w:hAnsi="TH Sarabun New" w:cs="TH Sarabun New"/>
           <w:b/>
           <w:bCs/>
           <w:sz w:val="32"/>
@@ -731,7 +731,7 @@
           <w:sz w:val="32"/>
           <w:szCs w:val="32"/>
         </w:rPr>
-        <w:t>{{sub_ major}}</w:t>
+        <w:t>{{sub_major}}</w:t>
       </w:r>
       <w:r>
         <w:rPr>
@@ -1184,16 +1184,24 @@
     </w:p>
     <w:tbl>
       <w:tblPr>
-        <w:tblStyle w:val="TableGrid"/>
+        <w:tblStyle w:val="a8"/>
         <w:tblW w:w="0" w:type="auto"/>
         <w:jc w:val="center"/>
+        <w:tblBorders>
+          <w:top w:val="none" w:sz="0" w:space="0" w:color="auto"/>
+          <w:left w:val="none" w:sz="0" w:space="0" w:color="auto"/>
+          <w:bottom w:val="none" w:sz="0" w:space="0" w:color="auto"/>
+          <w:right w:val="none" w:sz="0" w:space="0" w:color="auto"/>
+          <w:insideH w:val="none" w:sz="0" w:space="0" w:color="auto"/>
+          <w:insideV w:val="none" w:sz="0" w:space="0" w:color="auto"/>
+        </w:tblBorders>
         <w:tblLook w:val="04A0" w:firstRow="1" w:lastRow="0" w:firstColumn="1" w:lastColumn="0" w:noHBand="0" w:noVBand="1"/>
       </w:tblPr>
       <w:tblGrid>
-        <w:gridCol w:w="3363"/>
-        <w:gridCol w:w="1095"/>
-        <w:gridCol w:w="1886"/>
-        <w:gridCol w:w="3006"/>
+        <w:gridCol w:w="2027"/>
+        <w:gridCol w:w="2427"/>
+        <w:gridCol w:w="2180"/>
+        <w:gridCol w:w="2726"/>
       </w:tblGrid>
       <w:tr>
         <w:trPr>
@@ -1309,7 +1317,23 @@
                 <w:sz w:val="32"/>
                 <w:szCs w:val="32"/>
               </w:rPr>
-              <w:t>{{?education_list}}{{education_no}}</w:t>
+              <w:t>{{</w:t>
+            </w:r>
+            <w:r>
+              <w:rPr>
+                <w:rFonts w:ascii="TH Sarabun New" w:hAnsi="TH Sarabun New" w:cs="TH Sarabun New"/>
+                <w:sz w:val="32"/>
+                <w:szCs w:val="32"/>
+              </w:rPr>
+              <w:t>education_no_1</w:t>
+            </w:r>
+            <w:r>
+              <w:rPr>
+                <w:rFonts w:ascii="TH Sarabun New" w:hAnsi="TH Sarabun New" w:cs="TH Sarabun New"/>
+                <w:sz w:val="32"/>
+                <w:szCs w:val="32"/>
+              </w:rPr>
+              <w:t>}}</w:t>
             </w:r>
           </w:p>
         </w:tc>
@@ -1331,7 +1355,47 @@
                 <w:sz w:val="32"/>
                 <w:szCs w:val="32"/>
               </w:rPr>
-              <w:t>{{degree}}</w:t>
+              <w:t>{{</w:t>
+            </w:r>
+            <w:r>
+              <w:rPr>
+                <w:rFonts w:ascii="TH Sarabun New" w:hAnsi="TH Sarabun New" w:cs="TH Sarabun New"/>
+                <w:sz w:val="32"/>
+                <w:szCs w:val="32"/>
+              </w:rPr>
+              <w:t>education_degree_1</w:t>
+            </w:r>
+            <w:r>
+              <w:rPr>
+                <w:rFonts w:ascii="TH Sarabun New" w:hAnsi="TH Sarabun New" w:cs="TH Sarabun New"/>
+                <w:sz w:val="32"/>
+                <w:szCs w:val="32"/>
+              </w:rPr>
+              <w:t>}}</w:t>
+            </w:r>
+            <w:r>
+              <w:rPr>
+                <w:rFonts w:ascii="TH Sarabun New" w:hAnsi="TH Sarabun New" w:cs="TH Sarabun New"/>
+                <w:sz w:val="32"/>
+                <w:szCs w:val="32"/>
+              </w:rPr>
+              <w:t xml:space="preserve"> {{</w:t>
+            </w:r>
+            <w:r>
+              <w:rPr>
+                <w:rFonts w:ascii="TH Sarabun New" w:hAnsi="TH Sarabun New" w:cs="TH Sarabun New"/>
+                <w:sz w:val="32"/>
+                <w:szCs w:val="32"/>
+              </w:rPr>
+              <w:t>education_major_1</w:t>
+            </w:r>
+            <w:r>
+              <w:rPr>
+                <w:rFonts w:ascii="TH Sarabun New" w:hAnsi="TH Sarabun New" w:cs="TH Sarabun New"/>
+                <w:sz w:val="32"/>
+                <w:szCs w:val="32"/>
+              </w:rPr>
+              <w:t>}}</w:t>
             </w:r>
           </w:p>
         </w:tc>
@@ -1353,7 +1417,7 @@
                 <w:sz w:val="32"/>
                 <w:szCs w:val="32"/>
               </w:rPr>
-              <w:t>{{graduate</w:t>
+              <w:t>{{</w:t>
             </w:r>
             <w:r>
               <w:rPr>
@@ -1361,7 +1425,7 @@
                 <w:sz w:val="32"/>
                 <w:szCs w:val="32"/>
               </w:rPr>
-              <w:t>d</w:t>
+              <w:t>education_year_1</w:t>
             </w:r>
             <w:r>
               <w:rPr>
@@ -1369,7 +1433,7 @@
                 <w:sz w:val="32"/>
                 <w:szCs w:val="32"/>
               </w:rPr>
-              <w:t>_year}}</w:t>
+              <w:t>}}</w:t>
             </w:r>
           </w:p>
         </w:tc>
@@ -1391,7 +1455,7 @@
                 <w:sz w:val="32"/>
                 <w:szCs w:val="32"/>
               </w:rPr>
-              <w:t>{{institution}}</w:t>
+              <w:t>{{</w:t>
             </w:r>
             <w:r>
               <w:rPr>
@@ -1399,7 +1463,39 @@
                 <w:sz w:val="32"/>
                 <w:szCs w:val="32"/>
               </w:rPr>
-              <w:t>{{/education_list}}</w:t>
+              <w:t>education_institution_1</w:t>
+            </w:r>
+            <w:r>
+              <w:rPr>
+                <w:rFonts w:ascii="TH Sarabun New" w:hAnsi="TH Sarabun New" w:cs="TH Sarabun New"/>
+                <w:sz w:val="32"/>
+                <w:szCs w:val="32"/>
+              </w:rPr>
+              <w:t>}}</w:t>
+            </w:r>
+            <w:r>
+              <w:rPr>
+                <w:rFonts w:ascii="TH Sarabun New" w:hAnsi="TH Sarabun New" w:cs="TH Sarabun New"/>
+                <w:sz w:val="32"/>
+                <w:szCs w:val="32"/>
+              </w:rPr>
+              <w:t xml:space="preserve"> {{</w:t>
+            </w:r>
+            <w:r>
+              <w:rPr>
+                <w:rFonts w:ascii="TH Sarabun New" w:hAnsi="TH Sarabun New" w:cs="TH Sarabun New"/>
+                <w:sz w:val="32"/>
+                <w:szCs w:val="32"/>
+              </w:rPr>
+              <w:t>education_country_1</w:t>
+            </w:r>
+            <w:r>
+              <w:rPr>
+                <w:rFonts w:ascii="TH Sarabun New" w:hAnsi="TH Sarabun New" w:cs="TH Sarabun New"/>
+                <w:sz w:val="32"/>
+                <w:szCs w:val="32"/>
+              </w:rPr>
+              <w:t>}}</w:t>
             </w:r>
           </w:p>
         </w:tc>
@@ -1634,51 +1730,6 @@
           <w:szCs w:val="32"/>
           <w:cs/>
         </w:rPr>
-        <w:tab/>
-      </w:r>
-      <w:r>
-        <w:rPr>
-          <w:rFonts w:ascii="TH Sarabun New" w:hAnsi="TH Sarabun New" w:cs="TH Sarabun New"/>
-          <w:sz w:val="32"/>
-          <w:szCs w:val="32"/>
-          <w:cs/>
-        </w:rPr>
-        <w:t>๒.๒ ได้รับแต่งตั้งให้ดำรงตำแหน่งอาจารย์ เมื่อวันที่</w:t>
-      </w:r>
-      <w:r>
-        <w:rPr>
-          <w:rFonts w:ascii="TH Sarabun New" w:hAnsi="TH Sarabun New" w:cs="TH Sarabun New"/>
-          <w:sz w:val="32"/>
-          <w:szCs w:val="32"/>
-          <w:cs/>
-        </w:rPr>
-        <w:t xml:space="preserve"> </w:t>
-      </w:r>
-      <w:r>
-        <w:rPr>
-          <w:rFonts w:ascii="TH Sarabun New" w:hAnsi="TH Sarabun New" w:cs="TH Sarabun New"/>
-          <w:sz w:val="32"/>
-          <w:szCs w:val="32"/>
-        </w:rPr>
-        <w:t>{{lecturer_appointment_date}}</w:t>
-      </w:r>
-    </w:p>
-    <w:p>
-      <w:pPr>
-        <w:spacing w:after="0" w:line="240" w:lineRule="auto"/>
-        <w:rPr>
-          <w:rFonts w:ascii="TH Sarabun New" w:hAnsi="TH Sarabun New" w:cs="TH Sarabun New"/>
-          <w:sz w:val="32"/>
-          <w:szCs w:val="32"/>
-        </w:rPr>
-      </w:pPr>
-      <w:r>
-        <w:rPr>
-          <w:rFonts w:ascii="TH Sarabun New" w:hAnsi="TH Sarabun New" w:cs="TH Sarabun New"/>
-          <w:sz w:val="32"/>
-          <w:szCs w:val="32"/>
-          <w:cs/>
-        </w:rPr>
         <w:lastRenderedPageBreak/>
         <w:tab/>
       </w:r>
@@ -1689,6 +1740,51 @@
           <w:szCs w:val="32"/>
           <w:cs/>
         </w:rPr>
+        <w:t>๒.๒ ได้รับแต่งตั้งให้ดำรงตำแหน่งอาจารย์ เมื่อวันที่</w:t>
+      </w:r>
+      <w:r>
+        <w:rPr>
+          <w:rFonts w:ascii="TH Sarabun New" w:hAnsi="TH Sarabun New" w:cs="TH Sarabun New"/>
+          <w:sz w:val="32"/>
+          <w:szCs w:val="32"/>
+          <w:cs/>
+        </w:rPr>
+        <w:t xml:space="preserve"> </w:t>
+      </w:r>
+      <w:r>
+        <w:rPr>
+          <w:rFonts w:ascii="TH Sarabun New" w:hAnsi="TH Sarabun New" w:cs="TH Sarabun New"/>
+          <w:sz w:val="32"/>
+          <w:szCs w:val="32"/>
+        </w:rPr>
+        <w:t>{{lecturer_appointment_date}}</w:t>
+      </w:r>
+    </w:p>
+    <w:p>
+      <w:pPr>
+        <w:spacing w:after="0" w:line="240" w:lineRule="auto"/>
+        <w:rPr>
+          <w:rFonts w:ascii="TH Sarabun New" w:hAnsi="TH Sarabun New" w:cs="TH Sarabun New"/>
+          <w:sz w:val="32"/>
+          <w:szCs w:val="32"/>
+        </w:rPr>
+      </w:pPr>
+      <w:r>
+        <w:rPr>
+          <w:rFonts w:ascii="TH Sarabun New" w:hAnsi="TH Sarabun New" w:cs="TH Sarabun New"/>
+          <w:sz w:val="32"/>
+          <w:szCs w:val="32"/>
+          <w:cs/>
+        </w:rPr>
+        <w:tab/>
+      </w:r>
+      <w:r>
+        <w:rPr>
+          <w:rFonts w:ascii="TH Sarabun New" w:hAnsi="TH Sarabun New" w:cs="TH Sarabun New"/>
+          <w:sz w:val="32"/>
+          <w:szCs w:val="32"/>
+          <w:cs/>
+        </w:rPr>
         <w:t>๒.๓ ได้รับแต่งตั้งให้ดำรงตำแหน่งผู้ช่วยศาสตราจารย์</w:t>
       </w:r>
       <w:r>
@@ -1914,7 +2010,15 @@
           <w:sz w:val="32"/>
           <w:szCs w:val="32"/>
         </w:rPr>
-        <w:t>associate_method</w:t>
+        <w:t>associate</w:t>
+      </w:r>
+      <w:r>
+        <w:rPr>
+          <w:rFonts w:ascii="TH Sarabun New" w:hAnsi="TH Sarabun New" w:cs="TH Sarabun New"/>
+          <w:sz w:val="32"/>
+          <w:szCs w:val="32"/>
+        </w:rPr>
+        <w:t>_method</w:t>
       </w:r>
       <w:r>
         <w:rPr>
@@ -1957,7 +2061,23 @@
           <w:sz w:val="32"/>
           <w:szCs w:val="32"/>
         </w:rPr>
-        <w:t>{{associate_department}}</w:t>
+        <w:t>{{</w:t>
+      </w:r>
+      <w:r>
+        <w:rPr>
+          <w:rFonts w:ascii="TH Sarabun New" w:hAnsi="TH Sarabun New" w:cs="TH Sarabun New"/>
+          <w:sz w:val="32"/>
+          <w:szCs w:val="32"/>
+        </w:rPr>
+        <w:t>associate</w:t>
+      </w:r>
+      <w:r>
+        <w:rPr>
+          <w:rFonts w:ascii="TH Sarabun New" w:hAnsi="TH Sarabun New" w:cs="TH Sarabun New"/>
+          <w:sz w:val="32"/>
+          <w:szCs w:val="32"/>
+        </w:rPr>
+        <w:t>_department}}</w:t>
       </w:r>
     </w:p>
     <w:p>
@@ -2220,23 +2340,47 @@
           <w:sz w:val="32"/>
           <w:szCs w:val="32"/>
         </w:rPr>
-        <w:t>{{?other_position_list}}{{other_position_no}}</w:t>
-      </w:r>
-      <w:r>
-        <w:rPr>
-          <w:rFonts w:ascii="TH Sarabun New" w:hAnsi="TH Sarabun New" w:cs="TH Sarabun New"/>
-          <w:sz w:val="32"/>
-          <w:szCs w:val="32"/>
-        </w:rPr>
-        <w:t xml:space="preserve"> {{other_position}}</w:t>
-      </w:r>
-      <w:r>
-        <w:rPr>
-          <w:rFonts w:ascii="TH Sarabun New" w:hAnsi="TH Sarabun New" w:cs="TH Sarabun New"/>
-          <w:sz w:val="32"/>
-          <w:szCs w:val="32"/>
-        </w:rPr>
-        <w:t>{{/other_position}}</w:t>
+        <w:t>{{other_position_no</w:t>
+      </w:r>
+      <w:r>
+        <w:rPr>
+          <w:rFonts w:ascii="TH Sarabun New" w:hAnsi="TH Sarabun New" w:cs="TH Sarabun New"/>
+          <w:sz w:val="32"/>
+          <w:szCs w:val="32"/>
+        </w:rPr>
+        <w:t>_1</w:t>
+      </w:r>
+      <w:r>
+        <w:rPr>
+          <w:rFonts w:ascii="TH Sarabun New" w:hAnsi="TH Sarabun New" w:cs="TH Sarabun New"/>
+          <w:sz w:val="32"/>
+          <w:szCs w:val="32"/>
+        </w:rPr>
+        <w:t>}}</w:t>
+      </w:r>
+      <w:r>
+        <w:rPr>
+          <w:rFonts w:ascii="TH Sarabun New" w:hAnsi="TH Sarabun New" w:cs="TH Sarabun New"/>
+          <w:sz w:val="32"/>
+          <w:szCs w:val="32"/>
+        </w:rPr>
+        <w:t xml:space="preserve"> {{other_position</w:t>
+      </w:r>
+      <w:r>
+        <w:rPr>
+          <w:rFonts w:ascii="TH Sarabun New" w:hAnsi="TH Sarabun New" w:cs="TH Sarabun New"/>
+          <w:sz w:val="32"/>
+          <w:szCs w:val="32"/>
+        </w:rPr>
+        <w:t>_1</w:t>
+      </w:r>
+      <w:r>
+        <w:rPr>
+          <w:rFonts w:ascii="TH Sarabun New" w:hAnsi="TH Sarabun New" w:cs="TH Sarabun New"/>
+          <w:sz w:val="32"/>
+          <w:szCs w:val="32"/>
+        </w:rPr>
+        <w:t>}}</w:t>
       </w:r>
     </w:p>
     <w:p>
@@ -2364,23 +2508,47 @@
           <w:sz w:val="32"/>
           <w:szCs w:val="32"/>
         </w:rPr>
-        <w:t>{{?international_speaker_last_5_years_list}}{{international_speaker_last_5_years_no}}</w:t>
-      </w:r>
-      <w:r>
-        <w:rPr>
-          <w:rFonts w:ascii="TH Sarabun New" w:hAnsi="TH Sarabun New" w:cs="TH Sarabun New"/>
-          <w:sz w:val="32"/>
-          <w:szCs w:val="32"/>
-        </w:rPr>
-        <w:t xml:space="preserve"> {{international_speaker_last_5_years}}</w:t>
-      </w:r>
-      <w:r>
-        <w:rPr>
-          <w:rFonts w:ascii="TH Sarabun New" w:hAnsi="TH Sarabun New" w:cs="TH Sarabun New"/>
-          <w:sz w:val="32"/>
-          <w:szCs w:val="32"/>
-        </w:rPr>
-        <w:t>{{/international_speaker_last_5_years_list}}</w:t>
+        <w:t>{{international_speaker_last_5_years_no</w:t>
+      </w:r>
+      <w:r>
+        <w:rPr>
+          <w:rFonts w:ascii="TH Sarabun New" w:hAnsi="TH Sarabun New" w:cs="TH Sarabun New"/>
+          <w:sz w:val="32"/>
+          <w:szCs w:val="32"/>
+        </w:rPr>
+        <w:t>_1</w:t>
+      </w:r>
+      <w:r>
+        <w:rPr>
+          <w:rFonts w:ascii="TH Sarabun New" w:hAnsi="TH Sarabun New" w:cs="TH Sarabun New"/>
+          <w:sz w:val="32"/>
+          <w:szCs w:val="32"/>
+        </w:rPr>
+        <w:t>}}</w:t>
+      </w:r>
+      <w:r>
+        <w:rPr>
+          <w:rFonts w:ascii="TH Sarabun New" w:hAnsi="TH Sarabun New" w:cs="TH Sarabun New"/>
+          <w:sz w:val="32"/>
+          <w:szCs w:val="32"/>
+        </w:rPr>
+        <w:t xml:space="preserve"> {{international_speaker_last_5_years</w:t>
+      </w:r>
+      <w:r>
+        <w:rPr>
+          <w:rFonts w:ascii="TH Sarabun New" w:hAnsi="TH Sarabun New" w:cs="TH Sarabun New"/>
+          <w:sz w:val="32"/>
+          <w:szCs w:val="32"/>
+        </w:rPr>
+        <w:t>_1</w:t>
+      </w:r>
+      <w:r>
+        <w:rPr>
+          <w:rFonts w:ascii="TH Sarabun New" w:hAnsi="TH Sarabun New" w:cs="TH Sarabun New"/>
+          <w:sz w:val="32"/>
+          <w:szCs w:val="32"/>
+        </w:rPr>
+        <w:t>}}</w:t>
       </w:r>
     </w:p>
     <w:p>
@@ -2459,7 +2627,7 @@
     </w:p>
     <w:tbl>
       <w:tblPr>
-        <w:tblStyle w:val="TableGrid"/>
+        <w:tblStyle w:val="a8"/>
         <w:tblW w:w="0" w:type="auto"/>
         <w:tblBorders>
           <w:top w:val="none" w:sz="0" w:space="0" w:color="auto"/>
@@ -2472,10 +2640,10 @@
         <w:tblLook w:val="04A0" w:firstRow="1" w:lastRow="0" w:firstColumn="1" w:lastColumn="0" w:noHBand="0" w:noVBand="1"/>
       </w:tblPr>
       <w:tblGrid>
-        <w:gridCol w:w="2596"/>
-        <w:gridCol w:w="1609"/>
-        <w:gridCol w:w="2265"/>
-        <w:gridCol w:w="2890"/>
+        <w:gridCol w:w="1892"/>
+        <w:gridCol w:w="2118"/>
+        <w:gridCol w:w="2984"/>
+        <w:gridCol w:w="2366"/>
       </w:tblGrid>
       <w:tr>
         <w:tc>
@@ -2586,14 +2754,6 @@
                 <w:szCs w:val="32"/>
               </w:rPr>
             </w:pPr>
-            <w:r>
-              <w:rPr>
-                <w:rFonts w:ascii="TH Sarabun New" w:hAnsi="TH Sarabun New" w:cs="TH Sarabun New"/>
-                <w:sz w:val="32"/>
-                <w:szCs w:val="32"/>
-              </w:rPr>
-              <w:t>{{?teaching_list}}</w:t>
-            </w:r>
             <w:r>
               <w:rPr>
                 <w:rFonts w:ascii="TH Sarabun New" w:hAnsi="TH Sarabun New" w:cs="TH Sarabun New"/>
@@ -2732,14 +2892,6 @@
               </w:rPr>
               <w:t>semester}}</w:t>
             </w:r>
-            <w:r>
-              <w:rPr>
-                <w:rFonts w:ascii="TH Sarabun New" w:hAnsi="TH Sarabun New" w:cs="TH Sarabun New"/>
-                <w:sz w:val="32"/>
-                <w:szCs w:val="32"/>
-              </w:rPr>
-              <w:t>{{/teaching_list}}</w:t>
-            </w:r>
           </w:p>
         </w:tc>
       </w:tr>
@@ -2928,25 +3080,25 @@
           <w:szCs w:val="32"/>
           <w:cs/>
         </w:rPr>
+        <w:t xml:space="preserve">๓.๕ งานอื่น ๆ ที่เกี่ยวข้อง (โปรดระบุประเภทของงานและปริมาณเวลาที่ใช้ต่อสัปดาห์) </w:t>
+      </w:r>
+    </w:p>
+    <w:p>
+      <w:pPr>
+        <w:spacing w:after="0" w:line="240" w:lineRule="auto"/>
+        <w:rPr>
+          <w:rFonts w:ascii="TH Sarabun New" w:hAnsi="TH Sarabun New" w:cs="TH Sarabun New"/>
+          <w:sz w:val="32"/>
+          <w:szCs w:val="32"/>
+        </w:rPr>
+      </w:pPr>
+      <w:r>
+        <w:rPr>
+          <w:rFonts w:ascii="TH Sarabun New" w:hAnsi="TH Sarabun New" w:cs="TH Sarabun New"/>
+          <w:sz w:val="32"/>
+          <w:szCs w:val="32"/>
+        </w:rPr>
         <w:lastRenderedPageBreak/>
-        <w:t xml:space="preserve">๓.๕ งานอื่น ๆ ที่เกี่ยวข้อง (โปรดระบุประเภทของงานและปริมาณเวลาที่ใช้ต่อสัปดาห์) </w:t>
-      </w:r>
-    </w:p>
-    <w:p>
-      <w:pPr>
-        <w:spacing w:after="0" w:line="240" w:lineRule="auto"/>
-        <w:rPr>
-          <w:rFonts w:ascii="TH Sarabun New" w:hAnsi="TH Sarabun New" w:cs="TH Sarabun New"/>
-          <w:sz w:val="32"/>
-          <w:szCs w:val="32"/>
-        </w:rPr>
-      </w:pPr>
-      <w:r>
-        <w:rPr>
-          <w:rFonts w:ascii="TH Sarabun New" w:hAnsi="TH Sarabun New" w:cs="TH Sarabun New"/>
-          <w:sz w:val="32"/>
-          <w:szCs w:val="32"/>
-        </w:rPr>
         <w:t>{{other}}</w:t>
       </w:r>
     </w:p>
@@ -3034,15 +3186,23 @@
           <w:sz w:val="32"/>
           <w:szCs w:val="32"/>
         </w:rPr>
-        <w:t>{{?assistant_research_working_list}}</w:t>
-      </w:r>
-      <w:r>
-        <w:rPr>
-          <w:rFonts w:ascii="TH Sarabun New" w:hAnsi="TH Sarabun New" w:cs="TH Sarabun New"/>
-          <w:sz w:val="32"/>
-          <w:szCs w:val="32"/>
-        </w:rPr>
-        <w:t>{{assistant_research_working_no}}</w:t>
+        <w:t>{{asst_research_</w:t>
+      </w:r>
+      <w:r>
+        <w:rPr>
+          <w:rFonts w:ascii="TH Sarabun New" w:hAnsi="TH Sarabun New" w:cs="TH Sarabun New"/>
+          <w:sz w:val="32"/>
+          <w:szCs w:val="32"/>
+        </w:rPr>
+        <w:t>working_no_1</w:t>
+      </w:r>
+      <w:r>
+        <w:rPr>
+          <w:rFonts w:ascii="TH Sarabun New" w:hAnsi="TH Sarabun New" w:cs="TH Sarabun New"/>
+          <w:sz w:val="32"/>
+          <w:szCs w:val="32"/>
+        </w:rPr>
+        <w:t>}}</w:t>
       </w:r>
       <w:r>
         <w:rPr>
@@ -3058,7 +3218,15 @@
           <w:sz w:val="32"/>
           <w:szCs w:val="32"/>
         </w:rPr>
-        <w:t>assistant_</w:t>
+        <w:t>asst</w:t>
+      </w:r>
+      <w:r>
+        <w:rPr>
+          <w:rFonts w:ascii="TH Sarabun New" w:hAnsi="TH Sarabun New" w:cs="TH Sarabun New"/>
+          <w:sz w:val="32"/>
+          <w:szCs w:val="32"/>
+        </w:rPr>
+        <w:t>_</w:t>
       </w:r>
       <w:r>
         <w:rPr>
@@ -3082,6 +3250,14 @@
           <w:sz w:val="32"/>
           <w:szCs w:val="32"/>
         </w:rPr>
+        <w:t>_1</w:t>
+      </w:r>
+      <w:r>
+        <w:rPr>
+          <w:rFonts w:ascii="TH Sarabun New" w:hAnsi="TH Sarabun New" w:cs="TH Sarabun New"/>
+          <w:sz w:val="32"/>
+          <w:szCs w:val="32"/>
+        </w:rPr>
         <w:t>}}</w:t>
       </w:r>
     </w:p>
@@ -3150,7 +3326,15 @@
           <w:sz w:val="32"/>
           <w:szCs w:val="32"/>
         </w:rPr>
-        <w:t>assistant_</w:t>
+        <w:t>asst</w:t>
+      </w:r>
+      <w:r>
+        <w:rPr>
+          <w:rFonts w:ascii="TH Sarabun New" w:hAnsi="TH Sarabun New" w:cs="TH Sarabun New"/>
+          <w:sz w:val="32"/>
+          <w:szCs w:val="32"/>
+        </w:rPr>
+        <w:t>_</w:t>
       </w:r>
       <w:r>
         <w:rPr>
@@ -3166,7 +3350,24 @@
           <w:sz w:val="32"/>
           <w:szCs w:val="32"/>
         </w:rPr>
-        <w:t>used_reseach}}</w:t>
+        <w:t>used_reseach</w:t>
+      </w:r>
+      <w:r>
+        <w:rPr>
+          <w:rFonts w:ascii="TH Sarabun New" w:hAnsi="TH Sarabun New" w:cs="TH Sarabun New"/>
+          <w:sz w:val="32"/>
+          <w:szCs w:val="32"/>
+        </w:rPr>
+        <w:t>_1</w:t>
+      </w:r>
+      <w:proofErr w:type="gramStart"/>
+      <w:r>
+        <w:rPr>
+          <w:rFonts w:ascii="TH Sarabun New" w:hAnsi="TH Sarabun New" w:cs="TH Sarabun New"/>
+          <w:sz w:val="32"/>
+          <w:szCs w:val="32"/>
+        </w:rPr>
+        <w:t>}}</w:t>
       </w:r>
       <w:r>
         <w:rPr>
@@ -3177,15 +3378,17 @@
         </w:rPr>
         <w:t xml:space="preserve">  ไม่เคยใช้</w:t>
       </w:r>
+      <w:proofErr w:type="gramEnd"/>
     </w:p>
     <w:p>
       <w:pPr>
         <w:spacing w:after="0" w:line="240" w:lineRule="auto"/>
         <w:ind w:left="1755" w:firstLine="720"/>
         <w:rPr>
-          <w:rFonts w:ascii="TH Sarabun New" w:hAnsi="TH Sarabun New" w:cs="TH Sarabun New"/>
-          <w:sz w:val="32"/>
-          <w:szCs w:val="32"/>
+          <w:rFonts w:ascii="TH Sarabun New" w:hAnsi="TH Sarabun New" w:cs="TH Sarabun New" w:hint="cs"/>
+          <w:sz w:val="32"/>
+          <w:szCs w:val="32"/>
+          <w:cs/>
         </w:rPr>
       </w:pPr>
       <w:r>
@@ -3202,7 +3405,15 @@
           <w:sz w:val="32"/>
           <w:szCs w:val="32"/>
         </w:rPr>
-        <w:t>assistant_</w:t>
+        <w:t>asst</w:t>
+      </w:r>
+      <w:r>
+        <w:rPr>
+          <w:rFonts w:ascii="TH Sarabun New" w:hAnsi="TH Sarabun New" w:cs="TH Sarabun New"/>
+          <w:sz w:val="32"/>
+          <w:szCs w:val="32"/>
+        </w:rPr>
+        <w:t>_</w:t>
       </w:r>
       <w:r>
         <w:rPr>
@@ -3218,7 +3429,24 @@
           <w:sz w:val="32"/>
           <w:szCs w:val="32"/>
         </w:rPr>
-        <w:t>used_reseach}}</w:t>
+        <w:t>used_reseach</w:t>
+      </w:r>
+      <w:r>
+        <w:rPr>
+          <w:rFonts w:ascii="TH Sarabun New" w:hAnsi="TH Sarabun New" w:cs="TH Sarabun New"/>
+          <w:sz w:val="32"/>
+          <w:szCs w:val="32"/>
+        </w:rPr>
+        <w:t>_1</w:t>
+      </w:r>
+      <w:proofErr w:type="gramStart"/>
+      <w:r>
+        <w:rPr>
+          <w:rFonts w:ascii="TH Sarabun New" w:hAnsi="TH Sarabun New" w:cs="TH Sarabun New"/>
+          <w:sz w:val="32"/>
+          <w:szCs w:val="32"/>
+        </w:rPr>
+        <w:t>}}</w:t>
       </w:r>
       <w:r>
         <w:rPr>
@@ -3238,6 +3466,7 @@
         </w:rPr>
         <w:t>เคยใช้</w:t>
       </w:r>
+      <w:proofErr w:type="gramEnd"/>
       <w:r>
         <w:rPr>
           <w:rFonts w:ascii="TH Sarabun New" w:hAnsi="TH Sarabun New" w:cs="TH Sarabun New"/>
@@ -3289,7 +3518,39 @@
           <w:sz w:val="32"/>
           <w:szCs w:val="32"/>
         </w:rPr>
-        <w:t xml:space="preserve">{{assistant_used_research_year}} </w:t>
+        <w:t>{{</w:t>
+      </w:r>
+      <w:r>
+        <w:rPr>
+          <w:rFonts w:ascii="TH Sarabun New" w:hAnsi="TH Sarabun New" w:cs="TH Sarabun New"/>
+          <w:sz w:val="32"/>
+          <w:szCs w:val="32"/>
+        </w:rPr>
+        <w:t>asst</w:t>
+      </w:r>
+      <w:r>
+        <w:rPr>
+          <w:rFonts w:ascii="TH Sarabun New" w:hAnsi="TH Sarabun New" w:cs="TH Sarabun New"/>
+          <w:sz w:val="32"/>
+          <w:szCs w:val="32"/>
+        </w:rPr>
+        <w:t>_</w:t>
+      </w:r>
+      <w:r>
+        <w:rPr>
+          <w:rFonts w:ascii="TH Sarabun New" w:hAnsi="TH Sarabun New" w:cs="TH Sarabun New"/>
+          <w:sz w:val="32"/>
+          <w:szCs w:val="32"/>
+        </w:rPr>
+        <w:t>used_research_year_1</w:t>
+      </w:r>
+      <w:r>
+        <w:rPr>
+          <w:rFonts w:ascii="TH Sarabun New" w:hAnsi="TH Sarabun New" w:cs="TH Sarabun New"/>
+          <w:sz w:val="32"/>
+          <w:szCs w:val="32"/>
+        </w:rPr>
+        <w:t xml:space="preserve">}} </w:t>
       </w:r>
       <w:r>
         <w:rPr>
@@ -3306,7 +3567,39 @@
           <w:sz w:val="32"/>
           <w:szCs w:val="32"/>
         </w:rPr>
-        <w:t>{{assistant_used_research_level}}</w:t>
+        <w:t>{{</w:t>
+      </w:r>
+      <w:r>
+        <w:rPr>
+          <w:rFonts w:ascii="TH Sarabun New" w:hAnsi="TH Sarabun New" w:cs="TH Sarabun New"/>
+          <w:sz w:val="32"/>
+          <w:szCs w:val="32"/>
+        </w:rPr>
+        <w:t>asst</w:t>
+      </w:r>
+      <w:r>
+        <w:rPr>
+          <w:rFonts w:ascii="TH Sarabun New" w:hAnsi="TH Sarabun New" w:cs="TH Sarabun New"/>
+          <w:sz w:val="32"/>
+          <w:szCs w:val="32"/>
+        </w:rPr>
+        <w:t>_</w:t>
+      </w:r>
+      <w:r>
+        <w:rPr>
+          <w:rFonts w:ascii="TH Sarabun New" w:hAnsi="TH Sarabun New" w:cs="TH Sarabun New"/>
+          <w:sz w:val="32"/>
+          <w:szCs w:val="32"/>
+        </w:rPr>
+        <w:t>used_research_level_1</w:t>
+      </w:r>
+      <w:r>
+        <w:rPr>
+          <w:rFonts w:ascii="TH Sarabun New" w:hAnsi="TH Sarabun New" w:cs="TH Sarabun New"/>
+          <w:sz w:val="32"/>
+          <w:szCs w:val="32"/>
+        </w:rPr>
+        <w:t>}}</w:t>
       </w:r>
       <w:r>
         <w:rPr>
@@ -3343,14 +3636,6 @@
           <w:cs/>
         </w:rPr>
         <w:t>)</w:t>
-      </w:r>
-      <w:r>
-        <w:rPr>
-          <w:rFonts w:ascii="TH Sarabun New" w:hAnsi="TH Sarabun New" w:cs="TH Sarabun New"/>
-          <w:sz w:val="32"/>
-          <w:szCs w:val="32"/>
-        </w:rPr>
-        <w:t xml:space="preserve"> {{/assistant_research_working_list}}</w:t>
       </w:r>
     </w:p>
     <w:p>
@@ -3443,23 +3728,6 @@
           <w:sz w:val="32"/>
           <w:szCs w:val="32"/>
         </w:rPr>
-        <w:t>{{?assistant_other_working_list}}{{assistant_other_working_no}}</w:t>
-      </w:r>
-      <w:r>
-        <w:rPr>
-          <w:rFonts w:ascii="TH Sarabun New" w:hAnsi="TH Sarabun New" w:cs="TH Sarabun New"/>
-          <w:sz w:val="32"/>
-          <w:szCs w:val="32"/>
-          <w:cs/>
-        </w:rPr>
-        <w:t xml:space="preserve"> </w:t>
-      </w:r>
-      <w:r>
-        <w:rPr>
-          <w:rFonts w:ascii="TH Sarabun New" w:hAnsi="TH Sarabun New" w:cs="TH Sarabun New"/>
-          <w:sz w:val="32"/>
-          <w:szCs w:val="32"/>
-        </w:rPr>
         <w:t>{{</w:t>
       </w:r>
       <w:r>
@@ -3468,7 +3736,64 @@
           <w:sz w:val="32"/>
           <w:szCs w:val="32"/>
         </w:rPr>
-        <w:t>assistant_</w:t>
+        <w:t>asst</w:t>
+      </w:r>
+      <w:r>
+        <w:rPr>
+          <w:rFonts w:ascii="TH Sarabun New" w:hAnsi="TH Sarabun New" w:cs="TH Sarabun New"/>
+          <w:sz w:val="32"/>
+          <w:szCs w:val="32"/>
+        </w:rPr>
+        <w:t>_other_</w:t>
+      </w:r>
+      <w:r>
+        <w:rPr>
+          <w:rFonts w:ascii="TH Sarabun New" w:hAnsi="TH Sarabun New" w:cs="TH Sarabun New"/>
+          <w:sz w:val="32"/>
+          <w:szCs w:val="32"/>
+        </w:rPr>
+        <w:t>working_no_1</w:t>
+      </w:r>
+      <w:r>
+        <w:rPr>
+          <w:rFonts w:ascii="TH Sarabun New" w:hAnsi="TH Sarabun New" w:cs="TH Sarabun New"/>
+          <w:sz w:val="32"/>
+          <w:szCs w:val="32"/>
+        </w:rPr>
+        <w:t>}}</w:t>
+      </w:r>
+      <w:r>
+        <w:rPr>
+          <w:rFonts w:ascii="TH Sarabun New" w:hAnsi="TH Sarabun New" w:cs="TH Sarabun New"/>
+          <w:sz w:val="32"/>
+          <w:szCs w:val="32"/>
+          <w:cs/>
+        </w:rPr>
+        <w:t xml:space="preserve"> </w:t>
+      </w:r>
+      <w:r>
+        <w:rPr>
+          <w:rFonts w:ascii="TH Sarabun New" w:hAnsi="TH Sarabun New" w:cs="TH Sarabun New"/>
+          <w:sz w:val="32"/>
+          <w:szCs w:val="32"/>
+        </w:rPr>
+        <w:t>{{</w:t>
+      </w:r>
+      <w:r>
+        <w:rPr>
+          <w:rFonts w:ascii="TH Sarabun New" w:hAnsi="TH Sarabun New" w:cs="TH Sarabun New"/>
+          <w:sz w:val="32"/>
+          <w:szCs w:val="32"/>
+        </w:rPr>
+        <w:t>asst</w:t>
+      </w:r>
+      <w:r>
+        <w:rPr>
+          <w:rFonts w:ascii="TH Sarabun New" w:hAnsi="TH Sarabun New" w:cs="TH Sarabun New"/>
+          <w:sz w:val="32"/>
+          <w:szCs w:val="32"/>
+        </w:rPr>
+        <w:t>_</w:t>
       </w:r>
       <w:r>
         <w:rPr>
@@ -3492,6 +3817,14 @@
           <w:sz w:val="32"/>
           <w:szCs w:val="32"/>
         </w:rPr>
+        <w:t>_1</w:t>
+      </w:r>
+      <w:r>
+        <w:rPr>
+          <w:rFonts w:ascii="TH Sarabun New" w:hAnsi="TH Sarabun New" w:cs="TH Sarabun New"/>
+          <w:sz w:val="32"/>
+          <w:szCs w:val="32"/>
+        </w:rPr>
         <w:t>}}</w:t>
       </w:r>
     </w:p>
@@ -3539,7 +3872,15 @@
           <w:sz w:val="32"/>
           <w:szCs w:val="32"/>
         </w:rPr>
-        <w:t>assistant_</w:t>
+        <w:t>asst</w:t>
+      </w:r>
+      <w:r>
+        <w:rPr>
+          <w:rFonts w:ascii="TH Sarabun New" w:hAnsi="TH Sarabun New" w:cs="TH Sarabun New"/>
+          <w:sz w:val="32"/>
+          <w:szCs w:val="32"/>
+        </w:rPr>
+        <w:t>_</w:t>
       </w:r>
       <w:r>
         <w:rPr>
@@ -3555,7 +3896,24 @@
           <w:sz w:val="32"/>
           <w:szCs w:val="32"/>
         </w:rPr>
-        <w:t>used_other}}</w:t>
+        <w:t>used_other</w:t>
+      </w:r>
+      <w:r>
+        <w:rPr>
+          <w:rFonts w:ascii="TH Sarabun New" w:hAnsi="TH Sarabun New" w:cs="TH Sarabun New"/>
+          <w:sz w:val="32"/>
+          <w:szCs w:val="32"/>
+        </w:rPr>
+        <w:t>_1</w:t>
+      </w:r>
+      <w:proofErr w:type="gramStart"/>
+      <w:r>
+        <w:rPr>
+          <w:rFonts w:ascii="TH Sarabun New" w:hAnsi="TH Sarabun New" w:cs="TH Sarabun New"/>
+          <w:sz w:val="32"/>
+          <w:szCs w:val="32"/>
+        </w:rPr>
+        <w:t>}}</w:t>
       </w:r>
       <w:r>
         <w:rPr>
@@ -3566,15 +3924,17 @@
         </w:rPr>
         <w:t xml:space="preserve">  ไม่เคยใช้</w:t>
       </w:r>
+      <w:proofErr w:type="gramEnd"/>
     </w:p>
     <w:p>
       <w:pPr>
         <w:spacing w:after="0" w:line="240" w:lineRule="auto"/>
         <w:ind w:left="1755" w:firstLine="720"/>
         <w:rPr>
-          <w:rFonts w:ascii="TH Sarabun New" w:hAnsi="TH Sarabun New" w:cs="TH Sarabun New"/>
-          <w:sz w:val="32"/>
-          <w:szCs w:val="32"/>
+          <w:rFonts w:ascii="TH Sarabun New" w:hAnsi="TH Sarabun New" w:cs="TH Sarabun New" w:hint="cs"/>
+          <w:sz w:val="32"/>
+          <w:szCs w:val="32"/>
+          <w:cs/>
         </w:rPr>
       </w:pPr>
       <w:r>
@@ -3591,7 +3951,15 @@
           <w:sz w:val="32"/>
           <w:szCs w:val="32"/>
         </w:rPr>
-        <w:t>assistant_</w:t>
+        <w:t>asst</w:t>
+      </w:r>
+      <w:r>
+        <w:rPr>
+          <w:rFonts w:ascii="TH Sarabun New" w:hAnsi="TH Sarabun New" w:cs="TH Sarabun New"/>
+          <w:sz w:val="32"/>
+          <w:szCs w:val="32"/>
+        </w:rPr>
+        <w:t>_</w:t>
       </w:r>
       <w:r>
         <w:rPr>
@@ -3607,7 +3975,24 @@
           <w:sz w:val="32"/>
           <w:szCs w:val="32"/>
         </w:rPr>
-        <w:t>used_other}}</w:t>
+        <w:t>used_other</w:t>
+      </w:r>
+      <w:r>
+        <w:rPr>
+          <w:rFonts w:ascii="TH Sarabun New" w:hAnsi="TH Sarabun New" w:cs="TH Sarabun New"/>
+          <w:sz w:val="32"/>
+          <w:szCs w:val="32"/>
+        </w:rPr>
+        <w:t>_1</w:t>
+      </w:r>
+      <w:proofErr w:type="gramStart"/>
+      <w:r>
+        <w:rPr>
+          <w:rFonts w:ascii="TH Sarabun New" w:hAnsi="TH Sarabun New" w:cs="TH Sarabun New"/>
+          <w:sz w:val="32"/>
+          <w:szCs w:val="32"/>
+        </w:rPr>
+        <w:t>}}</w:t>
       </w:r>
       <w:r>
         <w:rPr>
@@ -3627,6 +4012,7 @@
         </w:rPr>
         <w:t>เคยใช้</w:t>
       </w:r>
+      <w:proofErr w:type="gramEnd"/>
       <w:r>
         <w:rPr>
           <w:rFonts w:ascii="TH Sarabun New" w:hAnsi="TH Sarabun New" w:cs="TH Sarabun New"/>
@@ -3661,6 +4047,536 @@
           <w:szCs w:val="32"/>
           <w:cs/>
         </w:rPr>
+        <w:t>พ.</w:t>
+      </w:r>
+      <w:proofErr w:type="gramStart"/>
+      <w:r>
+        <w:rPr>
+          <w:rFonts w:ascii="TH Sarabun New" w:hAnsi="TH Sarabun New" w:cs="TH Sarabun New"/>
+          <w:sz w:val="32"/>
+          <w:szCs w:val="32"/>
+          <w:cs/>
+        </w:rPr>
+        <w:t>ศ</w:t>
+      </w:r>
+      <w:r>
+        <w:rPr>
+          <w:rFonts w:ascii="TH Sarabun New" w:hAnsi="TH Sarabun New" w:cs="TH Sarabun New"/>
+          <w:sz w:val="32"/>
+          <w:szCs w:val="32"/>
+          <w:cs/>
+        </w:rPr>
+        <w:t>.</w:t>
+      </w:r>
+      <w:r>
+        <w:rPr>
+          <w:rFonts w:ascii="TH Sarabun New" w:hAnsi="TH Sarabun New" w:cs="TH Sarabun New"/>
+          <w:sz w:val="32"/>
+          <w:szCs w:val="32"/>
+        </w:rPr>
+        <w:t>{{</w:t>
+      </w:r>
+      <w:proofErr w:type="gramEnd"/>
+      <w:r>
+        <w:rPr>
+          <w:rFonts w:ascii="TH Sarabun New" w:hAnsi="TH Sarabun New" w:cs="TH Sarabun New"/>
+          <w:sz w:val="32"/>
+          <w:szCs w:val="32"/>
+        </w:rPr>
+        <w:t>asst</w:t>
+      </w:r>
+      <w:r>
+        <w:rPr>
+          <w:rFonts w:ascii="TH Sarabun New" w:hAnsi="TH Sarabun New" w:cs="TH Sarabun New"/>
+          <w:sz w:val="32"/>
+          <w:szCs w:val="32"/>
+        </w:rPr>
+        <w:t>_used_other_year</w:t>
+      </w:r>
+      <w:r>
+        <w:rPr>
+          <w:rFonts w:ascii="TH Sarabun New" w:hAnsi="TH Sarabun New" w:cs="TH Sarabun New"/>
+          <w:sz w:val="32"/>
+          <w:szCs w:val="32"/>
+        </w:rPr>
+        <w:t>_1</w:t>
+      </w:r>
+      <w:r>
+        <w:rPr>
+          <w:rFonts w:ascii="TH Sarabun New" w:hAnsi="TH Sarabun New" w:cs="TH Sarabun New"/>
+          <w:sz w:val="32"/>
+          <w:szCs w:val="32"/>
+        </w:rPr>
+        <w:t xml:space="preserve">}} </w:t>
+      </w:r>
+      <w:r>
+        <w:rPr>
+          <w:rFonts w:ascii="TH Sarabun New" w:hAnsi="TH Sarabun New" w:cs="TH Sarabun New"/>
+          <w:sz w:val="32"/>
+          <w:szCs w:val="32"/>
+          <w:cs/>
+        </w:rPr>
+        <w:t>และผลการพิจารณาคุณภาพอยู่ในระดับ</w:t>
+      </w:r>
+      <w:r>
+        <w:rPr>
+          <w:rFonts w:ascii="TH Sarabun New" w:hAnsi="TH Sarabun New" w:cs="TH Sarabun New"/>
+          <w:sz w:val="32"/>
+          <w:szCs w:val="32"/>
+        </w:rPr>
+        <w:t>{{</w:t>
+      </w:r>
+      <w:r>
+        <w:rPr>
+          <w:rFonts w:ascii="TH Sarabun New" w:hAnsi="TH Sarabun New" w:cs="TH Sarabun New"/>
+          <w:sz w:val="32"/>
+          <w:szCs w:val="32"/>
+        </w:rPr>
+        <w:t>asst</w:t>
+      </w:r>
+      <w:r>
+        <w:rPr>
+          <w:rFonts w:ascii="TH Sarabun New" w:hAnsi="TH Sarabun New" w:cs="TH Sarabun New"/>
+          <w:sz w:val="32"/>
+          <w:szCs w:val="32"/>
+        </w:rPr>
+        <w:t>_used_other_level</w:t>
+      </w:r>
+      <w:r>
+        <w:rPr>
+          <w:rFonts w:ascii="TH Sarabun New" w:hAnsi="TH Sarabun New" w:cs="TH Sarabun New"/>
+          <w:sz w:val="32"/>
+          <w:szCs w:val="32"/>
+        </w:rPr>
+        <w:t>_1</w:t>
+      </w:r>
+      <w:r>
+        <w:rPr>
+          <w:rFonts w:ascii="TH Sarabun New" w:hAnsi="TH Sarabun New" w:cs="TH Sarabun New"/>
+          <w:sz w:val="32"/>
+          <w:szCs w:val="32"/>
+        </w:rPr>
+        <w:t>}}</w:t>
+      </w:r>
+      <w:r>
+        <w:rPr>
+          <w:rFonts w:ascii="TH Sarabun New" w:hAnsi="TH Sarabun New" w:cs="TH Sarabun New"/>
+          <w:sz w:val="32"/>
+          <w:szCs w:val="32"/>
+          <w:cs/>
+        </w:rPr>
+        <w:t xml:space="preserve"> </w:t>
+      </w:r>
+      <w:r>
+        <w:rPr>
+          <w:rFonts w:ascii="TH Sarabun New" w:hAnsi="TH Sarabun New" w:cs="TH Sarabun New"/>
+          <w:sz w:val="32"/>
+          <w:szCs w:val="32"/>
+          <w:cs/>
+        </w:rPr>
+        <w:t>ตามเกณฑ์ที่</w:t>
+      </w:r>
+      <w:r>
+        <w:rPr>
+          <w:rFonts w:ascii="TH Sarabun New" w:hAnsi="TH Sarabun New" w:cs="TH Sarabun New"/>
+          <w:sz w:val="32"/>
+          <w:szCs w:val="32"/>
+          <w:cs/>
+        </w:rPr>
+        <w:t>มหาวิทยาลัยกำหนด</w:t>
+      </w:r>
+      <w:r>
+        <w:rPr>
+          <w:rFonts w:ascii="TH Sarabun New" w:hAnsi="TH Sarabun New" w:cs="TH Sarabun New"/>
+          <w:sz w:val="32"/>
+          <w:szCs w:val="32"/>
+          <w:cs/>
+        </w:rPr>
+        <w:t>)</w:t>
+      </w:r>
+    </w:p>
+    <w:p>
+      <w:pPr>
+        <w:spacing w:after="0" w:line="240" w:lineRule="auto"/>
+        <w:rPr>
+          <w:rFonts w:ascii="TH Sarabun New" w:hAnsi="TH Sarabun New" w:cs="TH Sarabun New"/>
+          <w:sz w:val="32"/>
+          <w:szCs w:val="32"/>
+        </w:rPr>
+      </w:pPr>
+    </w:p>
+    <w:p>
+      <w:pPr>
+        <w:spacing w:after="0" w:line="240" w:lineRule="auto"/>
+        <w:ind w:firstLine="720"/>
+        <w:rPr>
+          <w:rFonts w:ascii="TH Sarabun New" w:hAnsi="TH Sarabun New" w:cs="TH Sarabun New"/>
+          <w:sz w:val="32"/>
+          <w:szCs w:val="32"/>
+        </w:rPr>
+      </w:pPr>
+      <w:r>
+        <w:rPr>
+          <w:rFonts w:ascii="TH Sarabun New" w:hAnsi="TH Sarabun New" w:cs="TH Sarabun New"/>
+          <w:sz w:val="32"/>
+          <w:szCs w:val="32"/>
+          <w:cs/>
+        </w:rPr>
+        <w:t>๔.๑.๓ ตำรา</w:t>
+      </w:r>
+      <w:r>
+        <w:rPr>
+          <w:rFonts w:ascii="TH Sarabun New" w:hAnsi="TH Sarabun New" w:cs="TH Sarabun New"/>
+          <w:sz w:val="32"/>
+          <w:szCs w:val="32"/>
+          <w:cs/>
+        </w:rPr>
+        <w:t xml:space="preserve"> </w:t>
+      </w:r>
+      <w:r>
+        <w:rPr>
+          <w:rFonts w:ascii="TH Sarabun New" w:hAnsi="TH Sarabun New" w:cs="TH Sarabun New"/>
+          <w:sz w:val="32"/>
+          <w:szCs w:val="32"/>
+          <w:cs/>
+        </w:rPr>
+        <w:t>หนังสือ</w:t>
+      </w:r>
+      <w:r>
+        <w:rPr>
+          <w:rFonts w:ascii="TH Sarabun New" w:hAnsi="TH Sarabun New" w:cs="TH Sarabun New"/>
+          <w:sz w:val="32"/>
+          <w:szCs w:val="32"/>
+          <w:cs/>
+        </w:rPr>
+        <w:t xml:space="preserve"> </w:t>
+      </w:r>
+      <w:r>
+        <w:rPr>
+          <w:rFonts w:ascii="TH Sarabun New" w:hAnsi="TH Sarabun New" w:cs="TH Sarabun New"/>
+          <w:sz w:val="32"/>
+          <w:szCs w:val="32"/>
+          <w:cs/>
+        </w:rPr>
+        <w:t>หรือบทความทางวิชาการ</w:t>
+      </w:r>
+      <w:r>
+        <w:rPr>
+          <w:rFonts w:ascii="TH Sarabun New" w:hAnsi="TH Sarabun New" w:cs="TH Sarabun New"/>
+          <w:sz w:val="32"/>
+          <w:szCs w:val="32"/>
+          <w:cs/>
+        </w:rPr>
+        <w:t xml:space="preserve">  </w:t>
+      </w:r>
+    </w:p>
+    <w:p>
+      <w:pPr>
+        <w:spacing w:after="0" w:line="240" w:lineRule="auto"/>
+        <w:ind w:left="720" w:firstLine="720"/>
+        <w:rPr>
+          <w:rFonts w:ascii="TH Sarabun New" w:hAnsi="TH Sarabun New" w:cs="TH Sarabun New"/>
+          <w:sz w:val="32"/>
+          <w:szCs w:val="32"/>
+        </w:rPr>
+      </w:pPr>
+      <w:r>
+        <w:rPr>
+          <w:rFonts w:ascii="TH Sarabun New" w:hAnsi="TH Sarabun New" w:cs="TH Sarabun New"/>
+          <w:sz w:val="32"/>
+          <w:szCs w:val="32"/>
+        </w:rPr>
+        <w:t>{{</w:t>
+      </w:r>
+      <w:r>
+        <w:rPr>
+          <w:rFonts w:ascii="TH Sarabun New" w:hAnsi="TH Sarabun New" w:cs="TH Sarabun New"/>
+          <w:sz w:val="32"/>
+          <w:szCs w:val="32"/>
+        </w:rPr>
+        <w:t>asst</w:t>
+      </w:r>
+      <w:r>
+        <w:rPr>
+          <w:rFonts w:ascii="TH Sarabun New" w:hAnsi="TH Sarabun New" w:cs="TH Sarabun New"/>
+          <w:sz w:val="32"/>
+          <w:szCs w:val="32"/>
+        </w:rPr>
+        <w:t>_book_</w:t>
+      </w:r>
+      <w:r>
+        <w:rPr>
+          <w:rFonts w:ascii="TH Sarabun New" w:hAnsi="TH Sarabun New" w:cs="TH Sarabun New"/>
+          <w:sz w:val="32"/>
+          <w:szCs w:val="32"/>
+        </w:rPr>
+        <w:t>working_no_1</w:t>
+      </w:r>
+      <w:r>
+        <w:rPr>
+          <w:rFonts w:ascii="TH Sarabun New" w:hAnsi="TH Sarabun New" w:cs="TH Sarabun New"/>
+          <w:sz w:val="32"/>
+          <w:szCs w:val="32"/>
+        </w:rPr>
+        <w:t>}}</w:t>
+      </w:r>
+      <w:r>
+        <w:rPr>
+          <w:rFonts w:ascii="TH Sarabun New" w:hAnsi="TH Sarabun New" w:cs="TH Sarabun New"/>
+          <w:sz w:val="32"/>
+          <w:szCs w:val="32"/>
+          <w:cs/>
+        </w:rPr>
+        <w:t xml:space="preserve"> </w:t>
+      </w:r>
+      <w:r>
+        <w:rPr>
+          <w:rFonts w:ascii="TH Sarabun New" w:hAnsi="TH Sarabun New" w:cs="TH Sarabun New"/>
+          <w:sz w:val="32"/>
+          <w:szCs w:val="32"/>
+        </w:rPr>
+        <w:t>{{</w:t>
+      </w:r>
+      <w:r>
+        <w:rPr>
+          <w:rFonts w:ascii="TH Sarabun New" w:hAnsi="TH Sarabun New" w:cs="TH Sarabun New"/>
+          <w:sz w:val="32"/>
+          <w:szCs w:val="32"/>
+        </w:rPr>
+        <w:t>asst</w:t>
+      </w:r>
+      <w:r>
+        <w:rPr>
+          <w:rFonts w:ascii="TH Sarabun New" w:hAnsi="TH Sarabun New" w:cs="TH Sarabun New"/>
+          <w:sz w:val="32"/>
+          <w:szCs w:val="32"/>
+        </w:rPr>
+        <w:t>_book_working</w:t>
+      </w:r>
+      <w:r>
+        <w:rPr>
+          <w:rFonts w:ascii="TH Sarabun New" w:hAnsi="TH Sarabun New" w:cs="TH Sarabun New"/>
+          <w:sz w:val="32"/>
+          <w:szCs w:val="32"/>
+        </w:rPr>
+        <w:t>_1</w:t>
+      </w:r>
+      <w:r>
+        <w:rPr>
+          <w:rFonts w:ascii="TH Sarabun New" w:hAnsi="TH Sarabun New" w:cs="TH Sarabun New"/>
+          <w:sz w:val="32"/>
+          <w:szCs w:val="32"/>
+        </w:rPr>
+        <w:t>}}</w:t>
+      </w:r>
+    </w:p>
+    <w:p>
+      <w:pPr>
+        <w:spacing w:after="0" w:line="240" w:lineRule="auto"/>
+        <w:ind w:left="1440" w:firstLine="720"/>
+        <w:rPr>
+          <w:rFonts w:ascii="TH Sarabun New" w:hAnsi="TH Sarabun New" w:cs="TH Sarabun New"/>
+          <w:sz w:val="32"/>
+          <w:szCs w:val="32"/>
+        </w:rPr>
+      </w:pPr>
+      <w:r>
+        <w:rPr>
+          <w:rFonts w:ascii="TH Sarabun New" w:hAnsi="TH Sarabun New" w:cs="TH Sarabun New"/>
+          <w:sz w:val="32"/>
+          <w:szCs w:val="32"/>
+          <w:cs/>
+        </w:rPr>
+        <w:t>ผลงานนี้เคยใช้สำหรับการพิจารณาขอกำหนดตำแหน่งผู้ช่วยศาสตราจารย์</w:t>
+      </w:r>
+    </w:p>
+    <w:p>
+      <w:pPr>
+        <w:spacing w:after="0" w:line="240" w:lineRule="auto"/>
+        <w:rPr>
+          <w:rFonts w:ascii="TH Sarabun New" w:hAnsi="TH Sarabun New" w:cs="TH Sarabun New"/>
+          <w:sz w:val="32"/>
+          <w:szCs w:val="32"/>
+        </w:rPr>
+      </w:pPr>
+      <w:r>
+        <w:rPr>
+          <w:rFonts w:ascii="TH Sarabun New" w:hAnsi="TH Sarabun New" w:cs="TH Sarabun New"/>
+          <w:sz w:val="32"/>
+          <w:szCs w:val="32"/>
+          <w:cs/>
+        </w:rPr>
+        <w:t>มาแล้วหรือไม่</w:t>
+      </w:r>
+    </w:p>
+    <w:p>
+      <w:pPr>
+        <w:spacing w:after="0" w:line="240" w:lineRule="auto"/>
+        <w:ind w:left="1755" w:firstLine="720"/>
+        <w:rPr>
+          <w:rFonts w:ascii="TH Sarabun New" w:hAnsi="TH Sarabun New" w:cs="TH Sarabun New"/>
+          <w:sz w:val="32"/>
+          <w:szCs w:val="32"/>
+        </w:rPr>
+      </w:pPr>
+      <w:r>
+        <w:rPr>
+          <w:rFonts w:ascii="TH Sarabun New" w:hAnsi="TH Sarabun New" w:cs="TH Sarabun New"/>
+          <w:sz w:val="32"/>
+          <w:szCs w:val="32"/>
+        </w:rPr>
+        <w:t>{{</w:t>
+      </w:r>
+      <w:r>
+        <w:rPr>
+          <w:rFonts w:ascii="TH Sarabun New" w:hAnsi="TH Sarabun New" w:cs="TH Sarabun New"/>
+          <w:sz w:val="32"/>
+          <w:szCs w:val="32"/>
+        </w:rPr>
+        <w:t>asst</w:t>
+      </w:r>
+      <w:r>
+        <w:rPr>
+          <w:rFonts w:ascii="TH Sarabun New" w:hAnsi="TH Sarabun New" w:cs="TH Sarabun New"/>
+          <w:sz w:val="32"/>
+          <w:szCs w:val="32"/>
+        </w:rPr>
+        <w:t>_</w:t>
+      </w:r>
+      <w:r>
+        <w:rPr>
+          <w:rFonts w:ascii="TH Sarabun New" w:hAnsi="TH Sarabun New" w:cs="TH Sarabun New"/>
+          <w:sz w:val="32"/>
+          <w:szCs w:val="32"/>
+        </w:rPr>
+        <w:t>not_used_book_1</w:t>
+      </w:r>
+      <w:proofErr w:type="gramStart"/>
+      <w:r>
+        <w:rPr>
+          <w:rFonts w:ascii="TH Sarabun New" w:hAnsi="TH Sarabun New" w:cs="TH Sarabun New"/>
+          <w:sz w:val="32"/>
+          <w:szCs w:val="32"/>
+        </w:rPr>
+        <w:t>}}</w:t>
+      </w:r>
+      <w:r>
+        <w:rPr>
+          <w:rFonts w:ascii="TH Sarabun New" w:hAnsi="TH Sarabun New" w:cs="TH Sarabun New"/>
+          <w:sz w:val="32"/>
+          <w:szCs w:val="32"/>
+          <w:cs/>
+        </w:rPr>
+        <w:t xml:space="preserve">  ไม่เคยใช้</w:t>
+      </w:r>
+      <w:proofErr w:type="gramEnd"/>
+    </w:p>
+    <w:p>
+      <w:pPr>
+        <w:spacing w:after="0" w:line="240" w:lineRule="auto"/>
+        <w:ind w:left="1755" w:firstLine="720"/>
+        <w:rPr>
+          <w:rFonts w:ascii="TH Sarabun New" w:hAnsi="TH Sarabun New" w:cs="TH Sarabun New" w:hint="cs"/>
+          <w:sz w:val="32"/>
+          <w:szCs w:val="32"/>
+          <w:cs/>
+        </w:rPr>
+      </w:pPr>
+      <w:r>
+        <w:rPr>
+          <w:rFonts w:ascii="TH Sarabun New" w:hAnsi="TH Sarabun New" w:cs="TH Sarabun New"/>
+          <w:sz w:val="32"/>
+          <w:szCs w:val="32"/>
+        </w:rPr>
+        <w:lastRenderedPageBreak/>
+        <w:t>{{</w:t>
+      </w:r>
+      <w:r>
+        <w:rPr>
+          <w:rFonts w:ascii="TH Sarabun New" w:hAnsi="TH Sarabun New" w:cs="TH Sarabun New"/>
+          <w:sz w:val="32"/>
+          <w:szCs w:val="32"/>
+        </w:rPr>
+        <w:t>asst</w:t>
+      </w:r>
+      <w:r>
+        <w:rPr>
+          <w:rFonts w:ascii="TH Sarabun New" w:hAnsi="TH Sarabun New" w:cs="TH Sarabun New"/>
+          <w:sz w:val="32"/>
+          <w:szCs w:val="32"/>
+        </w:rPr>
+        <w:t>_</w:t>
+      </w:r>
+      <w:r>
+        <w:rPr>
+          <w:rFonts w:ascii="TH Sarabun New" w:hAnsi="TH Sarabun New" w:cs="TH Sarabun New"/>
+          <w:sz w:val="32"/>
+          <w:szCs w:val="32"/>
+        </w:rPr>
+        <w:t>is_used_book_1</w:t>
+      </w:r>
+      <w:proofErr w:type="gramStart"/>
+      <w:r>
+        <w:rPr>
+          <w:rFonts w:ascii="TH Sarabun New" w:hAnsi="TH Sarabun New" w:cs="TH Sarabun New"/>
+          <w:sz w:val="32"/>
+          <w:szCs w:val="32"/>
+        </w:rPr>
+        <w:t>}}</w:t>
+      </w:r>
+      <w:r>
+        <w:rPr>
+          <w:rFonts w:ascii="TH Sarabun New" w:hAnsi="TH Sarabun New" w:cs="TH Sarabun New"/>
+          <w:sz w:val="32"/>
+          <w:szCs w:val="32"/>
+          <w:cs/>
+        </w:rPr>
+        <w:t xml:space="preserve">  </w:t>
+      </w:r>
+      <w:r>
+        <w:rPr>
+          <w:rFonts w:ascii="TH Sarabun New" w:hAnsi="TH Sarabun New" w:cs="TH Sarabun New"/>
+          <w:sz w:val="32"/>
+          <w:szCs w:val="32"/>
+          <w:cs/>
+        </w:rPr>
+        <w:t>เคยใช้</w:t>
+      </w:r>
+      <w:proofErr w:type="gramEnd"/>
+      <w:r>
+        <w:rPr>
+          <w:rFonts w:ascii="TH Sarabun New" w:hAnsi="TH Sarabun New" w:cs="TH Sarabun New"/>
+          <w:sz w:val="32"/>
+          <w:szCs w:val="32"/>
+          <w:cs/>
+        </w:rPr>
+        <w:t xml:space="preserve"> </w:t>
+      </w:r>
+      <w:r>
+        <w:rPr>
+          <w:rFonts w:ascii="TH Sarabun New" w:hAnsi="TH Sarabun New" w:cs="TH Sarabun New"/>
+          <w:sz w:val="32"/>
+          <w:szCs w:val="32"/>
+          <w:cs/>
+        </w:rPr>
+        <w:t>(เมื่อปี</w:t>
+      </w:r>
+      <w:r>
+        <w:rPr>
+          <w:rFonts w:ascii="TH Sarabun New" w:hAnsi="TH Sarabun New" w:cs="TH Sarabun New"/>
+          <w:sz w:val="32"/>
+          <w:szCs w:val="32"/>
+          <w:cs/>
+        </w:rPr>
+        <w:t xml:space="preserve"> </w:t>
+      </w:r>
+      <w:r>
+        <w:rPr>
+          <w:rFonts w:ascii="TH Sarabun New" w:hAnsi="TH Sarabun New" w:cs="TH Sarabun New"/>
+          <w:sz w:val="32"/>
+          <w:szCs w:val="32"/>
+          <w:cs/>
+        </w:rPr>
         <w:t>พ.ศ</w:t>
       </w:r>
       <w:r>
@@ -3668,17 +4584,40 @@
           <w:rFonts w:ascii="TH Sarabun New" w:hAnsi="TH Sarabun New" w:cs="TH Sarabun New"/>
           <w:sz w:val="32"/>
           <w:szCs w:val="32"/>
-          <w:cs/>
-        </w:rPr>
-        <w:t>.</w:t>
-      </w:r>
-      <w:r>
-        <w:rPr>
-          <w:rFonts w:ascii="TH Sarabun New" w:hAnsi="TH Sarabun New" w:cs="TH Sarabun New"/>
-          <w:sz w:val="32"/>
-          <w:szCs w:val="32"/>
-        </w:rPr>
-        <w:t xml:space="preserve">{{assistant_used_other_year}} </w:t>
+        </w:rPr>
+        <w:t>{{</w:t>
+      </w:r>
+      <w:r>
+        <w:rPr>
+          <w:rFonts w:ascii="TH Sarabun New" w:hAnsi="TH Sarabun New" w:cs="TH Sarabun New"/>
+          <w:sz w:val="32"/>
+          <w:szCs w:val="32"/>
+        </w:rPr>
+        <w:t>asst</w:t>
+      </w:r>
+      <w:r>
+        <w:rPr>
+          <w:rFonts w:ascii="TH Sarabun New" w:hAnsi="TH Sarabun New" w:cs="TH Sarabun New"/>
+          <w:sz w:val="32"/>
+          <w:szCs w:val="32"/>
+        </w:rPr>
+        <w:t>_</w:t>
+      </w:r>
+      <w:r>
+        <w:rPr>
+          <w:rFonts w:ascii="TH Sarabun New" w:hAnsi="TH Sarabun New" w:cs="TH Sarabun New"/>
+          <w:sz w:val="32"/>
+          <w:szCs w:val="32"/>
+        </w:rPr>
+        <w:t>used_book_year_1</w:t>
+      </w:r>
+      <w:r>
+        <w:rPr>
+          <w:rFonts w:ascii="TH Sarabun New" w:hAnsi="TH Sarabun New" w:cs="TH Sarabun New"/>
+          <w:sz w:val="32"/>
+          <w:szCs w:val="32"/>
+        </w:rPr>
+        <w:t xml:space="preserve">}} </w:t>
       </w:r>
       <w:r>
         <w:rPr>
@@ -3695,7 +4634,39 @@
           <w:sz w:val="32"/>
           <w:szCs w:val="32"/>
         </w:rPr>
-        <w:t>{{assistant_used_other_level}}</w:t>
+        <w:t>{{</w:t>
+      </w:r>
+      <w:r>
+        <w:rPr>
+          <w:rFonts w:ascii="TH Sarabun New" w:hAnsi="TH Sarabun New" w:cs="TH Sarabun New"/>
+          <w:sz w:val="32"/>
+          <w:szCs w:val="32"/>
+        </w:rPr>
+        <w:t>asst</w:t>
+      </w:r>
+      <w:r>
+        <w:rPr>
+          <w:rFonts w:ascii="TH Sarabun New" w:hAnsi="TH Sarabun New" w:cs="TH Sarabun New"/>
+          <w:sz w:val="32"/>
+          <w:szCs w:val="32"/>
+        </w:rPr>
+        <w:t>_</w:t>
+      </w:r>
+      <w:r>
+        <w:rPr>
+          <w:rFonts w:ascii="TH Sarabun New" w:hAnsi="TH Sarabun New" w:cs="TH Sarabun New"/>
+          <w:sz w:val="32"/>
+          <w:szCs w:val="32"/>
+        </w:rPr>
+        <w:t>used_book_level_1</w:t>
+      </w:r>
+      <w:r>
+        <w:rPr>
+          <w:rFonts w:ascii="TH Sarabun New" w:hAnsi="TH Sarabun New" w:cs="TH Sarabun New"/>
+          <w:sz w:val="32"/>
+          <w:szCs w:val="32"/>
+        </w:rPr>
+        <w:t>}}</w:t>
       </w:r>
       <w:r>
         <w:rPr>
@@ -3732,367 +4703,6 @@
           <w:cs/>
         </w:rPr>
         <w:t>)</w:t>
-      </w:r>
-      <w:r>
-        <w:rPr>
-          <w:rFonts w:ascii="TH Sarabun New" w:hAnsi="TH Sarabun New" w:cs="TH Sarabun New"/>
-          <w:sz w:val="32"/>
-          <w:szCs w:val="32"/>
-        </w:rPr>
-        <w:t xml:space="preserve"> {{/assistant_other_working_list}}</w:t>
-      </w:r>
-    </w:p>
-    <w:p>
-      <w:pPr>
-        <w:spacing w:after="0" w:line="240" w:lineRule="auto"/>
-        <w:rPr>
-          <w:rFonts w:ascii="TH Sarabun New" w:hAnsi="TH Sarabun New" w:cs="TH Sarabun New"/>
-          <w:sz w:val="32"/>
-          <w:szCs w:val="32"/>
-        </w:rPr>
-      </w:pPr>
-    </w:p>
-    <w:p>
-      <w:pPr>
-        <w:spacing w:after="0" w:line="240" w:lineRule="auto"/>
-        <w:ind w:firstLine="720"/>
-        <w:rPr>
-          <w:rFonts w:ascii="TH Sarabun New" w:hAnsi="TH Sarabun New" w:cs="TH Sarabun New"/>
-          <w:sz w:val="32"/>
-          <w:szCs w:val="32"/>
-        </w:rPr>
-      </w:pPr>
-      <w:r>
-        <w:rPr>
-          <w:rFonts w:ascii="TH Sarabun New" w:hAnsi="TH Sarabun New" w:cs="TH Sarabun New"/>
-          <w:sz w:val="32"/>
-          <w:szCs w:val="32"/>
-          <w:cs/>
-        </w:rPr>
-        <w:t>๔.๑.๓ ตำรา</w:t>
-      </w:r>
-      <w:r>
-        <w:rPr>
-          <w:rFonts w:ascii="TH Sarabun New" w:hAnsi="TH Sarabun New" w:cs="TH Sarabun New"/>
-          <w:sz w:val="32"/>
-          <w:szCs w:val="32"/>
-          <w:cs/>
-        </w:rPr>
-        <w:t xml:space="preserve"> </w:t>
-      </w:r>
-      <w:r>
-        <w:rPr>
-          <w:rFonts w:ascii="TH Sarabun New" w:hAnsi="TH Sarabun New" w:cs="TH Sarabun New"/>
-          <w:sz w:val="32"/>
-          <w:szCs w:val="32"/>
-          <w:cs/>
-        </w:rPr>
-        <w:t>หนังสือ</w:t>
-      </w:r>
-      <w:r>
-        <w:rPr>
-          <w:rFonts w:ascii="TH Sarabun New" w:hAnsi="TH Sarabun New" w:cs="TH Sarabun New"/>
-          <w:sz w:val="32"/>
-          <w:szCs w:val="32"/>
-          <w:cs/>
-        </w:rPr>
-        <w:t xml:space="preserve"> </w:t>
-      </w:r>
-      <w:r>
-        <w:rPr>
-          <w:rFonts w:ascii="TH Sarabun New" w:hAnsi="TH Sarabun New" w:cs="TH Sarabun New"/>
-          <w:sz w:val="32"/>
-          <w:szCs w:val="32"/>
-          <w:cs/>
-        </w:rPr>
-        <w:t>หรือบทความทางวิชาการ</w:t>
-      </w:r>
-      <w:r>
-        <w:rPr>
-          <w:rFonts w:ascii="TH Sarabun New" w:hAnsi="TH Sarabun New" w:cs="TH Sarabun New"/>
-          <w:sz w:val="32"/>
-          <w:szCs w:val="32"/>
-          <w:cs/>
-        </w:rPr>
-        <w:t xml:space="preserve">  </w:t>
-      </w:r>
-    </w:p>
-    <w:p>
-      <w:pPr>
-        <w:spacing w:after="0" w:line="240" w:lineRule="auto"/>
-        <w:ind w:left="720" w:firstLine="720"/>
-        <w:rPr>
-          <w:rFonts w:ascii="TH Sarabun New" w:hAnsi="TH Sarabun New" w:cs="TH Sarabun New"/>
-          <w:sz w:val="32"/>
-          <w:szCs w:val="32"/>
-        </w:rPr>
-      </w:pPr>
-      <w:r>
-        <w:rPr>
-          <w:rFonts w:ascii="TH Sarabun New" w:hAnsi="TH Sarabun New" w:cs="TH Sarabun New"/>
-          <w:sz w:val="32"/>
-          <w:szCs w:val="32"/>
-        </w:rPr>
-        <w:lastRenderedPageBreak/>
-        <w:t>{{?assistant_book_working_list}}{{assistant_book_working_no}}</w:t>
-      </w:r>
-      <w:r>
-        <w:rPr>
-          <w:rFonts w:ascii="TH Sarabun New" w:hAnsi="TH Sarabun New" w:cs="TH Sarabun New"/>
-          <w:sz w:val="32"/>
-          <w:szCs w:val="32"/>
-          <w:cs/>
-        </w:rPr>
-        <w:t xml:space="preserve"> </w:t>
-      </w:r>
-      <w:r>
-        <w:rPr>
-          <w:rFonts w:ascii="TH Sarabun New" w:hAnsi="TH Sarabun New" w:cs="TH Sarabun New"/>
-          <w:sz w:val="32"/>
-          <w:szCs w:val="32"/>
-        </w:rPr>
-        <w:t>{{assistant_book_working}}</w:t>
-      </w:r>
-    </w:p>
-    <w:p>
-      <w:pPr>
-        <w:spacing w:after="0" w:line="240" w:lineRule="auto"/>
-        <w:ind w:left="1440" w:firstLine="720"/>
-        <w:rPr>
-          <w:rFonts w:ascii="TH Sarabun New" w:hAnsi="TH Sarabun New" w:cs="TH Sarabun New"/>
-          <w:sz w:val="32"/>
-          <w:szCs w:val="32"/>
-        </w:rPr>
-      </w:pPr>
-      <w:r>
-        <w:rPr>
-          <w:rFonts w:ascii="TH Sarabun New" w:hAnsi="TH Sarabun New" w:cs="TH Sarabun New"/>
-          <w:sz w:val="32"/>
-          <w:szCs w:val="32"/>
-          <w:cs/>
-        </w:rPr>
-        <w:t>ผลงานนี้เคยใช้สำหรับการพิจารณาขอกำหนดตำแหน่งผู้ช่วยศาสตราจารย์</w:t>
-      </w:r>
-    </w:p>
-    <w:p>
-      <w:pPr>
-        <w:spacing w:after="0" w:line="240" w:lineRule="auto"/>
-        <w:rPr>
-          <w:rFonts w:ascii="TH Sarabun New" w:hAnsi="TH Sarabun New" w:cs="TH Sarabun New"/>
-          <w:sz w:val="32"/>
-          <w:szCs w:val="32"/>
-        </w:rPr>
-      </w:pPr>
-      <w:r>
-        <w:rPr>
-          <w:rFonts w:ascii="TH Sarabun New" w:hAnsi="TH Sarabun New" w:cs="TH Sarabun New"/>
-          <w:sz w:val="32"/>
-          <w:szCs w:val="32"/>
-          <w:cs/>
-        </w:rPr>
-        <w:t>มาแล้วหรือไม่</w:t>
-      </w:r>
-    </w:p>
-    <w:p>
-      <w:pPr>
-        <w:spacing w:after="0" w:line="240" w:lineRule="auto"/>
-        <w:ind w:left="1755" w:firstLine="720"/>
-        <w:rPr>
-          <w:rFonts w:ascii="TH Sarabun New" w:hAnsi="TH Sarabun New" w:cs="TH Sarabun New"/>
-          <w:sz w:val="32"/>
-          <w:szCs w:val="32"/>
-        </w:rPr>
-      </w:pPr>
-      <w:r>
-        <w:rPr>
-          <w:rFonts w:ascii="TH Sarabun New" w:hAnsi="TH Sarabun New" w:cs="TH Sarabun New"/>
-          <w:sz w:val="32"/>
-          <w:szCs w:val="32"/>
-        </w:rPr>
-        <w:t>{{assistant_</w:t>
-      </w:r>
-      <w:r>
-        <w:rPr>
-          <w:rFonts w:ascii="TH Sarabun New" w:hAnsi="TH Sarabun New" w:cs="TH Sarabun New"/>
-          <w:sz w:val="32"/>
-          <w:szCs w:val="32"/>
-        </w:rPr>
-        <w:t>not_</w:t>
-      </w:r>
-      <w:r>
-        <w:rPr>
-          <w:rFonts w:ascii="TH Sarabun New" w:hAnsi="TH Sarabun New" w:cs="TH Sarabun New"/>
-          <w:sz w:val="32"/>
-          <w:szCs w:val="32"/>
-        </w:rPr>
-        <w:t>used_book}}</w:t>
-      </w:r>
-      <w:r>
-        <w:rPr>
-          <w:rFonts w:ascii="TH Sarabun New" w:hAnsi="TH Sarabun New" w:cs="TH Sarabun New"/>
-          <w:sz w:val="32"/>
-          <w:szCs w:val="32"/>
-          <w:cs/>
-        </w:rPr>
-        <w:t xml:space="preserve">  ไม่เคยใช้</w:t>
-      </w:r>
-    </w:p>
-    <w:p>
-      <w:pPr>
-        <w:spacing w:after="0" w:line="240" w:lineRule="auto"/>
-        <w:ind w:left="1755" w:firstLine="720"/>
-        <w:rPr>
-          <w:rFonts w:ascii="TH Sarabun New" w:hAnsi="TH Sarabun New" w:cs="TH Sarabun New"/>
-          <w:sz w:val="32"/>
-          <w:szCs w:val="32"/>
-        </w:rPr>
-      </w:pPr>
-      <w:r>
-        <w:rPr>
-          <w:rFonts w:ascii="TH Sarabun New" w:hAnsi="TH Sarabun New" w:cs="TH Sarabun New"/>
-          <w:sz w:val="32"/>
-          <w:szCs w:val="32"/>
-        </w:rPr>
-        <w:t>{{assistant_</w:t>
-      </w:r>
-      <w:r>
-        <w:rPr>
-          <w:rFonts w:ascii="TH Sarabun New" w:hAnsi="TH Sarabun New" w:cs="TH Sarabun New"/>
-          <w:sz w:val="32"/>
-          <w:szCs w:val="32"/>
-        </w:rPr>
-        <w:t>is_</w:t>
-      </w:r>
-      <w:r>
-        <w:rPr>
-          <w:rFonts w:ascii="TH Sarabun New" w:hAnsi="TH Sarabun New" w:cs="TH Sarabun New"/>
-          <w:sz w:val="32"/>
-          <w:szCs w:val="32"/>
-        </w:rPr>
-        <w:t>used_book}}</w:t>
-      </w:r>
-      <w:r>
-        <w:rPr>
-          <w:rFonts w:ascii="TH Sarabun New" w:hAnsi="TH Sarabun New" w:cs="TH Sarabun New"/>
-          <w:sz w:val="32"/>
-          <w:szCs w:val="32"/>
-          <w:cs/>
-        </w:rPr>
-        <w:t xml:space="preserve">  </w:t>
-      </w:r>
-      <w:r>
-        <w:rPr>
-          <w:rFonts w:ascii="TH Sarabun New" w:hAnsi="TH Sarabun New" w:cs="TH Sarabun New"/>
-          <w:sz w:val="32"/>
-          <w:szCs w:val="32"/>
-          <w:cs/>
-        </w:rPr>
-        <w:t>เคยใช้</w:t>
-      </w:r>
-      <w:r>
-        <w:rPr>
-          <w:rFonts w:ascii="TH Sarabun New" w:hAnsi="TH Sarabun New" w:cs="TH Sarabun New"/>
-          <w:sz w:val="32"/>
-          <w:szCs w:val="32"/>
-          <w:cs/>
-        </w:rPr>
-        <w:t xml:space="preserve"> </w:t>
-      </w:r>
-      <w:r>
-        <w:rPr>
-          <w:rFonts w:ascii="TH Sarabun New" w:hAnsi="TH Sarabun New" w:cs="TH Sarabun New"/>
-          <w:sz w:val="32"/>
-          <w:szCs w:val="32"/>
-          <w:cs/>
-        </w:rPr>
-        <w:t>(เมื่อปี</w:t>
-      </w:r>
-      <w:r>
-        <w:rPr>
-          <w:rFonts w:ascii="TH Sarabun New" w:hAnsi="TH Sarabun New" w:cs="TH Sarabun New"/>
-          <w:sz w:val="32"/>
-          <w:szCs w:val="32"/>
-          <w:cs/>
-        </w:rPr>
-        <w:t xml:space="preserve"> </w:t>
-      </w:r>
-      <w:r>
-        <w:rPr>
-          <w:rFonts w:ascii="TH Sarabun New" w:hAnsi="TH Sarabun New" w:cs="TH Sarabun New"/>
-          <w:sz w:val="32"/>
-          <w:szCs w:val="32"/>
-          <w:cs/>
-        </w:rPr>
-        <w:t>พ.ศ</w:t>
-      </w:r>
-      <w:r>
-        <w:rPr>
-          <w:rFonts w:ascii="TH Sarabun New" w:hAnsi="TH Sarabun New" w:cs="TH Sarabun New"/>
-          <w:sz w:val="32"/>
-          <w:szCs w:val="32"/>
-        </w:rPr>
-        <w:t xml:space="preserve">{{assistant_used_book_year}} </w:t>
-      </w:r>
-      <w:r>
-        <w:rPr>
-          <w:rFonts w:ascii="TH Sarabun New" w:hAnsi="TH Sarabun New" w:cs="TH Sarabun New"/>
-          <w:sz w:val="32"/>
-          <w:szCs w:val="32"/>
-          <w:cs/>
-        </w:rPr>
-        <w:t>และผลการพิจารณาคุณภาพอยู่ในระดับ</w:t>
-      </w:r>
-      <w:r>
-        <w:rPr>
-          <w:rFonts w:ascii="TH Sarabun New" w:hAnsi="TH Sarabun New" w:cs="TH Sarabun New"/>
-          <w:sz w:val="32"/>
-          <w:szCs w:val="32"/>
-        </w:rPr>
-        <w:t>{{assistant_used_book_level}}</w:t>
-      </w:r>
-      <w:r>
-        <w:rPr>
-          <w:rFonts w:ascii="TH Sarabun New" w:hAnsi="TH Sarabun New" w:cs="TH Sarabun New"/>
-          <w:sz w:val="32"/>
-          <w:szCs w:val="32"/>
-          <w:cs/>
-        </w:rPr>
-        <w:t xml:space="preserve"> </w:t>
-      </w:r>
-      <w:r>
-        <w:rPr>
-          <w:rFonts w:ascii="TH Sarabun New" w:hAnsi="TH Sarabun New" w:cs="TH Sarabun New"/>
-          <w:sz w:val="32"/>
-          <w:szCs w:val="32"/>
-          <w:cs/>
-        </w:rPr>
-        <w:t>ตามเกณฑ์ที่</w:t>
-      </w:r>
-      <w:r>
-        <w:rPr>
-          <w:rFonts w:ascii="TH Sarabun New" w:hAnsi="TH Sarabun New" w:cs="TH Sarabun New"/>
-          <w:sz w:val="32"/>
-          <w:szCs w:val="32"/>
-          <w:cs/>
-        </w:rPr>
-        <w:t>มหาวิทยาลัยกำหนด</w:t>
-      </w:r>
-      <w:r>
-        <w:rPr>
-          <w:rFonts w:ascii="TH Sarabun New" w:hAnsi="TH Sarabun New" w:cs="TH Sarabun New"/>
-          <w:sz w:val="32"/>
-          <w:szCs w:val="32"/>
-          <w:cs/>
-        </w:rPr>
-        <w:t>)</w:t>
-      </w:r>
-      <w:r>
-        <w:rPr>
-          <w:rFonts w:ascii="TH Sarabun New" w:hAnsi="TH Sarabun New" w:cs="TH Sarabun New"/>
-          <w:sz w:val="32"/>
-          <w:szCs w:val="32"/>
-        </w:rPr>
-        <w:t xml:space="preserve"> {{/assistant_book_working_list}}</w:t>
       </w:r>
     </w:p>
     <w:p>
@@ -4434,15 +5044,47 @@
           <w:sz w:val="32"/>
           <w:szCs w:val="32"/>
         </w:rPr>
-        <w:t xml:space="preserve">{{?associate_research_working_list}}{{associate_research_working_no}} </w:t>
-      </w:r>
-      <w:r>
-        <w:rPr>
-          <w:rFonts w:ascii="TH Sarabun New" w:hAnsi="TH Sarabun New" w:cs="TH Sarabun New"/>
-          <w:sz w:val="32"/>
-          <w:szCs w:val="32"/>
-        </w:rPr>
-        <w:t>{{associate_research_working}}</w:t>
+        <w:t>{{assoc_research_</w:t>
+      </w:r>
+      <w:r>
+        <w:rPr>
+          <w:rFonts w:ascii="TH Sarabun New" w:hAnsi="TH Sarabun New" w:cs="TH Sarabun New"/>
+          <w:sz w:val="32"/>
+          <w:szCs w:val="32"/>
+        </w:rPr>
+        <w:t>working_no_1</w:t>
+      </w:r>
+      <w:r>
+        <w:rPr>
+          <w:rFonts w:ascii="TH Sarabun New" w:hAnsi="TH Sarabun New" w:cs="TH Sarabun New"/>
+          <w:sz w:val="32"/>
+          <w:szCs w:val="32"/>
+        </w:rPr>
+        <w:t xml:space="preserve">}} </w:t>
+      </w:r>
+      <w:r>
+        <w:rPr>
+          <w:rFonts w:ascii="TH Sarabun New" w:hAnsi="TH Sarabun New" w:cs="TH Sarabun New"/>
+          <w:sz w:val="32"/>
+          <w:szCs w:val="32"/>
+        </w:rPr>
+        <w:t>{{assoc_research_working</w:t>
+      </w:r>
+      <w:r>
+        <w:rPr>
+          <w:rFonts w:ascii="TH Sarabun New" w:hAnsi="TH Sarabun New" w:cs="TH Sarabun New"/>
+          <w:sz w:val="32"/>
+          <w:szCs w:val="32"/>
+        </w:rPr>
+        <w:t>_1</w:t>
+      </w:r>
+      <w:r>
+        <w:rPr>
+          <w:rFonts w:ascii="TH Sarabun New" w:hAnsi="TH Sarabun New" w:cs="TH Sarabun New"/>
+          <w:sz w:val="32"/>
+          <w:szCs w:val="32"/>
+        </w:rPr>
+        <w:t>}}</w:t>
       </w:r>
     </w:p>
     <w:p>
@@ -4484,23 +5126,40 @@
           <w:sz w:val="32"/>
           <w:szCs w:val="32"/>
         </w:rPr>
-        <w:t>{{associate_</w:t>
-      </w:r>
-      <w:r>
-        <w:rPr>
-          <w:rFonts w:ascii="TH Sarabun New" w:hAnsi="TH Sarabun New" w:cs="TH Sarabun New"/>
-          <w:sz w:val="32"/>
-          <w:szCs w:val="32"/>
-        </w:rPr>
-        <w:t>not_</w:t>
-      </w:r>
-      <w:r>
-        <w:rPr>
-          <w:rFonts w:ascii="TH Sarabun New" w:hAnsi="TH Sarabun New" w:cs="TH Sarabun New"/>
-          <w:sz w:val="32"/>
-          <w:szCs w:val="32"/>
-        </w:rPr>
-        <w:t>used_research}}</w:t>
+        <w:t>{{</w:t>
+      </w:r>
+      <w:r>
+        <w:rPr>
+          <w:rFonts w:ascii="TH Sarabun New" w:hAnsi="TH Sarabun New" w:cs="TH Sarabun New"/>
+          <w:sz w:val="32"/>
+          <w:szCs w:val="32"/>
+        </w:rPr>
+        <w:t>assoc</w:t>
+      </w:r>
+      <w:r>
+        <w:rPr>
+          <w:rFonts w:ascii="TH Sarabun New" w:hAnsi="TH Sarabun New" w:cs="TH Sarabun New"/>
+          <w:sz w:val="32"/>
+          <w:szCs w:val="32"/>
+        </w:rPr>
+        <w:t>_</w:t>
+      </w:r>
+      <w:r>
+        <w:rPr>
+          <w:rFonts w:ascii="TH Sarabun New" w:hAnsi="TH Sarabun New" w:cs="TH Sarabun New"/>
+          <w:sz w:val="32"/>
+          <w:szCs w:val="32"/>
+        </w:rPr>
+        <w:t>not_used_research_1</w:t>
+      </w:r>
+      <w:proofErr w:type="gramStart"/>
+      <w:r>
+        <w:rPr>
+          <w:rFonts w:ascii="TH Sarabun New" w:hAnsi="TH Sarabun New" w:cs="TH Sarabun New"/>
+          <w:sz w:val="32"/>
+          <w:szCs w:val="32"/>
+        </w:rPr>
+        <w:t>}}</w:t>
       </w:r>
       <w:r>
         <w:rPr>
@@ -4511,40 +5170,59 @@
         </w:rPr>
         <w:t xml:space="preserve">  ไม่เคยใช้</w:t>
       </w:r>
+      <w:proofErr w:type="gramEnd"/>
     </w:p>
     <w:p>
       <w:pPr>
         <w:spacing w:after="0" w:line="240" w:lineRule="auto"/>
         <w:ind w:left="1755" w:firstLine="720"/>
         <w:rPr>
-          <w:rFonts w:ascii="TH Sarabun New" w:hAnsi="TH Sarabun New" w:cs="TH Sarabun New"/>
-          <w:sz w:val="32"/>
-          <w:szCs w:val="32"/>
-        </w:rPr>
-      </w:pPr>
-      <w:r>
-        <w:rPr>
-          <w:rFonts w:ascii="TH Sarabun New" w:hAnsi="TH Sarabun New" w:cs="TH Sarabun New"/>
-          <w:sz w:val="32"/>
-          <w:szCs w:val="32"/>
-        </w:rPr>
-        <w:t>{{associate_</w:t>
-      </w:r>
-      <w:r>
-        <w:rPr>
-          <w:rFonts w:ascii="TH Sarabun New" w:hAnsi="TH Sarabun New" w:cs="TH Sarabun New"/>
-          <w:sz w:val="32"/>
-          <w:szCs w:val="32"/>
-        </w:rPr>
-        <w:t>is_</w:t>
-      </w:r>
-      <w:r>
-        <w:rPr>
-          <w:rFonts w:ascii="TH Sarabun New" w:hAnsi="TH Sarabun New" w:cs="TH Sarabun New"/>
-          <w:sz w:val="32"/>
-          <w:szCs w:val="32"/>
-        </w:rPr>
-        <w:t>used_research}}</w:t>
+          <w:rFonts w:ascii="TH Sarabun New" w:hAnsi="TH Sarabun New" w:cs="TH Sarabun New" w:hint="cs"/>
+          <w:sz w:val="32"/>
+          <w:szCs w:val="32"/>
+          <w:cs/>
+        </w:rPr>
+      </w:pPr>
+      <w:r>
+        <w:rPr>
+          <w:rFonts w:ascii="TH Sarabun New" w:hAnsi="TH Sarabun New" w:cs="TH Sarabun New"/>
+          <w:sz w:val="32"/>
+          <w:szCs w:val="32"/>
+        </w:rPr>
+        <w:t>{{</w:t>
+      </w:r>
+      <w:r>
+        <w:rPr>
+          <w:rFonts w:ascii="TH Sarabun New" w:hAnsi="TH Sarabun New" w:cs="TH Sarabun New"/>
+          <w:sz w:val="32"/>
+          <w:szCs w:val="32"/>
+        </w:rPr>
+        <w:t>assoc</w:t>
+      </w:r>
+      <w:r>
+        <w:rPr>
+          <w:rFonts w:ascii="TH Sarabun New" w:hAnsi="TH Sarabun New" w:cs="TH Sarabun New"/>
+          <w:sz w:val="32"/>
+          <w:szCs w:val="32"/>
+        </w:rPr>
+        <w:t>_</w:t>
+      </w:r>
+      <w:r>
+        <w:rPr>
+          <w:rFonts w:ascii="TH Sarabun New" w:hAnsi="TH Sarabun New" w:cs="TH Sarabun New"/>
+          <w:sz w:val="32"/>
+          <w:szCs w:val="32"/>
+        </w:rPr>
+        <w:t>is_used_research_1</w:t>
+      </w:r>
+      <w:proofErr w:type="gramStart"/>
+      <w:r>
+        <w:rPr>
+          <w:rFonts w:ascii="TH Sarabun New" w:hAnsi="TH Sarabun New" w:cs="TH Sarabun New"/>
+          <w:sz w:val="32"/>
+          <w:szCs w:val="32"/>
+        </w:rPr>
+        <w:t>}}</w:t>
       </w:r>
       <w:r>
         <w:rPr>
@@ -4564,6 +5242,7 @@
         </w:rPr>
         <w:t>เคยใช้</w:t>
       </w:r>
+      <w:proofErr w:type="gramEnd"/>
       <w:r>
         <w:rPr>
           <w:rFonts w:ascii="TH Sarabun New" w:hAnsi="TH Sarabun New" w:cs="TH Sarabun New"/>
@@ -4598,7 +5277,17 @@
           <w:szCs w:val="32"/>
           <w:cs/>
         </w:rPr>
-        <w:t>พ.ศ</w:t>
+        <w:t>พ.</w:t>
+      </w:r>
+      <w:proofErr w:type="gramStart"/>
+      <w:r>
+        <w:rPr>
+          <w:rFonts w:ascii="TH Sarabun New" w:hAnsi="TH Sarabun New" w:cs="TH Sarabun New"/>
+          <w:sz w:val="32"/>
+          <w:szCs w:val="32"/>
+          <w:cs/>
+        </w:rPr>
+        <w:t>ศ</w:t>
       </w:r>
       <w:r>
         <w:rPr>
@@ -4615,7 +5304,40 @@
           <w:sz w:val="32"/>
           <w:szCs w:val="32"/>
         </w:rPr>
-        <w:t xml:space="preserve"> {{associate_used_research_year}}</w:t>
+        <w:t xml:space="preserve"> {{</w:t>
+      </w:r>
+      <w:proofErr w:type="gramEnd"/>
+      <w:r>
+        <w:rPr>
+          <w:rFonts w:ascii="TH Sarabun New" w:hAnsi="TH Sarabun New" w:cs="TH Sarabun New"/>
+          <w:sz w:val="32"/>
+          <w:szCs w:val="32"/>
+        </w:rPr>
+        <w:t>assoc</w:t>
+      </w:r>
+      <w:r>
+        <w:rPr>
+          <w:rFonts w:ascii="TH Sarabun New" w:hAnsi="TH Sarabun New" w:cs="TH Sarabun New"/>
+          <w:sz w:val="32"/>
+          <w:szCs w:val="32"/>
+        </w:rPr>
+        <w:t>_</w:t>
+      </w:r>
+      <w:r>
+        <w:rPr>
+          <w:rFonts w:ascii="TH Sarabun New" w:hAnsi="TH Sarabun New" w:cs="TH Sarabun New"/>
+          <w:sz w:val="32"/>
+          <w:szCs w:val="32"/>
+        </w:rPr>
+        <w:t>used_research_year_1</w:t>
+      </w:r>
+      <w:r>
+        <w:rPr>
+          <w:rFonts w:ascii="TH Sarabun New" w:hAnsi="TH Sarabun New" w:cs="TH Sarabun New"/>
+          <w:sz w:val="32"/>
+          <w:szCs w:val="32"/>
+        </w:rPr>
+        <w:t>}}</w:t>
       </w:r>
       <w:r>
         <w:rPr>
@@ -4641,7 +5363,39 @@
           <w:sz w:val="32"/>
           <w:szCs w:val="32"/>
         </w:rPr>
-        <w:t>{{associate_used_research_level}}</w:t>
+        <w:t>{{</w:t>
+      </w:r>
+      <w:r>
+        <w:rPr>
+          <w:rFonts w:ascii="TH Sarabun New" w:hAnsi="TH Sarabun New" w:cs="TH Sarabun New"/>
+          <w:sz w:val="32"/>
+          <w:szCs w:val="32"/>
+        </w:rPr>
+        <w:t>assoc</w:t>
+      </w:r>
+      <w:r>
+        <w:rPr>
+          <w:rFonts w:ascii="TH Sarabun New" w:hAnsi="TH Sarabun New" w:cs="TH Sarabun New"/>
+          <w:sz w:val="32"/>
+          <w:szCs w:val="32"/>
+        </w:rPr>
+        <w:t>_</w:t>
+      </w:r>
+      <w:r>
+        <w:rPr>
+          <w:rFonts w:ascii="TH Sarabun New" w:hAnsi="TH Sarabun New" w:cs="TH Sarabun New"/>
+          <w:sz w:val="32"/>
+          <w:szCs w:val="32"/>
+        </w:rPr>
+        <w:t>used_research_level_1</w:t>
+      </w:r>
+      <w:r>
+        <w:rPr>
+          <w:rFonts w:ascii="TH Sarabun New" w:hAnsi="TH Sarabun New" w:cs="TH Sarabun New"/>
+          <w:sz w:val="32"/>
+          <w:szCs w:val="32"/>
+        </w:rPr>
+        <w:t>}}</w:t>
       </w:r>
       <w:r>
         <w:rPr>
@@ -4678,14 +5432,6 @@
           <w:cs/>
         </w:rPr>
         <w:t>)</w:t>
-      </w:r>
-      <w:r>
-        <w:rPr>
-          <w:rFonts w:ascii="TH Sarabun New" w:hAnsi="TH Sarabun New" w:cs="TH Sarabun New"/>
-          <w:sz w:val="32"/>
-          <w:szCs w:val="32"/>
-        </w:rPr>
-        <w:t xml:space="preserve"> {{/associate_research_working_list}}</w:t>
       </w:r>
     </w:p>
     <w:p>
@@ -4706,197 +5452,311 @@
           <w:szCs w:val="32"/>
           <w:cs/>
         </w:rPr>
+        <w:t>๔.๒.๒ ผลงานทางวิชาการในลักษณะอื่น</w:t>
+      </w:r>
+      <w:r>
+        <w:rPr>
+          <w:rFonts w:ascii="TH Sarabun New" w:hAnsi="TH Sarabun New" w:cs="TH Sarabun New"/>
+          <w:sz w:val="32"/>
+          <w:szCs w:val="32"/>
+        </w:rPr>
+        <w:t xml:space="preserve"> </w:t>
+      </w:r>
+      <w:r>
+        <w:rPr>
+          <w:rFonts w:ascii="TH Sarabun New" w:hAnsi="TH Sarabun New" w:cs="TH Sarabun New"/>
+          <w:sz w:val="32"/>
+          <w:szCs w:val="32"/>
+          <w:cs/>
+        </w:rPr>
+        <w:t>(ผลงานวิชาการเพื่ออุตสาหกรรม/ผลงานวิชาการเพื่อพัฒนาการเรียนการสอนและการเรียนรู้/ ผลงานวิชาการเพื่อพัฒนานโยบายสาธารณะ/ กรณีศึกษา (</w:t>
+      </w:r>
+      <w:r>
+        <w:rPr>
+          <w:rFonts w:ascii="TH Sarabun New" w:hAnsi="TH Sarabun New" w:cs="TH Sarabun New"/>
+          <w:sz w:val="32"/>
+          <w:szCs w:val="32"/>
+        </w:rPr>
+        <w:t xml:space="preserve">case study)/ </w:t>
+      </w:r>
+      <w:r>
+        <w:rPr>
+          <w:rFonts w:ascii="TH Sarabun New" w:hAnsi="TH Sarabun New" w:cs="TH Sarabun New"/>
+          <w:sz w:val="32"/>
+          <w:szCs w:val="32"/>
+          <w:cs/>
+        </w:rPr>
+        <w:t>งานแปล/ พจนานุกรม สารานุกรม นามานุกรม และงานวิชาการในลักษณะเดียวกัน/ ผลงานสร้างสรรค์ด้านวิทยาศาสตร์และเทคโนโลยี/ผลงานสร้างสรรค์ด้านสุนทรียะ ศิลปะ/ สิทธิบัตร/ ซอฟต์แวร์/ ผลงานรับใช้ท้องถิ่นและสังคม/ ผลงานนวัตกรรม)</w:t>
+      </w:r>
+    </w:p>
+    <w:p>
+      <w:pPr>
+        <w:spacing w:after="0" w:line="240" w:lineRule="auto"/>
+        <w:ind w:firstLine="1418"/>
+        <w:rPr>
+          <w:rFonts w:ascii="TH Sarabun New" w:hAnsi="TH Sarabun New" w:cs="TH Sarabun New"/>
+          <w:sz w:val="32"/>
+          <w:szCs w:val="32"/>
+        </w:rPr>
+      </w:pPr>
+      <w:r>
+        <w:rPr>
+          <w:rFonts w:ascii="TH Sarabun New" w:hAnsi="TH Sarabun New" w:cs="TH Sarabun New"/>
+          <w:sz w:val="32"/>
+          <w:szCs w:val="32"/>
+        </w:rPr>
+        <w:t>{{</w:t>
+      </w:r>
+      <w:r>
+        <w:rPr>
+          <w:rFonts w:ascii="TH Sarabun New" w:hAnsi="TH Sarabun New" w:cs="TH Sarabun New"/>
+          <w:sz w:val="32"/>
+          <w:szCs w:val="32"/>
+        </w:rPr>
+        <w:t>assoc</w:t>
+      </w:r>
+      <w:r>
+        <w:rPr>
+          <w:rFonts w:ascii="TH Sarabun New" w:hAnsi="TH Sarabun New" w:cs="TH Sarabun New"/>
+          <w:sz w:val="32"/>
+          <w:szCs w:val="32"/>
+        </w:rPr>
+        <w:t>_other_</w:t>
+      </w:r>
+      <w:r>
+        <w:rPr>
+          <w:rFonts w:ascii="TH Sarabun New" w:hAnsi="TH Sarabun New" w:cs="TH Sarabun New"/>
+          <w:sz w:val="32"/>
+          <w:szCs w:val="32"/>
+        </w:rPr>
+        <w:t>working_no_1</w:t>
+      </w:r>
+      <w:r>
+        <w:rPr>
+          <w:rFonts w:ascii="TH Sarabun New" w:hAnsi="TH Sarabun New" w:cs="TH Sarabun New"/>
+          <w:sz w:val="32"/>
+          <w:szCs w:val="32"/>
+        </w:rPr>
+        <w:t>}}</w:t>
+      </w:r>
+      <w:r>
+        <w:rPr>
+          <w:rFonts w:ascii="TH Sarabun New" w:hAnsi="TH Sarabun New" w:cs="TH Sarabun New"/>
+          <w:sz w:val="32"/>
+          <w:szCs w:val="32"/>
+          <w:cs/>
+        </w:rPr>
+        <w:t xml:space="preserve"> </w:t>
+      </w:r>
+      <w:r>
+        <w:rPr>
+          <w:rFonts w:ascii="TH Sarabun New" w:hAnsi="TH Sarabun New" w:cs="TH Sarabun New"/>
+          <w:sz w:val="32"/>
+          <w:szCs w:val="32"/>
+        </w:rPr>
+        <w:t>{{</w:t>
+      </w:r>
+      <w:r>
+        <w:rPr>
+          <w:rFonts w:ascii="TH Sarabun New" w:hAnsi="TH Sarabun New" w:cs="TH Sarabun New"/>
+          <w:sz w:val="32"/>
+          <w:szCs w:val="32"/>
+        </w:rPr>
+        <w:t>assoc</w:t>
+      </w:r>
+      <w:r>
+        <w:rPr>
+          <w:rFonts w:ascii="TH Sarabun New" w:hAnsi="TH Sarabun New" w:cs="TH Sarabun New"/>
+          <w:sz w:val="32"/>
+          <w:szCs w:val="32"/>
+        </w:rPr>
+        <w:t>_other_working</w:t>
+      </w:r>
+      <w:r>
+        <w:rPr>
+          <w:rFonts w:ascii="TH Sarabun New" w:hAnsi="TH Sarabun New" w:cs="TH Sarabun New"/>
+          <w:sz w:val="32"/>
+          <w:szCs w:val="32"/>
+        </w:rPr>
+        <w:t>_1</w:t>
+      </w:r>
+      <w:r>
+        <w:rPr>
+          <w:rFonts w:ascii="TH Sarabun New" w:hAnsi="TH Sarabun New" w:cs="TH Sarabun New"/>
+          <w:sz w:val="32"/>
+          <w:szCs w:val="32"/>
+        </w:rPr>
+        <w:t>}}</w:t>
+      </w:r>
+    </w:p>
+    <w:p>
+      <w:pPr>
+        <w:spacing w:after="0" w:line="240" w:lineRule="auto"/>
+        <w:ind w:firstLine="2127"/>
+        <w:rPr>
+          <w:rFonts w:ascii="TH Sarabun New" w:hAnsi="TH Sarabun New" w:cs="TH Sarabun New"/>
+          <w:sz w:val="32"/>
+          <w:szCs w:val="32"/>
+        </w:rPr>
+      </w:pPr>
+      <w:r>
+        <w:rPr>
+          <w:rFonts w:ascii="TH Sarabun New" w:hAnsi="TH Sarabun New" w:cs="TH Sarabun New"/>
+          <w:sz w:val="32"/>
+          <w:szCs w:val="32"/>
+          <w:cs/>
+        </w:rPr>
+        <w:t>ผลงานทางวิชาการในลักษณะอื่นนี้เคยใช้สำหรับการพิจารณาขอกำหน</w:t>
+      </w:r>
+      <w:r>
+        <w:rPr>
+          <w:rFonts w:ascii="TH Sarabun New" w:hAnsi="TH Sarabun New" w:cs="TH Sarabun New"/>
+          <w:sz w:val="32"/>
+          <w:szCs w:val="32"/>
+          <w:cs/>
+        </w:rPr>
+        <w:t>ด</w:t>
+      </w:r>
+      <w:r>
+        <w:rPr>
+          <w:rFonts w:ascii="TH Sarabun New" w:hAnsi="TH Sarabun New" w:cs="TH Sarabun New"/>
+          <w:sz w:val="32"/>
+          <w:szCs w:val="32"/>
+          <w:cs/>
+        </w:rPr>
+        <w:t>ตำแหน่ง</w:t>
+      </w:r>
+      <w:r>
+        <w:rPr>
+          <w:rFonts w:ascii="TH Sarabun New" w:hAnsi="TH Sarabun New" w:cs="TH Sarabun New"/>
+          <w:sz w:val="32"/>
+          <w:szCs w:val="32"/>
+          <w:cs/>
+        </w:rPr>
+        <w:t xml:space="preserve">              </w:t>
+      </w:r>
+      <w:r>
+        <w:rPr>
+          <w:rFonts w:ascii="TH Sarabun New" w:hAnsi="TH Sarabun New" w:cs="TH Sarabun New"/>
+          <w:sz w:val="32"/>
+          <w:szCs w:val="32"/>
+          <w:cs/>
+        </w:rPr>
+        <w:t>ผู้ช่วยศาสตราจารย์และ/หรือตำแหน่งรองศาสตราจารย์มาแล้วหรือไม่</w:t>
+      </w:r>
+    </w:p>
+    <w:p>
+      <w:pPr>
+        <w:spacing w:after="0" w:line="240" w:lineRule="auto"/>
+        <w:ind w:left="1755" w:firstLine="720"/>
+        <w:rPr>
+          <w:rFonts w:ascii="TH Sarabun New" w:hAnsi="TH Sarabun New" w:cs="TH Sarabun New"/>
+          <w:sz w:val="32"/>
+          <w:szCs w:val="32"/>
+        </w:rPr>
+      </w:pPr>
+      <w:r>
+        <w:rPr>
+          <w:rFonts w:ascii="TH Sarabun New" w:hAnsi="TH Sarabun New" w:cs="TH Sarabun New"/>
+          <w:sz w:val="32"/>
+          <w:szCs w:val="32"/>
+        </w:rPr>
         <w:lastRenderedPageBreak/>
-        <w:t>๔.๒.๒ ผลงานทางวิชาการในลักษณะอื่น</w:t>
-      </w:r>
-      <w:r>
-        <w:rPr>
-          <w:rFonts w:ascii="TH Sarabun New" w:hAnsi="TH Sarabun New" w:cs="TH Sarabun New"/>
-          <w:sz w:val="32"/>
-          <w:szCs w:val="32"/>
-        </w:rPr>
-        <w:t xml:space="preserve"> </w:t>
-      </w:r>
-      <w:r>
-        <w:rPr>
-          <w:rFonts w:ascii="TH Sarabun New" w:hAnsi="TH Sarabun New" w:cs="TH Sarabun New"/>
-          <w:sz w:val="32"/>
-          <w:szCs w:val="32"/>
-          <w:cs/>
-        </w:rPr>
-        <w:t>(ผลงานวิชาการเพื่ออุตสาหกรรม/ผลงานวิชาการเพื่อพัฒนาการเรียนการสอนและการเรียนรู้/ ผลงานวิชาการเพื่อพัฒนานโยบายสาธารณะ/ กรณีศึกษา (</w:t>
-      </w:r>
-      <w:r>
-        <w:rPr>
-          <w:rFonts w:ascii="TH Sarabun New" w:hAnsi="TH Sarabun New" w:cs="TH Sarabun New"/>
-          <w:sz w:val="32"/>
-          <w:szCs w:val="32"/>
-        </w:rPr>
-        <w:t xml:space="preserve">case study)/ </w:t>
-      </w:r>
-      <w:r>
-        <w:rPr>
-          <w:rFonts w:ascii="TH Sarabun New" w:hAnsi="TH Sarabun New" w:cs="TH Sarabun New"/>
-          <w:sz w:val="32"/>
-          <w:szCs w:val="32"/>
-          <w:cs/>
-        </w:rPr>
-        <w:t>งานแปล/ พจนานุกรม สารานุกรม นามานุกรม และงานวิชาการในลักษณะเดียวกัน/ ผลงานสร้างสรรค์ด้านวิทยาศาสตร์และเทคโนโลยี/ผลงานสร้างสรรค์ด้านสุนทรียะ ศิลปะ/ สิทธิบัตร/ ซอฟต์แวร์/ ผลงานรับใช้ท้องถิ่นและสังคม/ ผลงานนวัตกรรม)</w:t>
-      </w:r>
-    </w:p>
-    <w:p>
-      <w:pPr>
-        <w:spacing w:after="0" w:line="240" w:lineRule="auto"/>
-        <w:ind w:firstLine="1418"/>
-        <w:rPr>
-          <w:rFonts w:ascii="TH Sarabun New" w:hAnsi="TH Sarabun New" w:cs="TH Sarabun New"/>
-          <w:sz w:val="32"/>
-          <w:szCs w:val="32"/>
-        </w:rPr>
-      </w:pPr>
-      <w:r>
-        <w:rPr>
-          <w:rFonts w:ascii="TH Sarabun New" w:hAnsi="TH Sarabun New" w:cs="TH Sarabun New"/>
-          <w:sz w:val="32"/>
-          <w:szCs w:val="32"/>
-        </w:rPr>
-        <w:t>{{?associate_other_working_list}}{{associate_other_working_no}}</w:t>
-      </w:r>
-      <w:r>
-        <w:rPr>
-          <w:rFonts w:ascii="TH Sarabun New" w:hAnsi="TH Sarabun New" w:cs="TH Sarabun New"/>
-          <w:sz w:val="32"/>
-          <w:szCs w:val="32"/>
-          <w:cs/>
-        </w:rPr>
-        <w:t xml:space="preserve"> </w:t>
-      </w:r>
-      <w:r>
-        <w:rPr>
-          <w:rFonts w:ascii="TH Sarabun New" w:hAnsi="TH Sarabun New" w:cs="TH Sarabun New"/>
-          <w:sz w:val="32"/>
-          <w:szCs w:val="32"/>
-        </w:rPr>
-        <w:t>{{associate_other_working}}</w:t>
-      </w:r>
-    </w:p>
-    <w:p>
-      <w:pPr>
-        <w:spacing w:after="0" w:line="240" w:lineRule="auto"/>
-        <w:ind w:firstLine="2127"/>
-        <w:rPr>
-          <w:rFonts w:ascii="TH Sarabun New" w:hAnsi="TH Sarabun New" w:cs="TH Sarabun New"/>
-          <w:sz w:val="32"/>
-          <w:szCs w:val="32"/>
-        </w:rPr>
-      </w:pPr>
-      <w:r>
-        <w:rPr>
-          <w:rFonts w:ascii="TH Sarabun New" w:hAnsi="TH Sarabun New" w:cs="TH Sarabun New"/>
-          <w:sz w:val="32"/>
-          <w:szCs w:val="32"/>
-          <w:cs/>
-        </w:rPr>
-        <w:t>ผลงานทางวิชาการในลักษณะอื่นนี้เคยใช้สำหรับการพิจารณาขอกำหน</w:t>
-      </w:r>
-      <w:r>
-        <w:rPr>
-          <w:rFonts w:ascii="TH Sarabun New" w:hAnsi="TH Sarabun New" w:cs="TH Sarabun New"/>
-          <w:sz w:val="32"/>
-          <w:szCs w:val="32"/>
-          <w:cs/>
-        </w:rPr>
-        <w:t>ด</w:t>
-      </w:r>
-      <w:r>
-        <w:rPr>
-          <w:rFonts w:ascii="TH Sarabun New" w:hAnsi="TH Sarabun New" w:cs="TH Sarabun New"/>
-          <w:sz w:val="32"/>
-          <w:szCs w:val="32"/>
-          <w:cs/>
-        </w:rPr>
-        <w:t>ตำแหน่ง</w:t>
-      </w:r>
-      <w:r>
-        <w:rPr>
-          <w:rFonts w:ascii="TH Sarabun New" w:hAnsi="TH Sarabun New" w:cs="TH Sarabun New"/>
-          <w:sz w:val="32"/>
-          <w:szCs w:val="32"/>
-          <w:cs/>
-        </w:rPr>
-        <w:t xml:space="preserve">              </w:t>
-      </w:r>
-      <w:r>
-        <w:rPr>
-          <w:rFonts w:ascii="TH Sarabun New" w:hAnsi="TH Sarabun New" w:cs="TH Sarabun New"/>
-          <w:sz w:val="32"/>
-          <w:szCs w:val="32"/>
-          <w:cs/>
-        </w:rPr>
-        <w:t>ผู้ช่วยศาสตราจารย์และ/หรือตำแหน่งรองศาสตราจารย์มาแล้วหรือไม่</w:t>
-      </w:r>
+        <w:t>{{</w:t>
+      </w:r>
+      <w:r>
+        <w:rPr>
+          <w:rFonts w:ascii="TH Sarabun New" w:hAnsi="TH Sarabun New" w:cs="TH Sarabun New"/>
+          <w:sz w:val="32"/>
+          <w:szCs w:val="32"/>
+        </w:rPr>
+        <w:t>assoc</w:t>
+      </w:r>
+      <w:r>
+        <w:rPr>
+          <w:rFonts w:ascii="TH Sarabun New" w:hAnsi="TH Sarabun New" w:cs="TH Sarabun New"/>
+          <w:sz w:val="32"/>
+          <w:szCs w:val="32"/>
+        </w:rPr>
+        <w:t>_</w:t>
+      </w:r>
+      <w:r>
+        <w:rPr>
+          <w:rFonts w:ascii="TH Sarabun New" w:hAnsi="TH Sarabun New" w:cs="TH Sarabun New"/>
+          <w:sz w:val="32"/>
+          <w:szCs w:val="32"/>
+        </w:rPr>
+        <w:t>not_</w:t>
+      </w:r>
+      <w:r>
+        <w:rPr>
+          <w:rFonts w:ascii="TH Sarabun New" w:hAnsi="TH Sarabun New" w:cs="TH Sarabun New"/>
+          <w:sz w:val="32"/>
+          <w:szCs w:val="32"/>
+        </w:rPr>
+        <w:t>used_other</w:t>
+      </w:r>
+      <w:r>
+        <w:rPr>
+          <w:rFonts w:ascii="TH Sarabun New" w:hAnsi="TH Sarabun New" w:cs="TH Sarabun New"/>
+          <w:sz w:val="32"/>
+          <w:szCs w:val="32"/>
+        </w:rPr>
+        <w:t>_1</w:t>
+      </w:r>
+      <w:proofErr w:type="gramStart"/>
+      <w:r>
+        <w:rPr>
+          <w:rFonts w:ascii="TH Sarabun New" w:hAnsi="TH Sarabun New" w:cs="TH Sarabun New"/>
+          <w:sz w:val="32"/>
+          <w:szCs w:val="32"/>
+        </w:rPr>
+        <w:t>}}</w:t>
+      </w:r>
+      <w:r>
+        <w:rPr>
+          <w:rFonts w:ascii="TH Sarabun New" w:hAnsi="TH Sarabun New" w:cs="TH Sarabun New"/>
+          <w:sz w:val="32"/>
+          <w:szCs w:val="32"/>
+          <w:cs/>
+        </w:rPr>
+        <w:t xml:space="preserve">  ไม่เคยใช้</w:t>
+      </w:r>
+      <w:proofErr w:type="gramEnd"/>
     </w:p>
     <w:p>
       <w:pPr>
         <w:spacing w:after="0" w:line="240" w:lineRule="auto"/>
         <w:ind w:left="1755" w:firstLine="720"/>
         <w:rPr>
-          <w:rFonts w:ascii="TH Sarabun New" w:hAnsi="TH Sarabun New" w:cs="TH Sarabun New"/>
-          <w:sz w:val="32"/>
-          <w:szCs w:val="32"/>
-        </w:rPr>
-      </w:pPr>
-      <w:r>
-        <w:rPr>
-          <w:rFonts w:ascii="TH Sarabun New" w:hAnsi="TH Sarabun New" w:cs="TH Sarabun New"/>
-          <w:sz w:val="32"/>
-          <w:szCs w:val="32"/>
-        </w:rPr>
-        <w:t>{{associate_</w:t>
-      </w:r>
-      <w:r>
-        <w:rPr>
-          <w:rFonts w:ascii="TH Sarabun New" w:hAnsi="TH Sarabun New" w:cs="TH Sarabun New"/>
-          <w:sz w:val="32"/>
-          <w:szCs w:val="32"/>
-        </w:rPr>
-        <w:t>not_</w:t>
-      </w:r>
-      <w:r>
-        <w:rPr>
-          <w:rFonts w:ascii="TH Sarabun New" w:hAnsi="TH Sarabun New" w:cs="TH Sarabun New"/>
-          <w:sz w:val="32"/>
-          <w:szCs w:val="32"/>
-        </w:rPr>
-        <w:t>used_other}}</w:t>
-      </w:r>
-      <w:r>
-        <w:rPr>
-          <w:rFonts w:ascii="TH Sarabun New" w:hAnsi="TH Sarabun New" w:cs="TH Sarabun New"/>
-          <w:sz w:val="32"/>
-          <w:szCs w:val="32"/>
-          <w:cs/>
-        </w:rPr>
-        <w:t xml:space="preserve">  ไม่เคยใช้</w:t>
-      </w:r>
-    </w:p>
-    <w:p>
-      <w:pPr>
-        <w:spacing w:after="0" w:line="240" w:lineRule="auto"/>
-        <w:ind w:left="1755" w:firstLine="720"/>
-        <w:rPr>
-          <w:rFonts w:ascii="TH Sarabun New" w:hAnsi="TH Sarabun New" w:cs="TH Sarabun New"/>
-          <w:sz w:val="32"/>
-          <w:szCs w:val="32"/>
-        </w:rPr>
-      </w:pPr>
-      <w:r>
-        <w:rPr>
-          <w:rFonts w:ascii="TH Sarabun New" w:hAnsi="TH Sarabun New" w:cs="TH Sarabun New"/>
-          <w:sz w:val="32"/>
-          <w:szCs w:val="32"/>
-        </w:rPr>
-        <w:t>{{associate_</w:t>
+          <w:rFonts w:ascii="TH Sarabun New" w:hAnsi="TH Sarabun New" w:cs="TH Sarabun New" w:hint="cs"/>
+          <w:sz w:val="32"/>
+          <w:szCs w:val="32"/>
+        </w:rPr>
+      </w:pPr>
+      <w:r>
+        <w:rPr>
+          <w:rFonts w:ascii="TH Sarabun New" w:hAnsi="TH Sarabun New" w:cs="TH Sarabun New"/>
+          <w:sz w:val="32"/>
+          <w:szCs w:val="32"/>
+        </w:rPr>
+        <w:t>{{</w:t>
+      </w:r>
+      <w:r>
+        <w:rPr>
+          <w:rFonts w:ascii="TH Sarabun New" w:hAnsi="TH Sarabun New" w:cs="TH Sarabun New"/>
+          <w:sz w:val="32"/>
+          <w:szCs w:val="32"/>
+        </w:rPr>
+        <w:t>assoc</w:t>
+      </w:r>
+      <w:r>
+        <w:rPr>
+          <w:rFonts w:ascii="TH Sarabun New" w:hAnsi="TH Sarabun New" w:cs="TH Sarabun New"/>
+          <w:sz w:val="32"/>
+          <w:szCs w:val="32"/>
+        </w:rPr>
+        <w:t>_</w:t>
       </w:r>
       <w:r>
         <w:rPr>
@@ -4912,7 +5772,24 @@
           <w:sz w:val="32"/>
           <w:szCs w:val="32"/>
         </w:rPr>
-        <w:t>used_other}}</w:t>
+        <w:t>used_other</w:t>
+      </w:r>
+      <w:r>
+        <w:rPr>
+          <w:rFonts w:ascii="TH Sarabun New" w:hAnsi="TH Sarabun New" w:cs="TH Sarabun New"/>
+          <w:sz w:val="32"/>
+          <w:szCs w:val="32"/>
+        </w:rPr>
+        <w:t>_1</w:t>
+      </w:r>
+      <w:proofErr w:type="gramStart"/>
+      <w:r>
+        <w:rPr>
+          <w:rFonts w:ascii="TH Sarabun New" w:hAnsi="TH Sarabun New" w:cs="TH Sarabun New"/>
+          <w:sz w:val="32"/>
+          <w:szCs w:val="32"/>
+        </w:rPr>
+        <w:t>}}</w:t>
       </w:r>
       <w:r>
         <w:rPr>
@@ -4932,6 +5809,7 @@
         </w:rPr>
         <w:t>เคยใช้</w:t>
       </w:r>
+      <w:proofErr w:type="gramEnd"/>
       <w:r>
         <w:rPr>
           <w:rFonts w:ascii="TH Sarabun New" w:hAnsi="TH Sarabun New" w:cs="TH Sarabun New"/>
@@ -4966,15 +5844,58 @@
           <w:szCs w:val="32"/>
           <w:cs/>
         </w:rPr>
-        <w:t>พ.ศ</w:t>
-      </w:r>
-      <w:r>
-        <w:rPr>
-          <w:rFonts w:ascii="TH Sarabun New" w:hAnsi="TH Sarabun New" w:cs="TH Sarabun New"/>
-          <w:sz w:val="32"/>
-          <w:szCs w:val="32"/>
-        </w:rPr>
-        <w:t>.{{associate_used_other_year}}</w:t>
+        <w:t>พ.</w:t>
+      </w:r>
+      <w:proofErr w:type="gramStart"/>
+      <w:r>
+        <w:rPr>
+          <w:rFonts w:ascii="TH Sarabun New" w:hAnsi="TH Sarabun New" w:cs="TH Sarabun New"/>
+          <w:sz w:val="32"/>
+          <w:szCs w:val="32"/>
+          <w:cs/>
+        </w:rPr>
+        <w:t>ศ</w:t>
+      </w:r>
+      <w:r>
+        <w:rPr>
+          <w:rFonts w:ascii="TH Sarabun New" w:hAnsi="TH Sarabun New" w:cs="TH Sarabun New"/>
+          <w:sz w:val="32"/>
+          <w:szCs w:val="32"/>
+        </w:rPr>
+        <w:t>.{{</w:t>
+      </w:r>
+      <w:proofErr w:type="gramEnd"/>
+      <w:r>
+        <w:rPr>
+          <w:rFonts w:ascii="TH Sarabun New" w:hAnsi="TH Sarabun New" w:cs="TH Sarabun New"/>
+          <w:sz w:val="32"/>
+          <w:szCs w:val="32"/>
+        </w:rPr>
+        <w:t>assoc</w:t>
+      </w:r>
+      <w:r>
+        <w:rPr>
+          <w:rFonts w:ascii="TH Sarabun New" w:hAnsi="TH Sarabun New" w:cs="TH Sarabun New"/>
+          <w:sz w:val="32"/>
+          <w:szCs w:val="32"/>
+        </w:rPr>
+        <w:t>_used_other_year</w:t>
+      </w:r>
+      <w:r>
+        <w:rPr>
+          <w:rFonts w:ascii="TH Sarabun New" w:hAnsi="TH Sarabun New" w:cs="TH Sarabun New"/>
+          <w:sz w:val="32"/>
+          <w:szCs w:val="32"/>
+        </w:rPr>
+        <w:t>_1</w:t>
+      </w:r>
+      <w:r>
+        <w:rPr>
+          <w:rFonts w:ascii="TH Sarabun New" w:hAnsi="TH Sarabun New" w:cs="TH Sarabun New"/>
+          <w:sz w:val="32"/>
+          <w:szCs w:val="32"/>
+        </w:rPr>
+        <w:t>}}</w:t>
       </w:r>
       <w:r>
         <w:rPr>
@@ -5000,7 +5921,39 @@
           <w:sz w:val="32"/>
           <w:szCs w:val="32"/>
         </w:rPr>
-        <w:t>{{associate_used_other_level}}</w:t>
+        <w:t>{{</w:t>
+      </w:r>
+      <w:r>
+        <w:rPr>
+          <w:rFonts w:ascii="TH Sarabun New" w:hAnsi="TH Sarabun New" w:cs="TH Sarabun New"/>
+          <w:sz w:val="32"/>
+          <w:szCs w:val="32"/>
+        </w:rPr>
+        <w:t>assoc</w:t>
+      </w:r>
+      <w:r>
+        <w:rPr>
+          <w:rFonts w:ascii="TH Sarabun New" w:hAnsi="TH Sarabun New" w:cs="TH Sarabun New"/>
+          <w:sz w:val="32"/>
+          <w:szCs w:val="32"/>
+        </w:rPr>
+        <w:t>_used_other_level</w:t>
+      </w:r>
+      <w:r>
+        <w:rPr>
+          <w:rFonts w:ascii="TH Sarabun New" w:hAnsi="TH Sarabun New" w:cs="TH Sarabun New"/>
+          <w:sz w:val="32"/>
+          <w:szCs w:val="32"/>
+        </w:rPr>
+        <w:t>_1</w:t>
+      </w:r>
+      <w:r>
+        <w:rPr>
+          <w:rFonts w:ascii="TH Sarabun New" w:hAnsi="TH Sarabun New" w:cs="TH Sarabun New"/>
+          <w:sz w:val="32"/>
+          <w:szCs w:val="32"/>
+        </w:rPr>
+        <w:t>}}</w:t>
       </w:r>
       <w:r>
         <w:rPr>
@@ -5037,23 +5990,6 @@
           <w:cs/>
         </w:rPr>
         <w:t>)</w:t>
-      </w:r>
-      <w:r>
-        <w:rPr>
-          <w:rFonts w:ascii="TH Sarabun New" w:hAnsi="TH Sarabun New" w:cs="TH Sarabun New"/>
-          <w:sz w:val="32"/>
-          <w:szCs w:val="32"/>
-        </w:rPr>
-        <w:t xml:space="preserve"> {{/associate_other_working_list}}</w:t>
-      </w:r>
-      <w:r>
-        <w:rPr>
-          <w:rFonts w:ascii="TH Sarabun New" w:hAnsi="TH Sarabun New" w:cs="TH Sarabun New"/>
-          <w:sz w:val="32"/>
-          <w:szCs w:val="32"/>
-          <w:cs/>
-        </w:rPr>
-        <w:tab/>
       </w:r>
     </w:p>
     <w:p>
@@ -5155,24 +6091,88 @@
           <w:sz w:val="32"/>
           <w:szCs w:val="32"/>
         </w:rPr>
-        <w:t>{{?associate_book_working_list}}{{associate_book_working_no}}</w:t>
-      </w:r>
-      <w:r>
-        <w:rPr>
-          <w:rFonts w:ascii="TH Sarabun New" w:hAnsi="TH Sarabun New" w:cs="TH Sarabun New"/>
-          <w:sz w:val="32"/>
-          <w:szCs w:val="32"/>
-          <w:cs/>
-        </w:rPr>
-        <w:t xml:space="preserve"> </w:t>
-      </w:r>
-      <w:r>
-        <w:rPr>
-          <w:rFonts w:ascii="TH Sarabun New" w:hAnsi="TH Sarabun New" w:cs="TH Sarabun New"/>
-          <w:sz w:val="32"/>
-          <w:szCs w:val="32"/>
-        </w:rPr>
-        <w:t>{{associate_book_working}}</w:t>
+        <w:t>{{</w:t>
+      </w:r>
+      <w:r>
+        <w:rPr>
+          <w:rFonts w:ascii="TH Sarabun New" w:hAnsi="TH Sarabun New" w:cs="TH Sarabun New"/>
+          <w:sz w:val="32"/>
+          <w:szCs w:val="32"/>
+        </w:rPr>
+        <w:t>assoc</w:t>
+      </w:r>
+      <w:r>
+        <w:rPr>
+          <w:rFonts w:ascii="TH Sarabun New" w:hAnsi="TH Sarabun New" w:cs="TH Sarabun New"/>
+          <w:sz w:val="32"/>
+          <w:szCs w:val="32"/>
+        </w:rPr>
+        <w:t>_book_</w:t>
+      </w:r>
+      <w:r>
+        <w:rPr>
+          <w:rFonts w:ascii="TH Sarabun New" w:hAnsi="TH Sarabun New" w:cs="TH Sarabun New"/>
+          <w:sz w:val="32"/>
+          <w:szCs w:val="32"/>
+        </w:rPr>
+        <w:t>working_no_1</w:t>
+      </w:r>
+      <w:r>
+        <w:rPr>
+          <w:rFonts w:ascii="TH Sarabun New" w:hAnsi="TH Sarabun New" w:cs="TH Sarabun New"/>
+          <w:sz w:val="32"/>
+          <w:szCs w:val="32"/>
+        </w:rPr>
+        <w:t>}}</w:t>
+      </w:r>
+      <w:r>
+        <w:rPr>
+          <w:rFonts w:ascii="TH Sarabun New" w:hAnsi="TH Sarabun New" w:cs="TH Sarabun New"/>
+          <w:sz w:val="32"/>
+          <w:szCs w:val="32"/>
+          <w:cs/>
+        </w:rPr>
+        <w:t xml:space="preserve"> </w:t>
+      </w:r>
+      <w:r>
+        <w:rPr>
+          <w:rFonts w:ascii="TH Sarabun New" w:hAnsi="TH Sarabun New" w:cs="TH Sarabun New"/>
+          <w:sz w:val="32"/>
+          <w:szCs w:val="32"/>
+        </w:rPr>
+        <w:t>{{</w:t>
+      </w:r>
+      <w:r>
+        <w:rPr>
+          <w:rFonts w:ascii="TH Sarabun New" w:hAnsi="TH Sarabun New" w:cs="TH Sarabun New"/>
+          <w:sz w:val="32"/>
+          <w:szCs w:val="32"/>
+        </w:rPr>
+        <w:t>assoc</w:t>
+      </w:r>
+      <w:r>
+        <w:rPr>
+          <w:rFonts w:ascii="TH Sarabun New" w:hAnsi="TH Sarabun New" w:cs="TH Sarabun New"/>
+          <w:sz w:val="32"/>
+          <w:szCs w:val="32"/>
+        </w:rPr>
+        <w:t>_book_working</w:t>
+      </w:r>
+      <w:r>
+        <w:rPr>
+          <w:rFonts w:ascii="TH Sarabun New" w:hAnsi="TH Sarabun New" w:cs="TH Sarabun New"/>
+          <w:sz w:val="32"/>
+          <w:szCs w:val="32"/>
+        </w:rPr>
+        <w:t>_1</w:t>
+      </w:r>
+      <w:r>
+        <w:rPr>
+          <w:rFonts w:ascii="TH Sarabun New" w:hAnsi="TH Sarabun New" w:cs="TH Sarabun New"/>
+          <w:sz w:val="32"/>
+          <w:szCs w:val="32"/>
+        </w:rPr>
+        <w:t>}}</w:t>
       </w:r>
     </w:p>
     <w:p>
@@ -5248,23 +6248,40 @@
           <w:sz w:val="32"/>
           <w:szCs w:val="32"/>
         </w:rPr>
-        <w:t>{{associate_</w:t>
-      </w:r>
-      <w:r>
-        <w:rPr>
-          <w:rFonts w:ascii="TH Sarabun New" w:hAnsi="TH Sarabun New" w:cs="TH Sarabun New"/>
-          <w:sz w:val="32"/>
-          <w:szCs w:val="32"/>
-        </w:rPr>
-        <w:t>not_</w:t>
-      </w:r>
-      <w:r>
-        <w:rPr>
-          <w:rFonts w:ascii="TH Sarabun New" w:hAnsi="TH Sarabun New" w:cs="TH Sarabun New"/>
-          <w:sz w:val="32"/>
-          <w:szCs w:val="32"/>
-        </w:rPr>
-        <w:t>used_book}}</w:t>
+        <w:t>{{</w:t>
+      </w:r>
+      <w:r>
+        <w:rPr>
+          <w:rFonts w:ascii="TH Sarabun New" w:hAnsi="TH Sarabun New" w:cs="TH Sarabun New"/>
+          <w:sz w:val="32"/>
+          <w:szCs w:val="32"/>
+        </w:rPr>
+        <w:t>assoc</w:t>
+      </w:r>
+      <w:r>
+        <w:rPr>
+          <w:rFonts w:ascii="TH Sarabun New" w:hAnsi="TH Sarabun New" w:cs="TH Sarabun New"/>
+          <w:sz w:val="32"/>
+          <w:szCs w:val="32"/>
+        </w:rPr>
+        <w:t>_</w:t>
+      </w:r>
+      <w:r>
+        <w:rPr>
+          <w:rFonts w:ascii="TH Sarabun New" w:hAnsi="TH Sarabun New" w:cs="TH Sarabun New"/>
+          <w:sz w:val="32"/>
+          <w:szCs w:val="32"/>
+        </w:rPr>
+        <w:t>not_used_book_1</w:t>
+      </w:r>
+      <w:proofErr w:type="gramStart"/>
+      <w:r>
+        <w:rPr>
+          <w:rFonts w:ascii="TH Sarabun New" w:hAnsi="TH Sarabun New" w:cs="TH Sarabun New"/>
+          <w:sz w:val="32"/>
+          <w:szCs w:val="32"/>
+        </w:rPr>
+        <w:t>}}</w:t>
       </w:r>
       <w:r>
         <w:rPr>
@@ -5275,40 +6292,59 @@
         </w:rPr>
         <w:t xml:space="preserve">  ไม่เคยใช้</w:t>
       </w:r>
+      <w:proofErr w:type="gramEnd"/>
     </w:p>
     <w:p>
       <w:pPr>
         <w:spacing w:after="0" w:line="240" w:lineRule="auto"/>
         <w:ind w:left="1755" w:firstLine="720"/>
         <w:rPr>
-          <w:rFonts w:ascii="TH Sarabun New" w:hAnsi="TH Sarabun New" w:cs="TH Sarabun New"/>
-          <w:sz w:val="32"/>
-          <w:szCs w:val="32"/>
-        </w:rPr>
-      </w:pPr>
-      <w:r>
-        <w:rPr>
-          <w:rFonts w:ascii="TH Sarabun New" w:hAnsi="TH Sarabun New" w:cs="TH Sarabun New"/>
-          <w:sz w:val="32"/>
-          <w:szCs w:val="32"/>
-        </w:rPr>
-        <w:t>{{associate_</w:t>
-      </w:r>
-      <w:r>
-        <w:rPr>
-          <w:rFonts w:ascii="TH Sarabun New" w:hAnsi="TH Sarabun New" w:cs="TH Sarabun New"/>
-          <w:sz w:val="32"/>
-          <w:szCs w:val="32"/>
-        </w:rPr>
-        <w:t>is_</w:t>
-      </w:r>
-      <w:r>
-        <w:rPr>
-          <w:rFonts w:ascii="TH Sarabun New" w:hAnsi="TH Sarabun New" w:cs="TH Sarabun New"/>
-          <w:sz w:val="32"/>
-          <w:szCs w:val="32"/>
-        </w:rPr>
-        <w:t>used_book}}</w:t>
+          <w:rFonts w:ascii="TH Sarabun New" w:hAnsi="TH Sarabun New" w:cs="TH Sarabun New" w:hint="cs"/>
+          <w:sz w:val="32"/>
+          <w:szCs w:val="32"/>
+          <w:cs/>
+        </w:rPr>
+      </w:pPr>
+      <w:r>
+        <w:rPr>
+          <w:rFonts w:ascii="TH Sarabun New" w:hAnsi="TH Sarabun New" w:cs="TH Sarabun New"/>
+          <w:sz w:val="32"/>
+          <w:szCs w:val="32"/>
+        </w:rPr>
+        <w:t>{{</w:t>
+      </w:r>
+      <w:r>
+        <w:rPr>
+          <w:rFonts w:ascii="TH Sarabun New" w:hAnsi="TH Sarabun New" w:cs="TH Sarabun New"/>
+          <w:sz w:val="32"/>
+          <w:szCs w:val="32"/>
+        </w:rPr>
+        <w:t>assoc</w:t>
+      </w:r>
+      <w:r>
+        <w:rPr>
+          <w:rFonts w:ascii="TH Sarabun New" w:hAnsi="TH Sarabun New" w:cs="TH Sarabun New"/>
+          <w:sz w:val="32"/>
+          <w:szCs w:val="32"/>
+        </w:rPr>
+        <w:t>_</w:t>
+      </w:r>
+      <w:r>
+        <w:rPr>
+          <w:rFonts w:ascii="TH Sarabun New" w:hAnsi="TH Sarabun New" w:cs="TH Sarabun New"/>
+          <w:sz w:val="32"/>
+          <w:szCs w:val="32"/>
+        </w:rPr>
+        <w:t>is_used_book_1</w:t>
+      </w:r>
+      <w:proofErr w:type="gramStart"/>
+      <w:r>
+        <w:rPr>
+          <w:rFonts w:ascii="TH Sarabun New" w:hAnsi="TH Sarabun New" w:cs="TH Sarabun New"/>
+          <w:sz w:val="32"/>
+          <w:szCs w:val="32"/>
+        </w:rPr>
+        <w:t>}}</w:t>
       </w:r>
       <w:r>
         <w:rPr>
@@ -5328,6 +6364,7 @@
         </w:rPr>
         <w:t>เคยใช้</w:t>
       </w:r>
+      <w:proofErr w:type="gramEnd"/>
       <w:r>
         <w:rPr>
           <w:rFonts w:ascii="TH Sarabun New" w:hAnsi="TH Sarabun New" w:cs="TH Sarabun New"/>
@@ -5362,7 +6399,17 @@
           <w:szCs w:val="32"/>
           <w:cs/>
         </w:rPr>
-        <w:t>พ.ศ</w:t>
+        <w:t>พ.</w:t>
+      </w:r>
+      <w:proofErr w:type="gramStart"/>
+      <w:r>
+        <w:rPr>
+          <w:rFonts w:ascii="TH Sarabun New" w:hAnsi="TH Sarabun New" w:cs="TH Sarabun New"/>
+          <w:sz w:val="32"/>
+          <w:szCs w:val="32"/>
+          <w:cs/>
+        </w:rPr>
+        <w:t>ศ</w:t>
       </w:r>
       <w:r>
         <w:rPr>
@@ -5379,7 +6426,40 @@
           <w:sz w:val="32"/>
           <w:szCs w:val="32"/>
         </w:rPr>
-        <w:t>{{associate_used_book_year}}</w:t>
+        <w:t>{{</w:t>
+      </w:r>
+      <w:proofErr w:type="gramEnd"/>
+      <w:r>
+        <w:rPr>
+          <w:rFonts w:ascii="TH Sarabun New" w:hAnsi="TH Sarabun New" w:cs="TH Sarabun New"/>
+          <w:sz w:val="32"/>
+          <w:szCs w:val="32"/>
+        </w:rPr>
+        <w:t>assoc</w:t>
+      </w:r>
+      <w:r>
+        <w:rPr>
+          <w:rFonts w:ascii="TH Sarabun New" w:hAnsi="TH Sarabun New" w:cs="TH Sarabun New"/>
+          <w:sz w:val="32"/>
+          <w:szCs w:val="32"/>
+        </w:rPr>
+        <w:t>_</w:t>
+      </w:r>
+      <w:r>
+        <w:rPr>
+          <w:rFonts w:ascii="TH Sarabun New" w:hAnsi="TH Sarabun New" w:cs="TH Sarabun New"/>
+          <w:sz w:val="32"/>
+          <w:szCs w:val="32"/>
+        </w:rPr>
+        <w:t>used_book_year_1</w:t>
+      </w:r>
+      <w:r>
+        <w:rPr>
+          <w:rFonts w:ascii="TH Sarabun New" w:hAnsi="TH Sarabun New" w:cs="TH Sarabun New"/>
+          <w:sz w:val="32"/>
+          <w:szCs w:val="32"/>
+        </w:rPr>
+        <w:t>}}</w:t>
       </w:r>
       <w:r>
         <w:rPr>
@@ -5405,7 +6485,39 @@
           <w:sz w:val="32"/>
           <w:szCs w:val="32"/>
         </w:rPr>
-        <w:t>{{associate_used_book_level}}</w:t>
+        <w:t>{{</w:t>
+      </w:r>
+      <w:r>
+        <w:rPr>
+          <w:rFonts w:ascii="TH Sarabun New" w:hAnsi="TH Sarabun New" w:cs="TH Sarabun New"/>
+          <w:sz w:val="32"/>
+          <w:szCs w:val="32"/>
+        </w:rPr>
+        <w:t>assoc</w:t>
+      </w:r>
+      <w:r>
+        <w:rPr>
+          <w:rFonts w:ascii="TH Sarabun New" w:hAnsi="TH Sarabun New" w:cs="TH Sarabun New"/>
+          <w:sz w:val="32"/>
+          <w:szCs w:val="32"/>
+        </w:rPr>
+        <w:t>_</w:t>
+      </w:r>
+      <w:r>
+        <w:rPr>
+          <w:rFonts w:ascii="TH Sarabun New" w:hAnsi="TH Sarabun New" w:cs="TH Sarabun New"/>
+          <w:sz w:val="32"/>
+          <w:szCs w:val="32"/>
+        </w:rPr>
+        <w:t>used_book_level_1</w:t>
+      </w:r>
+      <w:r>
+        <w:rPr>
+          <w:rFonts w:ascii="TH Sarabun New" w:hAnsi="TH Sarabun New" w:cs="TH Sarabun New"/>
+          <w:sz w:val="32"/>
+          <w:szCs w:val="32"/>
+        </w:rPr>
+        <w:t>}}</w:t>
       </w:r>
       <w:r>
         <w:rPr>
@@ -5441,14 +6553,6 @@
           <w:cs/>
         </w:rPr>
         <w:t>)</w:t>
-      </w:r>
-      <w:r>
-        <w:rPr>
-          <w:rFonts w:ascii="TH Sarabun New" w:hAnsi="TH Sarabun New" w:cs="TH Sarabun New"/>
-          <w:sz w:val="32"/>
-          <w:szCs w:val="32"/>
-        </w:rPr>
-        <w:t xml:space="preserve"> {{/associate_book_working_list}}</w:t>
       </w:r>
     </w:p>
     <w:p>
@@ -5590,7 +6694,48 @@
           <w:sz w:val="32"/>
           <w:szCs w:val="32"/>
         </w:rPr>
-        <w:t>{{?associate_method3_research_list}}{{associate_method3_research_no}}</w:t>
+        <w:t>{{</w:t>
+      </w:r>
+      <w:r>
+        <w:rPr>
+          <w:rFonts w:ascii="TH Sarabun New" w:hAnsi="TH Sarabun New" w:cs="TH Sarabun New"/>
+          <w:sz w:val="32"/>
+          <w:szCs w:val="32"/>
+        </w:rPr>
+        <w:t>assoc</w:t>
+      </w:r>
+      <w:r>
+        <w:rPr>
+          <w:rFonts w:ascii="TH Sarabun New" w:hAnsi="TH Sarabun New" w:cs="TH Sarabun New"/>
+          <w:sz w:val="32"/>
+          <w:szCs w:val="32"/>
+        </w:rPr>
+        <w:t>_method3_research_no</w:t>
+      </w:r>
+      <w:r>
+        <w:rPr>
+          <w:rFonts w:ascii="TH Sarabun New" w:hAnsi="TH Sarabun New" w:cs="TH Sarabun New"/>
+          <w:sz w:val="32"/>
+          <w:szCs w:val="32"/>
+        </w:rPr>
+        <w:t>_</w:t>
+      </w:r>
+      <w:proofErr w:type="gramStart"/>
+      <w:r>
+        <w:rPr>
+          <w:rFonts w:ascii="TH Sarabun New" w:hAnsi="TH Sarabun New" w:cs="TH Sarabun New"/>
+          <w:sz w:val="32"/>
+          <w:szCs w:val="32"/>
+        </w:rPr>
+        <w:t>1</w:t>
+      </w:r>
+      <w:r>
+        <w:rPr>
+          <w:rFonts w:ascii="TH Sarabun New" w:hAnsi="TH Sarabun New" w:cs="TH Sarabun New"/>
+          <w:sz w:val="32"/>
+          <w:szCs w:val="32"/>
+        </w:rPr>
+        <w:t>}}</w:t>
       </w:r>
       <w:r>
         <w:rPr>
@@ -5616,7 +6761,40 @@
           <w:sz w:val="32"/>
           <w:szCs w:val="32"/>
         </w:rPr>
-        <w:t>{{associate_method3_research}}</w:t>
+        <w:t>{{</w:t>
+      </w:r>
+      <w:proofErr w:type="gramEnd"/>
+      <w:r>
+        <w:rPr>
+          <w:rFonts w:ascii="TH Sarabun New" w:hAnsi="TH Sarabun New" w:cs="TH Sarabun New"/>
+          <w:sz w:val="32"/>
+          <w:szCs w:val="32"/>
+        </w:rPr>
+        <w:t>assoc</w:t>
+      </w:r>
+      <w:r>
+        <w:rPr>
+          <w:rFonts w:ascii="TH Sarabun New" w:hAnsi="TH Sarabun New" w:cs="TH Sarabun New"/>
+          <w:sz w:val="32"/>
+          <w:szCs w:val="32"/>
+        </w:rPr>
+        <w:t>_method3_research</w:t>
+      </w:r>
+      <w:r>
+        <w:rPr>
+          <w:rFonts w:ascii="TH Sarabun New" w:hAnsi="TH Sarabun New" w:cs="TH Sarabun New"/>
+          <w:sz w:val="32"/>
+          <w:szCs w:val="32"/>
+        </w:rPr>
+        <w:t>_1</w:t>
+      </w:r>
+      <w:r>
+        <w:rPr>
+          <w:rFonts w:ascii="TH Sarabun New" w:hAnsi="TH Sarabun New" w:cs="TH Sarabun New"/>
+          <w:sz w:val="32"/>
+          <w:szCs w:val="32"/>
+        </w:rPr>
+        <w:t>}}</w:t>
       </w:r>
       <w:r>
         <w:rPr>
@@ -5769,6 +6947,7 @@
         </w:rPr>
         <w:t xml:space="preserve">1 </w:t>
       </w:r>
+      <w:proofErr w:type="gramStart"/>
       <w:r>
         <w:rPr>
           <w:rFonts w:ascii="TH Sarabun New" w:hAnsi="TH Sarabun New" w:cs="TH Sarabun New"/>
@@ -5793,7 +6972,16 @@
           <w:sz w:val="32"/>
           <w:szCs w:val="32"/>
         </w:rPr>
-        <w:t>{{assoc_m3_q2}}</w:t>
+        <w:t>{</w:t>
+      </w:r>
+      <w:proofErr w:type="gramEnd"/>
+      <w:r>
+        <w:rPr>
+          <w:rFonts w:ascii="TH Sarabun New" w:hAnsi="TH Sarabun New" w:cs="TH Sarabun New"/>
+          <w:sz w:val="32"/>
+          <w:szCs w:val="32"/>
+        </w:rPr>
+        <w:t>{assoc_m3_q2}}</w:t>
       </w:r>
       <w:r>
         <w:rPr>
@@ -5894,7 +7082,6 @@
           <w:sz w:val="32"/>
           <w:szCs w:val="32"/>
         </w:rPr>
-        <w:lastRenderedPageBreak/>
         <w:t>{{assoc_m3_first}}</w:t>
       </w:r>
       <w:r>
@@ -6011,14 +7198,6 @@
           <w:szCs w:val="32"/>
         </w:rPr>
         <w:t>corresponding author)</w:t>
-      </w:r>
-      <w:r>
-        <w:rPr>
-          <w:rFonts w:ascii="TH Sarabun New" w:hAnsi="TH Sarabun New" w:cs="TH Sarabun New"/>
-          <w:sz w:val="32"/>
-          <w:szCs w:val="32"/>
-        </w:rPr>
-        <w:t xml:space="preserve"> {{/associate_method3_research_list}}</w:t>
       </w:r>
     </w:p>
     <w:p>
@@ -6333,7 +7512,16 @@
           <w:sz w:val="32"/>
           <w:szCs w:val="32"/>
         </w:rPr>
-        <w:t>{{?assoc_pi_project_list}}{{assoc_pi_project_no}}</w:t>
+        <w:t>{{assoc_pi_project_</w:t>
+      </w:r>
+      <w:proofErr w:type="gramStart"/>
+      <w:r>
+        <w:rPr>
+          <w:rFonts w:ascii="TH Sarabun New" w:hAnsi="TH Sarabun New" w:cs="TH Sarabun New"/>
+          <w:sz w:val="32"/>
+          <w:szCs w:val="32"/>
+        </w:rPr>
+        <w:t>no}}</w:t>
       </w:r>
       <w:r>
         <w:rPr>
@@ -6359,7 +7547,16 @@
           <w:sz w:val="32"/>
           <w:szCs w:val="32"/>
         </w:rPr>
-        <w:t>{{assoc_pi_project}}</w:t>
+        <w:t>{{</w:t>
+      </w:r>
+      <w:proofErr w:type="gramEnd"/>
+      <w:r>
+        <w:rPr>
+          <w:rFonts w:ascii="TH Sarabun New" w:hAnsi="TH Sarabun New" w:cs="TH Sarabun New"/>
+          <w:sz w:val="32"/>
+          <w:szCs w:val="32"/>
+        </w:rPr>
+        <w:t>assoc_pi_project}}</w:t>
       </w:r>
     </w:p>
     <w:p>
@@ -6397,14 +7594,6 @@
           <w:szCs w:val="32"/>
         </w:rPr>
         <w:t>{{assoc_pi_source}}</w:t>
-      </w:r>
-      <w:r>
-        <w:rPr>
-          <w:rFonts w:ascii="TH Sarabun New" w:hAnsi="TH Sarabun New" w:cs="TH Sarabun New"/>
-          <w:sz w:val="32"/>
-          <w:szCs w:val="32"/>
-        </w:rPr>
-        <w:t>{{/assoc_pi_project_list}}</w:t>
       </w:r>
     </w:p>
     <w:p>
@@ -6443,7 +7632,17 @@
           <w:szCs w:val="32"/>
           <w:cs/>
         </w:rPr>
-        <w:t>ทางวิชาการให้ระบุว่าอยู่ในฐานข้อมูลใดตามประกาศ ก.พ.อ. โดยระบุบทบาทหน้าที่ของผลงานแต่ละประเภท ตามลักษณะการมีส่วนร่วมในผลงานทางวิชาการตาม</w:t>
+        <w:t>ทางวิชาการให้ระบุว่าอยู่ใน</w:t>
+      </w:r>
+      <w:r>
+        <w:rPr>
+          <w:rFonts w:ascii="TH Sarabun New" w:hAnsi="TH Sarabun New" w:cs="TH Sarabun New"/>
+          <w:sz w:val="32"/>
+          <w:szCs w:val="32"/>
+          <w:cs/>
+        </w:rPr>
+        <w:lastRenderedPageBreak/>
+        <w:t>ฐานข้อมูลใดตามประกาศ ก.พ.อ. โดยระบุบทบาทหน้าที่ของผลงานแต่ละประเภท ตามลักษณะการมีส่วนร่วมในผลงานทางวิชาการตาม</w:t>
       </w:r>
       <w:r>
         <w:rPr>
@@ -6675,24 +7874,56 @@
           <w:sz w:val="32"/>
           <w:szCs w:val="32"/>
         </w:rPr>
-        <w:t>{{?prof_research_working_list}}{{prof_research_working_no}}</w:t>
-      </w:r>
-      <w:r>
-        <w:rPr>
-          <w:rFonts w:ascii="TH Sarabun New" w:hAnsi="TH Sarabun New" w:cs="TH Sarabun New"/>
-          <w:sz w:val="32"/>
-          <w:szCs w:val="32"/>
-          <w:cs/>
-        </w:rPr>
-        <w:t xml:space="preserve"> </w:t>
-      </w:r>
-      <w:r>
-        <w:rPr>
-          <w:rFonts w:ascii="TH Sarabun New" w:hAnsi="TH Sarabun New" w:cs="TH Sarabun New"/>
-          <w:sz w:val="32"/>
-          <w:szCs w:val="32"/>
-        </w:rPr>
-        <w:t>{{prof_research_working}}</w:t>
+        <w:t>{{prof_research_</w:t>
+      </w:r>
+      <w:r>
+        <w:rPr>
+          <w:rFonts w:ascii="TH Sarabun New" w:hAnsi="TH Sarabun New" w:cs="TH Sarabun New"/>
+          <w:sz w:val="32"/>
+          <w:szCs w:val="32"/>
+        </w:rPr>
+        <w:t>working_no_1</w:t>
+      </w:r>
+      <w:r>
+        <w:rPr>
+          <w:rFonts w:ascii="TH Sarabun New" w:hAnsi="TH Sarabun New" w:cs="TH Sarabun New"/>
+          <w:sz w:val="32"/>
+          <w:szCs w:val="32"/>
+        </w:rPr>
+        <w:t>}}</w:t>
+      </w:r>
+      <w:r>
+        <w:rPr>
+          <w:rFonts w:ascii="TH Sarabun New" w:hAnsi="TH Sarabun New" w:cs="TH Sarabun New"/>
+          <w:sz w:val="32"/>
+          <w:szCs w:val="32"/>
+          <w:cs/>
+        </w:rPr>
+        <w:t xml:space="preserve"> </w:t>
+      </w:r>
+      <w:r>
+        <w:rPr>
+          <w:rFonts w:ascii="TH Sarabun New" w:hAnsi="TH Sarabun New" w:cs="TH Sarabun New"/>
+          <w:sz w:val="32"/>
+          <w:szCs w:val="32"/>
+        </w:rPr>
+        <w:t>{{prof_research_working</w:t>
+      </w:r>
+      <w:r>
+        <w:rPr>
+          <w:rFonts w:ascii="TH Sarabun New" w:hAnsi="TH Sarabun New" w:cs="TH Sarabun New"/>
+          <w:sz w:val="32"/>
+          <w:szCs w:val="32"/>
+        </w:rPr>
+        <w:t>_1</w:t>
+      </w:r>
+      <w:r>
+        <w:rPr>
+          <w:rFonts w:ascii="TH Sarabun New" w:hAnsi="TH Sarabun New" w:cs="TH Sarabun New"/>
+          <w:sz w:val="32"/>
+          <w:szCs w:val="32"/>
+        </w:rPr>
+        <w:t>}}</w:t>
       </w:r>
     </w:p>
     <w:p>
@@ -6749,7 +7980,24 @@
           <w:sz w:val="32"/>
           <w:szCs w:val="32"/>
         </w:rPr>
-        <w:t>{{prof_not_used_research}}</w:t>
+        <w:t>{{prof_</w:t>
+      </w:r>
+      <w:r>
+        <w:rPr>
+          <w:rFonts w:ascii="TH Sarabun New" w:hAnsi="TH Sarabun New" w:cs="TH Sarabun New"/>
+          <w:sz w:val="32"/>
+          <w:szCs w:val="32"/>
+        </w:rPr>
+        <w:t>not_used_research_1</w:t>
+      </w:r>
+      <w:proofErr w:type="gramStart"/>
+      <w:r>
+        <w:rPr>
+          <w:rFonts w:ascii="TH Sarabun New" w:hAnsi="TH Sarabun New" w:cs="TH Sarabun New"/>
+          <w:sz w:val="32"/>
+          <w:szCs w:val="32"/>
+        </w:rPr>
+        <w:t>}}</w:t>
       </w:r>
       <w:r>
         <w:rPr>
@@ -6760,24 +8008,43 @@
         </w:rPr>
         <w:t xml:space="preserve">  ไม่เคยใช้</w:t>
       </w:r>
+      <w:proofErr w:type="gramEnd"/>
     </w:p>
     <w:p>
       <w:pPr>
         <w:spacing w:after="0" w:line="240" w:lineRule="auto"/>
         <w:ind w:left="1755" w:firstLine="720"/>
         <w:rPr>
-          <w:rFonts w:ascii="TH Sarabun New" w:hAnsi="TH Sarabun New" w:cs="TH Sarabun New"/>
-          <w:sz w:val="32"/>
-          <w:szCs w:val="32"/>
-        </w:rPr>
-      </w:pPr>
-      <w:r>
-        <w:rPr>
-          <w:rFonts w:ascii="TH Sarabun New" w:hAnsi="TH Sarabun New" w:cs="TH Sarabun New"/>
-          <w:sz w:val="32"/>
-          <w:szCs w:val="32"/>
-        </w:rPr>
-        <w:t>{{prof_is_used_research}}</w:t>
+          <w:rFonts w:ascii="TH Sarabun New" w:hAnsi="TH Sarabun New" w:cs="TH Sarabun New" w:hint="cs"/>
+          <w:sz w:val="32"/>
+          <w:szCs w:val="32"/>
+          <w:cs/>
+        </w:rPr>
+      </w:pPr>
+      <w:r>
+        <w:rPr>
+          <w:rFonts w:ascii="TH Sarabun New" w:hAnsi="TH Sarabun New" w:cs="TH Sarabun New"/>
+          <w:sz w:val="32"/>
+          <w:szCs w:val="32"/>
+        </w:rPr>
+        <w:t>{{prof_</w:t>
+      </w:r>
+      <w:r>
+        <w:rPr>
+          <w:rFonts w:ascii="TH Sarabun New" w:hAnsi="TH Sarabun New" w:cs="TH Sarabun New"/>
+          <w:sz w:val="32"/>
+          <w:szCs w:val="32"/>
+        </w:rPr>
+        <w:t>is_used_research_1</w:t>
+      </w:r>
+      <w:proofErr w:type="gramStart"/>
+      <w:r>
+        <w:rPr>
+          <w:rFonts w:ascii="TH Sarabun New" w:hAnsi="TH Sarabun New" w:cs="TH Sarabun New"/>
+          <w:sz w:val="32"/>
+          <w:szCs w:val="32"/>
+        </w:rPr>
+        <w:t>}}</w:t>
       </w:r>
       <w:r>
         <w:rPr>
@@ -6797,6 +8064,7 @@
         </w:rPr>
         <w:t>เคยใช้</w:t>
       </w:r>
+      <w:proofErr w:type="gramEnd"/>
       <w:r>
         <w:rPr>
           <w:rFonts w:ascii="TH Sarabun New" w:hAnsi="TH Sarabun New" w:cs="TH Sarabun New"/>
@@ -6831,7 +8099,17 @@
           <w:szCs w:val="32"/>
           <w:cs/>
         </w:rPr>
-        <w:t>พ.ศ</w:t>
+        <w:t>พ.</w:t>
+      </w:r>
+      <w:proofErr w:type="gramStart"/>
+      <w:r>
+        <w:rPr>
+          <w:rFonts w:ascii="TH Sarabun New" w:hAnsi="TH Sarabun New" w:cs="TH Sarabun New"/>
+          <w:sz w:val="32"/>
+          <w:szCs w:val="32"/>
+          <w:cs/>
+        </w:rPr>
+        <w:t>ศ</w:t>
       </w:r>
       <w:r>
         <w:rPr>
@@ -6848,7 +8126,32 @@
           <w:sz w:val="32"/>
           <w:szCs w:val="32"/>
         </w:rPr>
-        <w:t xml:space="preserve">{{prof_used_research_year}} </w:t>
+        <w:t>{{</w:t>
+      </w:r>
+      <w:proofErr w:type="gramEnd"/>
+      <w:r>
+        <w:rPr>
+          <w:rFonts w:ascii="TH Sarabun New" w:hAnsi="TH Sarabun New" w:cs="TH Sarabun New"/>
+          <w:sz w:val="32"/>
+          <w:szCs w:val="32"/>
+        </w:rPr>
+        <w:t>prof_</w:t>
+      </w:r>
+      <w:r>
+        <w:rPr>
+          <w:rFonts w:ascii="TH Sarabun New" w:hAnsi="TH Sarabun New" w:cs="TH Sarabun New"/>
+          <w:sz w:val="32"/>
+          <w:szCs w:val="32"/>
+        </w:rPr>
+        <w:t>used_research_year_1</w:t>
+      </w:r>
+      <w:r>
+        <w:rPr>
+          <w:rFonts w:ascii="TH Sarabun New" w:hAnsi="TH Sarabun New" w:cs="TH Sarabun New"/>
+          <w:sz w:val="32"/>
+          <w:szCs w:val="32"/>
+        </w:rPr>
+        <w:t xml:space="preserve">}} </w:t>
       </w:r>
       <w:r>
         <w:rPr>
@@ -6865,7 +8168,23 @@
           <w:sz w:val="32"/>
           <w:szCs w:val="32"/>
         </w:rPr>
-        <w:t>{{prof_used_research_level}}</w:t>
+        <w:t>{{prof_</w:t>
+      </w:r>
+      <w:r>
+        <w:rPr>
+          <w:rFonts w:ascii="TH Sarabun New" w:hAnsi="TH Sarabun New" w:cs="TH Sarabun New"/>
+          <w:sz w:val="32"/>
+          <w:szCs w:val="32"/>
+        </w:rPr>
+        <w:t>used_research_level_1</w:t>
+      </w:r>
+      <w:r>
+        <w:rPr>
+          <w:rFonts w:ascii="TH Sarabun New" w:hAnsi="TH Sarabun New" w:cs="TH Sarabun New"/>
+          <w:sz w:val="32"/>
+          <w:szCs w:val="32"/>
+        </w:rPr>
+        <w:t>}}</w:t>
       </w:r>
       <w:r>
         <w:rPr>
@@ -6902,14 +8221,6 @@
           <w:cs/>
         </w:rPr>
         <w:t>)</w:t>
-      </w:r>
-      <w:r>
-        <w:rPr>
-          <w:rFonts w:ascii="TH Sarabun New" w:hAnsi="TH Sarabun New" w:cs="TH Sarabun New"/>
-          <w:sz w:val="32"/>
-          <w:szCs w:val="32"/>
-        </w:rPr>
-        <w:t>{{/prof_research_working_list}}</w:t>
       </w:r>
     </w:p>
     <w:p>
@@ -6950,7 +8261,6 @@
           <w:szCs w:val="32"/>
           <w:cs/>
         </w:rPr>
-        <w:lastRenderedPageBreak/>
         <w:t>๔.๓.๒ ผลงานทางวิชาการในลักษณะอื่น</w:t>
       </w:r>
       <w:r>
@@ -7005,7 +8315,23 @@
           <w:sz w:val="32"/>
           <w:szCs w:val="32"/>
         </w:rPr>
-        <w:t>{{?prof_other_working_list}}{{prof_other_working_no}}</w:t>
+        <w:t>{{prof_other_</w:t>
+      </w:r>
+      <w:r>
+        <w:rPr>
+          <w:rFonts w:ascii="TH Sarabun New" w:hAnsi="TH Sarabun New" w:cs="TH Sarabun New"/>
+          <w:sz w:val="32"/>
+          <w:szCs w:val="32"/>
+        </w:rPr>
+        <w:t>working_no_1</w:t>
+      </w:r>
+      <w:r>
+        <w:rPr>
+          <w:rFonts w:ascii="TH Sarabun New" w:hAnsi="TH Sarabun New" w:cs="TH Sarabun New"/>
+          <w:sz w:val="32"/>
+          <w:szCs w:val="32"/>
+        </w:rPr>
+        <w:t>}}</w:t>
       </w:r>
       <w:r>
         <w:rPr>
@@ -7031,6 +8357,14 @@
           <w:szCs w:val="32"/>
         </w:rPr>
         <w:t>_working</w:t>
+      </w:r>
+      <w:r>
+        <w:rPr>
+          <w:rFonts w:ascii="TH Sarabun New" w:hAnsi="TH Sarabun New" w:cs="TH Sarabun New"/>
+          <w:sz w:val="32"/>
+          <w:szCs w:val="32"/>
+        </w:rPr>
+        <w:t>_1</w:t>
       </w:r>
       <w:r>
         <w:rPr>
@@ -7141,7 +8475,24 @@
           <w:sz w:val="32"/>
           <w:szCs w:val="32"/>
         </w:rPr>
-        <w:t>{{prof_not_used_other}}</w:t>
+        <w:t>{{prof_not_used_other</w:t>
+      </w:r>
+      <w:r>
+        <w:rPr>
+          <w:rFonts w:ascii="TH Sarabun New" w:hAnsi="TH Sarabun New" w:cs="TH Sarabun New"/>
+          <w:sz w:val="32"/>
+          <w:szCs w:val="32"/>
+        </w:rPr>
+        <w:t>_1</w:t>
+      </w:r>
+      <w:proofErr w:type="gramStart"/>
+      <w:r>
+        <w:rPr>
+          <w:rFonts w:ascii="TH Sarabun New" w:hAnsi="TH Sarabun New" w:cs="TH Sarabun New"/>
+          <w:sz w:val="32"/>
+          <w:szCs w:val="32"/>
+        </w:rPr>
+        <w:t>}}</w:t>
       </w:r>
       <w:r>
         <w:rPr>
@@ -7152,24 +8503,43 @@
         </w:rPr>
         <w:t xml:space="preserve">  ไม่เคยใช้</w:t>
       </w:r>
+      <w:proofErr w:type="gramEnd"/>
     </w:p>
     <w:p>
       <w:pPr>
         <w:spacing w:after="0" w:line="240" w:lineRule="auto"/>
         <w:ind w:left="1755" w:firstLine="720"/>
         <w:rPr>
-          <w:rFonts w:ascii="TH Sarabun New" w:hAnsi="TH Sarabun New" w:cs="TH Sarabun New"/>
-          <w:sz w:val="32"/>
-          <w:szCs w:val="32"/>
-        </w:rPr>
-      </w:pPr>
-      <w:r>
-        <w:rPr>
-          <w:rFonts w:ascii="TH Sarabun New" w:hAnsi="TH Sarabun New" w:cs="TH Sarabun New"/>
-          <w:sz w:val="32"/>
-          <w:szCs w:val="32"/>
-        </w:rPr>
-        <w:t>{{prof_is_used_other}}</w:t>
+          <w:rFonts w:ascii="TH Sarabun New" w:hAnsi="TH Sarabun New" w:cs="TH Sarabun New" w:hint="cs"/>
+          <w:sz w:val="32"/>
+          <w:szCs w:val="32"/>
+          <w:cs/>
+        </w:rPr>
+      </w:pPr>
+      <w:r>
+        <w:rPr>
+          <w:rFonts w:ascii="TH Sarabun New" w:hAnsi="TH Sarabun New" w:cs="TH Sarabun New"/>
+          <w:sz w:val="32"/>
+          <w:szCs w:val="32"/>
+        </w:rPr>
+        <w:t>{{prof_is_used_other</w:t>
+      </w:r>
+      <w:r>
+        <w:rPr>
+          <w:rFonts w:ascii="TH Sarabun New" w:hAnsi="TH Sarabun New" w:cs="TH Sarabun New"/>
+          <w:sz w:val="32"/>
+          <w:szCs w:val="32"/>
+        </w:rPr>
+        <w:t>_1</w:t>
+      </w:r>
+      <w:proofErr w:type="gramStart"/>
+      <w:r>
+        <w:rPr>
+          <w:rFonts w:ascii="TH Sarabun New" w:hAnsi="TH Sarabun New" w:cs="TH Sarabun New"/>
+          <w:sz w:val="32"/>
+          <w:szCs w:val="32"/>
+        </w:rPr>
+        <w:t>}}</w:t>
       </w:r>
       <w:r>
         <w:rPr>
@@ -7189,6 +8559,7 @@
         </w:rPr>
         <w:t>เคยใช้</w:t>
       </w:r>
+      <w:proofErr w:type="gramEnd"/>
       <w:r>
         <w:rPr>
           <w:rFonts w:ascii="TH Sarabun New" w:hAnsi="TH Sarabun New" w:cs="TH Sarabun New"/>
@@ -7223,7 +8594,17 @@
           <w:szCs w:val="32"/>
           <w:cs/>
         </w:rPr>
-        <w:t>พ.ศ</w:t>
+        <w:t>พ.</w:t>
+      </w:r>
+      <w:proofErr w:type="gramStart"/>
+      <w:r>
+        <w:rPr>
+          <w:rFonts w:ascii="TH Sarabun New" w:hAnsi="TH Sarabun New" w:cs="TH Sarabun New"/>
+          <w:sz w:val="32"/>
+          <w:szCs w:val="32"/>
+          <w:cs/>
+        </w:rPr>
+        <w:t>ศ</w:t>
       </w:r>
       <w:r>
         <w:rPr>
@@ -7240,7 +8621,32 @@
           <w:sz w:val="32"/>
           <w:szCs w:val="32"/>
         </w:rPr>
-        <w:t>{{prof_used_other_year}}</w:t>
+        <w:t>{{</w:t>
+      </w:r>
+      <w:proofErr w:type="gramEnd"/>
+      <w:r>
+        <w:rPr>
+          <w:rFonts w:ascii="TH Sarabun New" w:hAnsi="TH Sarabun New" w:cs="TH Sarabun New"/>
+          <w:sz w:val="32"/>
+          <w:szCs w:val="32"/>
+        </w:rPr>
+        <w:t>prof_used_other_year</w:t>
+      </w:r>
+      <w:r>
+        <w:rPr>
+          <w:rFonts w:ascii="TH Sarabun New" w:hAnsi="TH Sarabun New" w:cs="TH Sarabun New"/>
+          <w:sz w:val="32"/>
+          <w:szCs w:val="32"/>
+        </w:rPr>
+        <w:t>_1</w:t>
+      </w:r>
+      <w:r>
+        <w:rPr>
+          <w:rFonts w:ascii="TH Sarabun New" w:hAnsi="TH Sarabun New" w:cs="TH Sarabun New"/>
+          <w:sz w:val="32"/>
+          <w:szCs w:val="32"/>
+        </w:rPr>
+        <w:t>}}</w:t>
       </w:r>
       <w:r>
         <w:rPr>
@@ -7266,7 +8672,23 @@
           <w:sz w:val="32"/>
           <w:szCs w:val="32"/>
         </w:rPr>
-        <w:t>{{prof_used_other_level}}</w:t>
+        <w:t>{{prof_used_other_level</w:t>
+      </w:r>
+      <w:r>
+        <w:rPr>
+          <w:rFonts w:ascii="TH Sarabun New" w:hAnsi="TH Sarabun New" w:cs="TH Sarabun New"/>
+          <w:sz w:val="32"/>
+          <w:szCs w:val="32"/>
+        </w:rPr>
+        <w:t>_1</w:t>
+      </w:r>
+      <w:r>
+        <w:rPr>
+          <w:rFonts w:ascii="TH Sarabun New" w:hAnsi="TH Sarabun New" w:cs="TH Sarabun New"/>
+          <w:sz w:val="32"/>
+          <w:szCs w:val="32"/>
+        </w:rPr>
+        <w:t>}}</w:t>
       </w:r>
       <w:r>
         <w:rPr>
@@ -7304,14 +8726,6 @@
         </w:rPr>
         <w:t>)</w:t>
       </w:r>
-      <w:r>
-        <w:rPr>
-          <w:rFonts w:ascii="TH Sarabun New" w:hAnsi="TH Sarabun New" w:cs="TH Sarabun New"/>
-          <w:sz w:val="32"/>
-          <w:szCs w:val="32"/>
-        </w:rPr>
-        <w:t xml:space="preserve"> {{/prof_other_working_list}}</w:t>
-      </w:r>
     </w:p>
     <w:p>
       <w:pPr>
@@ -7349,24 +8763,56 @@
           <w:sz w:val="32"/>
           <w:szCs w:val="32"/>
         </w:rPr>
-        <w:t>{{?prof_book_working_list}}{{prof_book_working_no}}</w:t>
-      </w:r>
-      <w:r>
-        <w:rPr>
-          <w:rFonts w:ascii="TH Sarabun New" w:hAnsi="TH Sarabun New" w:cs="TH Sarabun New"/>
-          <w:sz w:val="32"/>
-          <w:szCs w:val="32"/>
-          <w:cs/>
-        </w:rPr>
-        <w:t xml:space="preserve"> </w:t>
-      </w:r>
-      <w:r>
-        <w:rPr>
-          <w:rFonts w:ascii="TH Sarabun New" w:hAnsi="TH Sarabun New" w:cs="TH Sarabun New"/>
-          <w:sz w:val="32"/>
-          <w:szCs w:val="32"/>
-        </w:rPr>
-        <w:t>{{prof_book_working}}</w:t>
+        <w:t>{{prof_book_</w:t>
+      </w:r>
+      <w:r>
+        <w:rPr>
+          <w:rFonts w:ascii="TH Sarabun New" w:hAnsi="TH Sarabun New" w:cs="TH Sarabun New"/>
+          <w:sz w:val="32"/>
+          <w:szCs w:val="32"/>
+        </w:rPr>
+        <w:t>working_no_1</w:t>
+      </w:r>
+      <w:r>
+        <w:rPr>
+          <w:rFonts w:ascii="TH Sarabun New" w:hAnsi="TH Sarabun New" w:cs="TH Sarabun New"/>
+          <w:sz w:val="32"/>
+          <w:szCs w:val="32"/>
+        </w:rPr>
+        <w:t>}}</w:t>
+      </w:r>
+      <w:r>
+        <w:rPr>
+          <w:rFonts w:ascii="TH Sarabun New" w:hAnsi="TH Sarabun New" w:cs="TH Sarabun New"/>
+          <w:sz w:val="32"/>
+          <w:szCs w:val="32"/>
+          <w:cs/>
+        </w:rPr>
+        <w:t xml:space="preserve"> </w:t>
+      </w:r>
+      <w:r>
+        <w:rPr>
+          <w:rFonts w:ascii="TH Sarabun New" w:hAnsi="TH Sarabun New" w:cs="TH Sarabun New"/>
+          <w:sz w:val="32"/>
+          <w:szCs w:val="32"/>
+        </w:rPr>
+        <w:t>{{prof_book_working</w:t>
+      </w:r>
+      <w:r>
+        <w:rPr>
+          <w:rFonts w:ascii="TH Sarabun New" w:hAnsi="TH Sarabun New" w:cs="TH Sarabun New"/>
+          <w:sz w:val="32"/>
+          <w:szCs w:val="32"/>
+        </w:rPr>
+        <w:t>_1</w:t>
+      </w:r>
+      <w:r>
+        <w:rPr>
+          <w:rFonts w:ascii="TH Sarabun New" w:hAnsi="TH Sarabun New" w:cs="TH Sarabun New"/>
+          <w:sz w:val="32"/>
+          <w:szCs w:val="32"/>
+        </w:rPr>
+        <w:t>}}</w:t>
       </w:r>
     </w:p>
     <w:p>
@@ -7423,7 +8869,25 @@
           <w:sz w:val="32"/>
           <w:szCs w:val="32"/>
         </w:rPr>
-        <w:t>{{prof_not_used_book}}</w:t>
+        <w:lastRenderedPageBreak/>
+        <w:t>{{prof_</w:t>
+      </w:r>
+      <w:r>
+        <w:rPr>
+          <w:rFonts w:ascii="TH Sarabun New" w:hAnsi="TH Sarabun New" w:cs="TH Sarabun New"/>
+          <w:sz w:val="32"/>
+          <w:szCs w:val="32"/>
+        </w:rPr>
+        <w:t>not_used_book_1</w:t>
+      </w:r>
+      <w:proofErr w:type="gramStart"/>
+      <w:r>
+        <w:rPr>
+          <w:rFonts w:ascii="TH Sarabun New" w:hAnsi="TH Sarabun New" w:cs="TH Sarabun New"/>
+          <w:sz w:val="32"/>
+          <w:szCs w:val="32"/>
+        </w:rPr>
+        <w:t>}}</w:t>
       </w:r>
       <w:r>
         <w:rPr>
@@ -7434,24 +8898,43 @@
         </w:rPr>
         <w:t xml:space="preserve">  ไม่เคยใช้</w:t>
       </w:r>
+      <w:proofErr w:type="gramEnd"/>
     </w:p>
     <w:p>
       <w:pPr>
         <w:spacing w:after="0" w:line="240" w:lineRule="auto"/>
         <w:ind w:left="1755" w:firstLine="720"/>
         <w:rPr>
-          <w:rFonts w:ascii="TH Sarabun New" w:hAnsi="TH Sarabun New" w:cs="TH Sarabun New"/>
-          <w:sz w:val="32"/>
-          <w:szCs w:val="32"/>
-        </w:rPr>
-      </w:pPr>
-      <w:r>
-        <w:rPr>
-          <w:rFonts w:ascii="TH Sarabun New" w:hAnsi="TH Sarabun New" w:cs="TH Sarabun New"/>
-          <w:sz w:val="32"/>
-          <w:szCs w:val="32"/>
-        </w:rPr>
-        <w:t>{{prof_is_used_book}}</w:t>
+          <w:rFonts w:ascii="TH Sarabun New" w:hAnsi="TH Sarabun New" w:cs="TH Sarabun New" w:hint="cs"/>
+          <w:sz w:val="32"/>
+          <w:szCs w:val="32"/>
+          <w:cs/>
+        </w:rPr>
+      </w:pPr>
+      <w:r>
+        <w:rPr>
+          <w:rFonts w:ascii="TH Sarabun New" w:hAnsi="TH Sarabun New" w:cs="TH Sarabun New"/>
+          <w:sz w:val="32"/>
+          <w:szCs w:val="32"/>
+        </w:rPr>
+        <w:t>{{prof_</w:t>
+      </w:r>
+      <w:r>
+        <w:rPr>
+          <w:rFonts w:ascii="TH Sarabun New" w:hAnsi="TH Sarabun New" w:cs="TH Sarabun New"/>
+          <w:sz w:val="32"/>
+          <w:szCs w:val="32"/>
+        </w:rPr>
+        <w:t>is_used_book_1</w:t>
+      </w:r>
+      <w:proofErr w:type="gramStart"/>
+      <w:r>
+        <w:rPr>
+          <w:rFonts w:ascii="TH Sarabun New" w:hAnsi="TH Sarabun New" w:cs="TH Sarabun New"/>
+          <w:sz w:val="32"/>
+          <w:szCs w:val="32"/>
+        </w:rPr>
+        <w:t>}}</w:t>
       </w:r>
       <w:r>
         <w:rPr>
@@ -7471,6 +8954,7 @@
         </w:rPr>
         <w:t>เคยใช้</w:t>
       </w:r>
+      <w:proofErr w:type="gramEnd"/>
       <w:r>
         <w:rPr>
           <w:rFonts w:ascii="TH Sarabun New" w:hAnsi="TH Sarabun New" w:cs="TH Sarabun New"/>
@@ -7505,7 +8989,17 @@
           <w:szCs w:val="32"/>
           <w:cs/>
         </w:rPr>
-        <w:t>พ.ศ</w:t>
+        <w:t>พ.</w:t>
+      </w:r>
+      <w:proofErr w:type="gramStart"/>
+      <w:r>
+        <w:rPr>
+          <w:rFonts w:ascii="TH Sarabun New" w:hAnsi="TH Sarabun New" w:cs="TH Sarabun New"/>
+          <w:sz w:val="32"/>
+          <w:szCs w:val="32"/>
+          <w:cs/>
+        </w:rPr>
+        <w:t>ศ</w:t>
       </w:r>
       <w:r>
         <w:rPr>
@@ -7522,7 +9016,32 @@
           <w:sz w:val="32"/>
           <w:szCs w:val="32"/>
         </w:rPr>
-        <w:t>{{prof_used_book_year}}</w:t>
+        <w:t>{{</w:t>
+      </w:r>
+      <w:proofErr w:type="gramEnd"/>
+      <w:r>
+        <w:rPr>
+          <w:rFonts w:ascii="TH Sarabun New" w:hAnsi="TH Sarabun New" w:cs="TH Sarabun New"/>
+          <w:sz w:val="32"/>
+          <w:szCs w:val="32"/>
+        </w:rPr>
+        <w:t>prof_</w:t>
+      </w:r>
+      <w:r>
+        <w:rPr>
+          <w:rFonts w:ascii="TH Sarabun New" w:hAnsi="TH Sarabun New" w:cs="TH Sarabun New"/>
+          <w:sz w:val="32"/>
+          <w:szCs w:val="32"/>
+        </w:rPr>
+        <w:t>used_book_year_1</w:t>
+      </w:r>
+      <w:r>
+        <w:rPr>
+          <w:rFonts w:ascii="TH Sarabun New" w:hAnsi="TH Sarabun New" w:cs="TH Sarabun New"/>
+          <w:sz w:val="32"/>
+          <w:szCs w:val="32"/>
+        </w:rPr>
+        <w:t>}}</w:t>
       </w:r>
       <w:r>
         <w:rPr>
@@ -7548,7 +9067,23 @@
           <w:sz w:val="32"/>
           <w:szCs w:val="32"/>
         </w:rPr>
-        <w:t>{{prof_used_book_level}}</w:t>
+        <w:t>{{prof_</w:t>
+      </w:r>
+      <w:r>
+        <w:rPr>
+          <w:rFonts w:ascii="TH Sarabun New" w:hAnsi="TH Sarabun New" w:cs="TH Sarabun New"/>
+          <w:sz w:val="32"/>
+          <w:szCs w:val="32"/>
+        </w:rPr>
+        <w:t>used_book_level_1</w:t>
+      </w:r>
+      <w:r>
+        <w:rPr>
+          <w:rFonts w:ascii="TH Sarabun New" w:hAnsi="TH Sarabun New" w:cs="TH Sarabun New"/>
+          <w:sz w:val="32"/>
+          <w:szCs w:val="32"/>
+        </w:rPr>
+        <w:t>}}</w:t>
       </w:r>
       <w:r>
         <w:rPr>
@@ -7585,14 +9120,6 @@
           <w:cs/>
         </w:rPr>
         <w:t>)</w:t>
-      </w:r>
-      <w:r>
-        <w:rPr>
-          <w:rFonts w:ascii="TH Sarabun New" w:hAnsi="TH Sarabun New" w:cs="TH Sarabun New"/>
-          <w:sz w:val="32"/>
-          <w:szCs w:val="32"/>
-        </w:rPr>
-        <w:t>{{/prof_book_working_list}}</w:t>
       </w:r>
     </w:p>
     <w:p>
@@ -7698,7 +9225,32 @@
           <w:sz w:val="32"/>
           <w:szCs w:val="32"/>
         </w:rPr>
-        <w:t>{{?prof_method3_research_list}}{{prof_method3_research_no}}</w:t>
+        <w:t>{{prof_method3_research_no</w:t>
+      </w:r>
+      <w:r>
+        <w:rPr>
+          <w:rFonts w:ascii="TH Sarabun New" w:hAnsi="TH Sarabun New" w:cs="TH Sarabun New"/>
+          <w:sz w:val="32"/>
+          <w:szCs w:val="32"/>
+        </w:rPr>
+        <w:t>_</w:t>
+      </w:r>
+      <w:proofErr w:type="gramStart"/>
+      <w:r>
+        <w:rPr>
+          <w:rFonts w:ascii="TH Sarabun New" w:hAnsi="TH Sarabun New" w:cs="TH Sarabun New"/>
+          <w:sz w:val="32"/>
+          <w:szCs w:val="32"/>
+        </w:rPr>
+        <w:t>1</w:t>
+      </w:r>
+      <w:r>
+        <w:rPr>
+          <w:rFonts w:ascii="TH Sarabun New" w:hAnsi="TH Sarabun New" w:cs="TH Sarabun New"/>
+          <w:sz w:val="32"/>
+          <w:szCs w:val="32"/>
+        </w:rPr>
+        <w:t>}}</w:t>
       </w:r>
       <w:r>
         <w:rPr>
@@ -7724,7 +9276,32 @@
           <w:sz w:val="32"/>
           <w:szCs w:val="32"/>
         </w:rPr>
-        <w:t>{{prof_method3_research}}</w:t>
+        <w:t>{{</w:t>
+      </w:r>
+      <w:proofErr w:type="gramEnd"/>
+      <w:r>
+        <w:rPr>
+          <w:rFonts w:ascii="TH Sarabun New" w:hAnsi="TH Sarabun New" w:cs="TH Sarabun New"/>
+          <w:sz w:val="32"/>
+          <w:szCs w:val="32"/>
+        </w:rPr>
+        <w:t>prof_method3_research</w:t>
+      </w:r>
+      <w:r>
+        <w:rPr>
+          <w:rFonts w:ascii="TH Sarabun New" w:hAnsi="TH Sarabun New" w:cs="TH Sarabun New"/>
+          <w:sz w:val="32"/>
+          <w:szCs w:val="32"/>
+        </w:rPr>
+        <w:t>_1</w:t>
+      </w:r>
+      <w:r>
+        <w:rPr>
+          <w:rFonts w:ascii="TH Sarabun New" w:hAnsi="TH Sarabun New" w:cs="TH Sarabun New"/>
+          <w:sz w:val="32"/>
+          <w:szCs w:val="32"/>
+        </w:rPr>
+        <w:t>}}</w:t>
       </w:r>
       <w:r>
         <w:rPr>
@@ -7833,7 +9410,16 @@
           <w:sz w:val="32"/>
           <w:szCs w:val="32"/>
         </w:rPr>
-        <w:t>{{prof_m3_q1}}</w:t>
+        <w:t>{{prof_m3_q1</w:t>
+      </w:r>
+      <w:proofErr w:type="gramStart"/>
+      <w:r>
+        <w:rPr>
+          <w:rFonts w:ascii="TH Sarabun New" w:hAnsi="TH Sarabun New" w:cs="TH Sarabun New"/>
+          <w:sz w:val="32"/>
+          <w:szCs w:val="32"/>
+        </w:rPr>
+        <w:t>}}</w:t>
       </w:r>
       <w:r>
         <w:rPr>
@@ -7861,6 +9447,7 @@
         </w:rPr>
         <w:t>Quartile</w:t>
       </w:r>
+      <w:proofErr w:type="gramEnd"/>
       <w:r>
         <w:rPr>
           <w:rFonts w:ascii="TH Sarabun New" w:hAnsi="TH Sarabun New" w:cs="TH Sarabun New"/>
@@ -7870,6 +9457,7 @@
         </w:rPr>
         <w:t xml:space="preserve">1 </w:t>
       </w:r>
+      <w:proofErr w:type="gramStart"/>
       <w:r>
         <w:rPr>
           <w:rFonts w:ascii="TH Sarabun New" w:hAnsi="TH Sarabun New" w:cs="TH Sarabun New"/>
@@ -7886,7 +9474,16 @@
           <w:sz w:val="32"/>
           <w:szCs w:val="32"/>
         </w:rPr>
-        <w:t>{{prof_m3_q2}}</w:t>
+        <w:t>{</w:t>
+      </w:r>
+      <w:proofErr w:type="gramEnd"/>
+      <w:r>
+        <w:rPr>
+          <w:rFonts w:ascii="TH Sarabun New" w:hAnsi="TH Sarabun New" w:cs="TH Sarabun New"/>
+          <w:sz w:val="32"/>
+          <w:szCs w:val="32"/>
+        </w:rPr>
+        <w:t>{prof_m3_q2}}</w:t>
       </w:r>
       <w:r>
         <w:rPr>
@@ -8068,14 +9665,6 @@
           <w:szCs w:val="32"/>
         </w:rPr>
         <w:t>corresponding author)</w:t>
-      </w:r>
-      <w:r>
-        <w:rPr>
-          <w:rFonts w:ascii="TH Sarabun New" w:hAnsi="TH Sarabun New" w:cs="TH Sarabun New"/>
-          <w:sz w:val="32"/>
-          <w:szCs w:val="32"/>
-        </w:rPr>
-        <w:t>{{/prof_method3_research_list}}</w:t>
       </w:r>
     </w:p>
     <w:p>
@@ -8107,7 +9696,6 @@
           <w:szCs w:val="32"/>
           <w:cs/>
         </w:rPr>
-        <w:lastRenderedPageBreak/>
         <w:t>๔.๓.๔.๒ งานวิจัยที่ได้รับการอ้างอิงจากฐานข้อมูล</w:t>
       </w:r>
       <w:r>
@@ -8442,7 +10030,16 @@
           <w:sz w:val="32"/>
           <w:szCs w:val="32"/>
         </w:rPr>
-        <w:t>{{?prof_pi_project_list}}{{prof_pi_project_no}}</w:t>
+        <w:t>{{prof_pi_project_</w:t>
+      </w:r>
+      <w:proofErr w:type="gramStart"/>
+      <w:r>
+        <w:rPr>
+          <w:rFonts w:ascii="TH Sarabun New" w:hAnsi="TH Sarabun New" w:cs="TH Sarabun New"/>
+          <w:sz w:val="32"/>
+          <w:szCs w:val="32"/>
+        </w:rPr>
+        <w:t>no}}</w:t>
       </w:r>
       <w:r>
         <w:rPr>
@@ -8468,7 +10065,16 @@
           <w:sz w:val="32"/>
           <w:szCs w:val="32"/>
         </w:rPr>
-        <w:t>{{prof_pi_project}}</w:t>
+        <w:t>{{</w:t>
+      </w:r>
+      <w:proofErr w:type="gramEnd"/>
+      <w:r>
+        <w:rPr>
+          <w:rFonts w:ascii="TH Sarabun New" w:hAnsi="TH Sarabun New" w:cs="TH Sarabun New"/>
+          <w:sz w:val="32"/>
+          <w:szCs w:val="32"/>
+        </w:rPr>
+        <w:t>prof_pi_project}}</w:t>
       </w:r>
     </w:p>
     <w:p>
@@ -8506,14 +10112,6 @@
           <w:szCs w:val="32"/>
         </w:rPr>
         <w:t>{{prof_pi_source}}</w:t>
-      </w:r>
-      <w:r>
-        <w:rPr>
-          <w:rFonts w:ascii="TH Sarabun New" w:hAnsi="TH Sarabun New" w:cs="TH Sarabun New"/>
-          <w:sz w:val="32"/>
-          <w:szCs w:val="32"/>
-        </w:rPr>
-        <w:t>{{/prof_pi_project_list}}</w:t>
       </w:r>
     </w:p>
     <w:p>
@@ -8644,6 +10242,7 @@
           <w:szCs w:val="32"/>
           <w:cs/>
         </w:rPr>
+        <w:lastRenderedPageBreak/>
         <w:t>ในกรณีที่มีผู้เขียนร่วมหลายคนจะต้องระบุบทบาทหน้าที่ของผู้ร่วมงานทุกคนว่าทำในส่วนไหน อย่างไร และลงนามรับรองโดยผู้ขอผู้ประพันธ์อันดับแรก (</w:t>
       </w:r>
       <w:r>
@@ -9782,16 +11381,16 @@
     <w:lsdException w:name="Unresolved Mention" w:semiHidden="1" w:unhideWhenUsed="1"/>
     <w:lsdException w:name="Smart Link" w:semiHidden="1" w:unhideWhenUsed="1"/>
   </w:latentStyles>
-  <w:style w:type="paragraph" w:default="1" w:styleId="Normal">
+  <w:style w:type="paragraph" w:default="1" w:styleId="a">
     <w:name w:val="Normal"/>
     <w:qFormat/>
     <w:rsid w:val="00EA52CC"/>
   </w:style>
-  <w:style w:type="paragraph" w:styleId="Heading1">
+  <w:style w:type="paragraph" w:styleId="1">
     <w:name w:val="heading 1"/>
-    <w:basedOn w:val="Normal"/>
-    <w:next w:val="Normal"/>
-    <w:link w:val="Heading1Char"/>
+    <w:basedOn w:val="a"/>
+    <w:next w:val="a"/>
+    <w:link w:val="10"/>
     <w:qFormat/>
     <w:rsid w:val="009A19D5"/>
     <w:pPr>
@@ -9807,13 +11406,13 @@
       <w:szCs w:val="32"/>
     </w:rPr>
   </w:style>
-  <w:style w:type="character" w:default="1" w:styleId="DefaultParagraphFont">
+  <w:style w:type="character" w:default="1" w:styleId="a0">
     <w:name w:val="Default Paragraph Font"/>
     <w:uiPriority w:val="1"/>
     <w:semiHidden/>
     <w:unhideWhenUsed/>
   </w:style>
-  <w:style w:type="table" w:default="1" w:styleId="TableNormal">
+  <w:style w:type="table" w:default="1" w:styleId="a1">
     <w:name w:val="Normal Table"/>
     <w:uiPriority w:val="99"/>
     <w:semiHidden/>
@@ -9828,15 +11427,15 @@
       </w:tblCellMar>
     </w:tblPr>
   </w:style>
-  <w:style w:type="numbering" w:default="1" w:styleId="NoList">
+  <w:style w:type="numbering" w:default="1" w:styleId="a2">
     <w:name w:val="No List"/>
     <w:uiPriority w:val="99"/>
     <w:semiHidden/>
     <w:unhideWhenUsed/>
   </w:style>
-  <w:style w:type="paragraph" w:styleId="ListParagraph">
+  <w:style w:type="paragraph" w:styleId="a3">
     <w:name w:val="List Paragraph"/>
-    <w:basedOn w:val="Normal"/>
+    <w:basedOn w:val="a"/>
     <w:uiPriority w:val="34"/>
     <w:qFormat/>
     <w:rsid w:val="00EA52CC"/>
@@ -9845,10 +11444,10 @@
       <w:contextualSpacing/>
     </w:pPr>
   </w:style>
-  <w:style w:type="paragraph" w:styleId="Header">
+  <w:style w:type="paragraph" w:styleId="a4">
     <w:name w:val="header"/>
-    <w:basedOn w:val="Normal"/>
-    <w:link w:val="HeaderChar"/>
+    <w:basedOn w:val="a"/>
+    <w:link w:val="a5"/>
     <w:uiPriority w:val="99"/>
     <w:unhideWhenUsed/>
     <w:rsid w:val="00EA52CC"/>
@@ -9860,17 +11459,17 @@
       <w:spacing w:after="0" w:line="240" w:lineRule="auto"/>
     </w:pPr>
   </w:style>
-  <w:style w:type="character" w:customStyle="1" w:styleId="HeaderChar">
-    <w:name w:val="Header Char"/>
-    <w:basedOn w:val="DefaultParagraphFont"/>
-    <w:link w:val="Header"/>
+  <w:style w:type="character" w:customStyle="1" w:styleId="a5">
+    <w:name w:val="หัวกระดาษ อักขระ"/>
+    <w:basedOn w:val="a0"/>
+    <w:link w:val="a4"/>
     <w:uiPriority w:val="99"/>
     <w:rsid w:val="00EA52CC"/>
   </w:style>
-  <w:style w:type="paragraph" w:styleId="Footer">
+  <w:style w:type="paragraph" w:styleId="a6">
     <w:name w:val="footer"/>
-    <w:basedOn w:val="Normal"/>
-    <w:link w:val="FooterChar"/>
+    <w:basedOn w:val="a"/>
+    <w:link w:val="a7"/>
     <w:uiPriority w:val="99"/>
     <w:unhideWhenUsed/>
     <w:rsid w:val="00EA52CC"/>
@@ -9882,16 +11481,16 @@
       <w:spacing w:after="0" w:line="240" w:lineRule="auto"/>
     </w:pPr>
   </w:style>
-  <w:style w:type="character" w:customStyle="1" w:styleId="FooterChar">
-    <w:name w:val="Footer Char"/>
-    <w:basedOn w:val="DefaultParagraphFont"/>
-    <w:link w:val="Footer"/>
+  <w:style w:type="character" w:customStyle="1" w:styleId="a7">
+    <w:name w:val="ท้ายกระดาษ อักขระ"/>
+    <w:basedOn w:val="a0"/>
+    <w:link w:val="a6"/>
     <w:uiPriority w:val="99"/>
     <w:rsid w:val="00EA52CC"/>
   </w:style>
-  <w:style w:type="table" w:styleId="TableGrid">
+  <w:style w:type="table" w:styleId="a8">
     <w:name w:val="Table Grid"/>
-    <w:basedOn w:val="TableNormal"/>
+    <w:basedOn w:val="a1"/>
     <w:uiPriority w:val="39"/>
     <w:rsid w:val="00CD3705"/>
     <w:pPr>
@@ -9908,10 +11507,10 @@
       </w:tblBorders>
     </w:tblPr>
   </w:style>
-  <w:style w:type="character" w:customStyle="1" w:styleId="Heading1Char">
-    <w:name w:val="Heading 1 Char"/>
-    <w:basedOn w:val="DefaultParagraphFont"/>
-    <w:link w:val="Heading1"/>
+  <w:style w:type="character" w:customStyle="1" w:styleId="10">
+    <w:name w:val="หัวเรื่อง 1 อักขระ"/>
+    <w:basedOn w:val="a0"/>
+    <w:link w:val="1"/>
     <w:rsid w:val="009A19D5"/>
     <w:rPr>
       <w:rFonts w:ascii="Angsana New" w:eastAsia="Cordia New" w:hAnsi="Angsana New" w:cs="Angsana New"/>

</xml_diff>

<commit_message>
Handle method3 fields & expand dynamic rows
Add mapping for Method 3 fields and aliases so quartile radios (Q1/Q2), first/corresponding checkboxes, and PI fields are converted into the expected placeholder markers. Fix token-scanning loop to handle incomplete token fragments (trailing '{') across XML runs. Implement dynamic row expansion: clone paragraph-based work rows (expandParagraphRows) and table-based teaching rows based on numbered placeholders so multiple entries are rendered from templates. Update form inputs to use radio buttons for quartile selection and update DOCX templates/uploads; remove temporary ~ file.
</commit_message>
<xml_diff>
--- a/HRCP-KKU-Academic/src/main/resources/templates/docx/Phase2/p2doc_1.docx
+++ b/HRCP-KKU-Academic/src/main/resources/templates/docx/Phase2/p2doc_1.docx
@@ -2640,10 +2640,10 @@
         <w:tblLook w:val="04A0" w:firstRow="1" w:lastRow="0" w:firstColumn="1" w:lastColumn="0" w:noHBand="0" w:noVBand="1"/>
       </w:tblPr>
       <w:tblGrid>
-        <w:gridCol w:w="1892"/>
-        <w:gridCol w:w="2118"/>
-        <w:gridCol w:w="2984"/>
-        <w:gridCol w:w="2366"/>
+        <w:gridCol w:w="1946"/>
+        <w:gridCol w:w="2145"/>
+        <w:gridCol w:w="2957"/>
+        <w:gridCol w:w="2312"/>
       </w:tblGrid>
       <w:tr>
         <w:tc>
@@ -2776,7 +2776,23 @@
                 <w:sz w:val="32"/>
                 <w:szCs w:val="32"/>
               </w:rPr>
-              <w:t>level}}</w:t>
+              <w:t>level</w:t>
+            </w:r>
+            <w:r>
+              <w:rPr>
+                <w:rFonts w:ascii="TH Sarabun New" w:hAnsi="TH Sarabun New" w:cs="TH Sarabun New"/>
+                <w:sz w:val="32"/>
+                <w:szCs w:val="32"/>
+              </w:rPr>
+              <w:t>_1</w:t>
+            </w:r>
+            <w:r>
+              <w:rPr>
+                <w:rFonts w:ascii="TH Sarabun New" w:hAnsi="TH Sarabun New" w:cs="TH Sarabun New"/>
+                <w:sz w:val="32"/>
+                <w:szCs w:val="32"/>
+              </w:rPr>
+              <w:t>}}</w:t>
             </w:r>
           </w:p>
         </w:tc>
@@ -2814,7 +2830,23 @@
                 <w:sz w:val="32"/>
                 <w:szCs w:val="32"/>
               </w:rPr>
-              <w:t>subject}}</w:t>
+              <w:t>subject</w:t>
+            </w:r>
+            <w:r>
+              <w:rPr>
+                <w:rFonts w:ascii="TH Sarabun New" w:hAnsi="TH Sarabun New" w:cs="TH Sarabun New"/>
+                <w:sz w:val="32"/>
+                <w:szCs w:val="32"/>
+              </w:rPr>
+              <w:t>_1</w:t>
+            </w:r>
+            <w:r>
+              <w:rPr>
+                <w:rFonts w:ascii="TH Sarabun New" w:hAnsi="TH Sarabun New" w:cs="TH Sarabun New"/>
+                <w:sz w:val="32"/>
+                <w:szCs w:val="32"/>
+              </w:rPr>
+              <w:t>}}</w:t>
             </w:r>
           </w:p>
         </w:tc>
@@ -2852,7 +2884,23 @@
                 <w:sz w:val="32"/>
                 <w:szCs w:val="32"/>
               </w:rPr>
-              <w:t>hours_per_week}}</w:t>
+              <w:t>hours_per_week</w:t>
+            </w:r>
+            <w:r>
+              <w:rPr>
+                <w:rFonts w:ascii="TH Sarabun New" w:hAnsi="TH Sarabun New" w:cs="TH Sarabun New"/>
+                <w:sz w:val="32"/>
+                <w:szCs w:val="32"/>
+              </w:rPr>
+              <w:t>_1</w:t>
+            </w:r>
+            <w:r>
+              <w:rPr>
+                <w:rFonts w:ascii="TH Sarabun New" w:hAnsi="TH Sarabun New" w:cs="TH Sarabun New"/>
+                <w:sz w:val="32"/>
+                <w:szCs w:val="32"/>
+              </w:rPr>
+              <w:t>}}</w:t>
             </w:r>
           </w:p>
         </w:tc>
@@ -2890,7 +2938,23 @@
                 <w:sz w:val="32"/>
                 <w:szCs w:val="32"/>
               </w:rPr>
-              <w:t>semester}}</w:t>
+              <w:t>semester</w:t>
+            </w:r>
+            <w:r>
+              <w:rPr>
+                <w:rFonts w:ascii="TH Sarabun New" w:hAnsi="TH Sarabun New" w:cs="TH Sarabun New"/>
+                <w:sz w:val="32"/>
+                <w:szCs w:val="32"/>
+              </w:rPr>
+              <w:t>_1</w:t>
+            </w:r>
+            <w:r>
+              <w:rPr>
+                <w:rFonts w:ascii="TH Sarabun New" w:hAnsi="TH Sarabun New" w:cs="TH Sarabun New"/>
+                <w:sz w:val="32"/>
+                <w:szCs w:val="32"/>
+              </w:rPr>
+              <w:t>}}</w:t>
             </w:r>
           </w:p>
         </w:tc>
@@ -3098,7 +3162,6 @@
           <w:sz w:val="32"/>
           <w:szCs w:val="32"/>
         </w:rPr>
-        <w:lastRenderedPageBreak/>
         <w:t>{{other}}</w:t>
       </w:r>
     </w:p>
@@ -3360,7 +3423,6 @@
         </w:rPr>
         <w:t>_1</w:t>
       </w:r>
-      <w:proofErr w:type="gramStart"/>
       <w:r>
         <w:rPr>
           <w:rFonts w:ascii="TH Sarabun New" w:hAnsi="TH Sarabun New" w:cs="TH Sarabun New"/>
@@ -3378,7 +3440,6 @@
         </w:rPr>
         <w:t xml:space="preserve">  ไม่เคยใช้</w:t>
       </w:r>
-      <w:proofErr w:type="gramEnd"/>
     </w:p>
     <w:p>
       <w:pPr>
@@ -3439,7 +3500,6 @@
         </w:rPr>
         <w:t>_1</w:t>
       </w:r>
-      <w:proofErr w:type="gramStart"/>
       <w:r>
         <w:rPr>
           <w:rFonts w:ascii="TH Sarabun New" w:hAnsi="TH Sarabun New" w:cs="TH Sarabun New"/>
@@ -3466,7 +3526,6 @@
         </w:rPr>
         <w:t>เคยใช้</w:t>
       </w:r>
-      <w:proofErr w:type="gramEnd"/>
       <w:r>
         <w:rPr>
           <w:rFonts w:ascii="TH Sarabun New" w:hAnsi="TH Sarabun New" w:cs="TH Sarabun New"/>
@@ -3906,7 +3965,6 @@
         </w:rPr>
         <w:t>_1</w:t>
       </w:r>
-      <w:proofErr w:type="gramStart"/>
       <w:r>
         <w:rPr>
           <w:rFonts w:ascii="TH Sarabun New" w:hAnsi="TH Sarabun New" w:cs="TH Sarabun New"/>
@@ -3924,7 +3982,6 @@
         </w:rPr>
         <w:t xml:space="preserve">  ไม่เคยใช้</w:t>
       </w:r>
-      <w:proofErr w:type="gramEnd"/>
     </w:p>
     <w:p>
       <w:pPr>
@@ -3985,7 +4042,6 @@
         </w:rPr>
         <w:t>_1</w:t>
       </w:r>
-      <w:proofErr w:type="gramStart"/>
       <w:r>
         <w:rPr>
           <w:rFonts w:ascii="TH Sarabun New" w:hAnsi="TH Sarabun New" w:cs="TH Sarabun New"/>
@@ -4012,7 +4068,6 @@
         </w:rPr>
         <w:t>เคยใช้</w:t>
       </w:r>
-      <w:proofErr w:type="gramEnd"/>
       <w:r>
         <w:rPr>
           <w:rFonts w:ascii="TH Sarabun New" w:hAnsi="TH Sarabun New" w:cs="TH Sarabun New"/>
@@ -4047,17 +4102,7 @@
           <w:szCs w:val="32"/>
           <w:cs/>
         </w:rPr>
-        <w:t>พ.</w:t>
-      </w:r>
-      <w:proofErr w:type="gramStart"/>
-      <w:r>
-        <w:rPr>
-          <w:rFonts w:ascii="TH Sarabun New" w:hAnsi="TH Sarabun New" w:cs="TH Sarabun New"/>
-          <w:sz w:val="32"/>
-          <w:szCs w:val="32"/>
-          <w:cs/>
-        </w:rPr>
-        <w:t>ศ</w:t>
+        <w:t>พ.ศ</w:t>
       </w:r>
       <w:r>
         <w:rPr>
@@ -4076,7 +4121,6 @@
         </w:rPr>
         <w:t>{{</w:t>
       </w:r>
-      <w:proofErr w:type="gramEnd"/>
       <w:r>
         <w:rPr>
           <w:rFonts w:ascii="TH Sarabun New" w:hAnsi="TH Sarabun New" w:cs="TH Sarabun New"/>
@@ -4451,7 +4495,6 @@
         </w:rPr>
         <w:t>not_used_book_1</w:t>
       </w:r>
-      <w:proofErr w:type="gramStart"/>
       <w:r>
         <w:rPr>
           <w:rFonts w:ascii="TH Sarabun New" w:hAnsi="TH Sarabun New" w:cs="TH Sarabun New"/>
@@ -4469,7 +4512,6 @@
         </w:rPr>
         <w:t xml:space="preserve">  ไม่เคยใช้</w:t>
       </w:r>
-      <w:proofErr w:type="gramEnd"/>
     </w:p>
     <w:p>
       <w:pPr>
@@ -4515,7 +4557,6 @@
         </w:rPr>
         <w:t>is_used_book_1</w:t>
       </w:r>
-      <w:proofErr w:type="gramStart"/>
       <w:r>
         <w:rPr>
           <w:rFonts w:ascii="TH Sarabun New" w:hAnsi="TH Sarabun New" w:cs="TH Sarabun New"/>
@@ -4542,7 +4583,6 @@
         </w:rPr>
         <w:t>เคยใช้</w:t>
       </w:r>
-      <w:proofErr w:type="gramEnd"/>
       <w:r>
         <w:rPr>
           <w:rFonts w:ascii="TH Sarabun New" w:hAnsi="TH Sarabun New" w:cs="TH Sarabun New"/>
@@ -5152,7 +5192,6 @@
         </w:rPr>
         <w:t>not_used_research_1</w:t>
       </w:r>
-      <w:proofErr w:type="gramStart"/>
       <w:r>
         <w:rPr>
           <w:rFonts w:ascii="TH Sarabun New" w:hAnsi="TH Sarabun New" w:cs="TH Sarabun New"/>
@@ -5170,7 +5209,6 @@
         </w:rPr>
         <w:t xml:space="preserve">  ไม่เคยใช้</w:t>
       </w:r>
-      <w:proofErr w:type="gramEnd"/>
     </w:p>
     <w:p>
       <w:pPr>
@@ -5215,7 +5253,6 @@
         </w:rPr>
         <w:t>is_used_research_1</w:t>
       </w:r>
-      <w:proofErr w:type="gramStart"/>
       <w:r>
         <w:rPr>
           <w:rFonts w:ascii="TH Sarabun New" w:hAnsi="TH Sarabun New" w:cs="TH Sarabun New"/>
@@ -5242,7 +5279,6 @@
         </w:rPr>
         <w:t>เคยใช้</w:t>
       </w:r>
-      <w:proofErr w:type="gramEnd"/>
       <w:r>
         <w:rPr>
           <w:rFonts w:ascii="TH Sarabun New" w:hAnsi="TH Sarabun New" w:cs="TH Sarabun New"/>
@@ -5277,17 +5313,7 @@
           <w:szCs w:val="32"/>
           <w:cs/>
         </w:rPr>
-        <w:t>พ.</w:t>
-      </w:r>
-      <w:proofErr w:type="gramStart"/>
-      <w:r>
-        <w:rPr>
-          <w:rFonts w:ascii="TH Sarabun New" w:hAnsi="TH Sarabun New" w:cs="TH Sarabun New"/>
-          <w:sz w:val="32"/>
-          <w:szCs w:val="32"/>
-          <w:cs/>
-        </w:rPr>
-        <w:t>ศ</w:t>
+        <w:t>พ.ศ</w:t>
       </w:r>
       <w:r>
         <w:rPr>
@@ -5306,7 +5332,6 @@
         </w:rPr>
         <w:t xml:space="preserve"> {{</w:t>
       </w:r>
-      <w:proofErr w:type="gramEnd"/>
       <w:r>
         <w:rPr>
           <w:rFonts w:ascii="TH Sarabun New" w:hAnsi="TH Sarabun New" w:cs="TH Sarabun New"/>
@@ -5704,7 +5729,6 @@
         </w:rPr>
         <w:t>_1</w:t>
       </w:r>
-      <w:proofErr w:type="gramStart"/>
       <w:r>
         <w:rPr>
           <w:rFonts w:ascii="TH Sarabun New" w:hAnsi="TH Sarabun New" w:cs="TH Sarabun New"/>
@@ -5722,7 +5746,6 @@
         </w:rPr>
         <w:t xml:space="preserve">  ไม่เคยใช้</w:t>
       </w:r>
-      <w:proofErr w:type="gramEnd"/>
     </w:p>
     <w:p>
       <w:pPr>
@@ -5782,7 +5805,6 @@
         </w:rPr>
         <w:t>_1</w:t>
       </w:r>
-      <w:proofErr w:type="gramStart"/>
       <w:r>
         <w:rPr>
           <w:rFonts w:ascii="TH Sarabun New" w:hAnsi="TH Sarabun New" w:cs="TH Sarabun New"/>
@@ -5809,7 +5831,6 @@
         </w:rPr>
         <w:t>เคยใช้</w:t>
       </w:r>
-      <w:proofErr w:type="gramEnd"/>
       <w:r>
         <w:rPr>
           <w:rFonts w:ascii="TH Sarabun New" w:hAnsi="TH Sarabun New" w:cs="TH Sarabun New"/>
@@ -5844,17 +5865,7 @@
           <w:szCs w:val="32"/>
           <w:cs/>
         </w:rPr>
-        <w:t>พ.</w:t>
-      </w:r>
-      <w:proofErr w:type="gramStart"/>
-      <w:r>
-        <w:rPr>
-          <w:rFonts w:ascii="TH Sarabun New" w:hAnsi="TH Sarabun New" w:cs="TH Sarabun New"/>
-          <w:sz w:val="32"/>
-          <w:szCs w:val="32"/>
-          <w:cs/>
-        </w:rPr>
-        <w:t>ศ</w:t>
+        <w:t>พ.ศ</w:t>
       </w:r>
       <w:r>
         <w:rPr>
@@ -5864,7 +5875,6 @@
         </w:rPr>
         <w:t>.{{</w:t>
       </w:r>
-      <w:proofErr w:type="gramEnd"/>
       <w:r>
         <w:rPr>
           <w:rFonts w:ascii="TH Sarabun New" w:hAnsi="TH Sarabun New" w:cs="TH Sarabun New"/>
@@ -6274,7 +6284,6 @@
         </w:rPr>
         <w:t>not_used_book_1</w:t>
       </w:r>
-      <w:proofErr w:type="gramStart"/>
       <w:r>
         <w:rPr>
           <w:rFonts w:ascii="TH Sarabun New" w:hAnsi="TH Sarabun New" w:cs="TH Sarabun New"/>
@@ -6292,7 +6301,6 @@
         </w:rPr>
         <w:t xml:space="preserve">  ไม่เคยใช้</w:t>
       </w:r>
-      <w:proofErr w:type="gramEnd"/>
     </w:p>
     <w:p>
       <w:pPr>
@@ -6337,7 +6345,6 @@
         </w:rPr>
         <w:t>is_used_book_1</w:t>
       </w:r>
-      <w:proofErr w:type="gramStart"/>
       <w:r>
         <w:rPr>
           <w:rFonts w:ascii="TH Sarabun New" w:hAnsi="TH Sarabun New" w:cs="TH Sarabun New"/>
@@ -6364,7 +6371,6 @@
         </w:rPr>
         <w:t>เคยใช้</w:t>
       </w:r>
-      <w:proofErr w:type="gramEnd"/>
       <w:r>
         <w:rPr>
           <w:rFonts w:ascii="TH Sarabun New" w:hAnsi="TH Sarabun New" w:cs="TH Sarabun New"/>
@@ -6399,17 +6405,7 @@
           <w:szCs w:val="32"/>
           <w:cs/>
         </w:rPr>
-        <w:t>พ.</w:t>
-      </w:r>
-      <w:proofErr w:type="gramStart"/>
-      <w:r>
-        <w:rPr>
-          <w:rFonts w:ascii="TH Sarabun New" w:hAnsi="TH Sarabun New" w:cs="TH Sarabun New"/>
-          <w:sz w:val="32"/>
-          <w:szCs w:val="32"/>
-          <w:cs/>
-        </w:rPr>
-        <w:t>ศ</w:t>
+        <w:t>พ.ศ</w:t>
       </w:r>
       <w:r>
         <w:rPr>
@@ -6428,7 +6424,6 @@
         </w:rPr>
         <w:t>{{</w:t>
       </w:r>
-      <w:proofErr w:type="gramEnd"/>
       <w:r>
         <w:rPr>
           <w:rFonts w:ascii="TH Sarabun New" w:hAnsi="TH Sarabun New" w:cs="TH Sarabun New"/>
@@ -6718,16 +6713,7 @@
           <w:sz w:val="32"/>
           <w:szCs w:val="32"/>
         </w:rPr>
-        <w:t>_</w:t>
-      </w:r>
-      <w:proofErr w:type="gramStart"/>
-      <w:r>
-        <w:rPr>
-          <w:rFonts w:ascii="TH Sarabun New" w:hAnsi="TH Sarabun New" w:cs="TH Sarabun New"/>
-          <w:sz w:val="32"/>
-          <w:szCs w:val="32"/>
-        </w:rPr>
-        <w:t>1</w:t>
+        <w:t>_1</w:t>
       </w:r>
       <w:r>
         <w:rPr>
@@ -6763,7 +6749,6 @@
         </w:rPr>
         <w:t>{{</w:t>
       </w:r>
-      <w:proofErr w:type="gramEnd"/>
       <w:r>
         <w:rPr>
           <w:rFonts w:ascii="TH Sarabun New" w:hAnsi="TH Sarabun New" w:cs="TH Sarabun New"/>
@@ -6947,7 +6932,6 @@
         </w:rPr>
         <w:t xml:space="preserve">1 </w:t>
       </w:r>
-      <w:proofErr w:type="gramStart"/>
       <w:r>
         <w:rPr>
           <w:rFonts w:ascii="TH Sarabun New" w:hAnsi="TH Sarabun New" w:cs="TH Sarabun New"/>
@@ -6972,16 +6956,7 @@
           <w:sz w:val="32"/>
           <w:szCs w:val="32"/>
         </w:rPr>
-        <w:t>{</w:t>
-      </w:r>
-      <w:proofErr w:type="gramEnd"/>
-      <w:r>
-        <w:rPr>
-          <w:rFonts w:ascii="TH Sarabun New" w:hAnsi="TH Sarabun New" w:cs="TH Sarabun New"/>
-          <w:sz w:val="32"/>
-          <w:szCs w:val="32"/>
-        </w:rPr>
-        <w:t>{assoc_m3_q2}}</w:t>
+        <w:t>{{assoc_m3_q2}}</w:t>
       </w:r>
       <w:r>
         <w:rPr>
@@ -7512,16 +7487,7 @@
           <w:sz w:val="32"/>
           <w:szCs w:val="32"/>
         </w:rPr>
-        <w:t>{{assoc_pi_project_</w:t>
-      </w:r>
-      <w:proofErr w:type="gramStart"/>
-      <w:r>
-        <w:rPr>
-          <w:rFonts w:ascii="TH Sarabun New" w:hAnsi="TH Sarabun New" w:cs="TH Sarabun New"/>
-          <w:sz w:val="32"/>
-          <w:szCs w:val="32"/>
-        </w:rPr>
-        <w:t>no}}</w:t>
+        <w:t>{{assoc_pi_project_no}}</w:t>
       </w:r>
       <w:r>
         <w:rPr>
@@ -7547,16 +7513,7 @@
           <w:sz w:val="32"/>
           <w:szCs w:val="32"/>
         </w:rPr>
-        <w:t>{{</w:t>
-      </w:r>
-      <w:proofErr w:type="gramEnd"/>
-      <w:r>
-        <w:rPr>
-          <w:rFonts w:ascii="TH Sarabun New" w:hAnsi="TH Sarabun New" w:cs="TH Sarabun New"/>
-          <w:sz w:val="32"/>
-          <w:szCs w:val="32"/>
-        </w:rPr>
-        <w:t>assoc_pi_project}}</w:t>
+        <w:t>{{assoc_pi_project}}</w:t>
       </w:r>
     </w:p>
     <w:p>
@@ -7990,7 +7947,6 @@
         </w:rPr>
         <w:t>not_used_research_1</w:t>
       </w:r>
-      <w:proofErr w:type="gramStart"/>
       <w:r>
         <w:rPr>
           <w:rFonts w:ascii="TH Sarabun New" w:hAnsi="TH Sarabun New" w:cs="TH Sarabun New"/>
@@ -8008,7 +7964,6 @@
         </w:rPr>
         <w:t xml:space="preserve">  ไม่เคยใช้</w:t>
       </w:r>
-      <w:proofErr w:type="gramEnd"/>
     </w:p>
     <w:p>
       <w:pPr>
@@ -8037,7 +7992,6 @@
         </w:rPr>
         <w:t>is_used_research_1</w:t>
       </w:r>
-      <w:proofErr w:type="gramStart"/>
       <w:r>
         <w:rPr>
           <w:rFonts w:ascii="TH Sarabun New" w:hAnsi="TH Sarabun New" w:cs="TH Sarabun New"/>
@@ -8064,7 +8018,6 @@
         </w:rPr>
         <w:t>เคยใช้</w:t>
       </w:r>
-      <w:proofErr w:type="gramEnd"/>
       <w:r>
         <w:rPr>
           <w:rFonts w:ascii="TH Sarabun New" w:hAnsi="TH Sarabun New" w:cs="TH Sarabun New"/>
@@ -8099,17 +8052,7 @@
           <w:szCs w:val="32"/>
           <w:cs/>
         </w:rPr>
-        <w:t>พ.</w:t>
-      </w:r>
-      <w:proofErr w:type="gramStart"/>
-      <w:r>
-        <w:rPr>
-          <w:rFonts w:ascii="TH Sarabun New" w:hAnsi="TH Sarabun New" w:cs="TH Sarabun New"/>
-          <w:sz w:val="32"/>
-          <w:szCs w:val="32"/>
-          <w:cs/>
-        </w:rPr>
-        <w:t>ศ</w:t>
+        <w:t>พ.ศ</w:t>
       </w:r>
       <w:r>
         <w:rPr>
@@ -8126,16 +8069,7 @@
           <w:sz w:val="32"/>
           <w:szCs w:val="32"/>
         </w:rPr>
-        <w:t>{{</w:t>
-      </w:r>
-      <w:proofErr w:type="gramEnd"/>
-      <w:r>
-        <w:rPr>
-          <w:rFonts w:ascii="TH Sarabun New" w:hAnsi="TH Sarabun New" w:cs="TH Sarabun New"/>
-          <w:sz w:val="32"/>
-          <w:szCs w:val="32"/>
-        </w:rPr>
-        <w:t>prof_</w:t>
+        <w:t>{{prof_</w:t>
       </w:r>
       <w:r>
         <w:rPr>
@@ -8485,7 +8419,6 @@
         </w:rPr>
         <w:t>_1</w:t>
       </w:r>
-      <w:proofErr w:type="gramStart"/>
       <w:r>
         <w:rPr>
           <w:rFonts w:ascii="TH Sarabun New" w:hAnsi="TH Sarabun New" w:cs="TH Sarabun New"/>
@@ -8503,7 +8436,6 @@
         </w:rPr>
         <w:t xml:space="preserve">  ไม่เคยใช้</w:t>
       </w:r>
-      <w:proofErr w:type="gramEnd"/>
     </w:p>
     <w:p>
       <w:pPr>
@@ -8532,7 +8464,6 @@
         </w:rPr>
         <w:t>_1</w:t>
       </w:r>
-      <w:proofErr w:type="gramStart"/>
       <w:r>
         <w:rPr>
           <w:rFonts w:ascii="TH Sarabun New" w:hAnsi="TH Sarabun New" w:cs="TH Sarabun New"/>
@@ -8559,7 +8490,6 @@
         </w:rPr>
         <w:t>เคยใช้</w:t>
       </w:r>
-      <w:proofErr w:type="gramEnd"/>
       <w:r>
         <w:rPr>
           <w:rFonts w:ascii="TH Sarabun New" w:hAnsi="TH Sarabun New" w:cs="TH Sarabun New"/>
@@ -8594,17 +8524,7 @@
           <w:szCs w:val="32"/>
           <w:cs/>
         </w:rPr>
-        <w:t>พ.</w:t>
-      </w:r>
-      <w:proofErr w:type="gramStart"/>
-      <w:r>
-        <w:rPr>
-          <w:rFonts w:ascii="TH Sarabun New" w:hAnsi="TH Sarabun New" w:cs="TH Sarabun New"/>
-          <w:sz w:val="32"/>
-          <w:szCs w:val="32"/>
-          <w:cs/>
-        </w:rPr>
-        <w:t>ศ</w:t>
+        <w:t>พ.ศ</w:t>
       </w:r>
       <w:r>
         <w:rPr>
@@ -8621,16 +8541,7 @@
           <w:sz w:val="32"/>
           <w:szCs w:val="32"/>
         </w:rPr>
-        <w:t>{{</w:t>
-      </w:r>
-      <w:proofErr w:type="gramEnd"/>
-      <w:r>
-        <w:rPr>
-          <w:rFonts w:ascii="TH Sarabun New" w:hAnsi="TH Sarabun New" w:cs="TH Sarabun New"/>
-          <w:sz w:val="32"/>
-          <w:szCs w:val="32"/>
-        </w:rPr>
-        <w:t>prof_used_other_year</w:t>
+        <w:t>{{prof_used_other_year</w:t>
       </w:r>
       <w:r>
         <w:rPr>
@@ -8880,7 +8791,6 @@
         </w:rPr>
         <w:t>not_used_book_1</w:t>
       </w:r>
-      <w:proofErr w:type="gramStart"/>
       <w:r>
         <w:rPr>
           <w:rFonts w:ascii="TH Sarabun New" w:hAnsi="TH Sarabun New" w:cs="TH Sarabun New"/>
@@ -8898,7 +8808,6 @@
         </w:rPr>
         <w:t xml:space="preserve">  ไม่เคยใช้</w:t>
       </w:r>
-      <w:proofErr w:type="gramEnd"/>
     </w:p>
     <w:p>
       <w:pPr>
@@ -8927,7 +8836,6 @@
         </w:rPr>
         <w:t>is_used_book_1</w:t>
       </w:r>
-      <w:proofErr w:type="gramStart"/>
       <w:r>
         <w:rPr>
           <w:rFonts w:ascii="TH Sarabun New" w:hAnsi="TH Sarabun New" w:cs="TH Sarabun New"/>
@@ -8954,7 +8862,6 @@
         </w:rPr>
         <w:t>เคยใช้</w:t>
       </w:r>
-      <w:proofErr w:type="gramEnd"/>
       <w:r>
         <w:rPr>
           <w:rFonts w:ascii="TH Sarabun New" w:hAnsi="TH Sarabun New" w:cs="TH Sarabun New"/>
@@ -8989,17 +8896,7 @@
           <w:szCs w:val="32"/>
           <w:cs/>
         </w:rPr>
-        <w:t>พ.</w:t>
-      </w:r>
-      <w:proofErr w:type="gramStart"/>
-      <w:r>
-        <w:rPr>
-          <w:rFonts w:ascii="TH Sarabun New" w:hAnsi="TH Sarabun New" w:cs="TH Sarabun New"/>
-          <w:sz w:val="32"/>
-          <w:szCs w:val="32"/>
-          <w:cs/>
-        </w:rPr>
-        <w:t>ศ</w:t>
+        <w:t>พ.ศ</w:t>
       </w:r>
       <w:r>
         <w:rPr>
@@ -9016,16 +8913,7 @@
           <w:sz w:val="32"/>
           <w:szCs w:val="32"/>
         </w:rPr>
-        <w:t>{{</w:t>
-      </w:r>
-      <w:proofErr w:type="gramEnd"/>
-      <w:r>
-        <w:rPr>
-          <w:rFonts w:ascii="TH Sarabun New" w:hAnsi="TH Sarabun New" w:cs="TH Sarabun New"/>
-          <w:sz w:val="32"/>
-          <w:szCs w:val="32"/>
-        </w:rPr>
-        <w:t>prof_</w:t>
+        <w:t>{{prof_</w:t>
       </w:r>
       <w:r>
         <w:rPr>
@@ -9233,16 +9121,7 @@
           <w:sz w:val="32"/>
           <w:szCs w:val="32"/>
         </w:rPr>
-        <w:t>_</w:t>
-      </w:r>
-      <w:proofErr w:type="gramStart"/>
-      <w:r>
-        <w:rPr>
-          <w:rFonts w:ascii="TH Sarabun New" w:hAnsi="TH Sarabun New" w:cs="TH Sarabun New"/>
-          <w:sz w:val="32"/>
-          <w:szCs w:val="32"/>
-        </w:rPr>
-        <w:t>1</w:t>
+        <w:t>_1</w:t>
       </w:r>
       <w:r>
         <w:rPr>
@@ -9276,16 +9155,7 @@
           <w:sz w:val="32"/>
           <w:szCs w:val="32"/>
         </w:rPr>
-        <w:t>{{</w:t>
-      </w:r>
-      <w:proofErr w:type="gramEnd"/>
-      <w:r>
-        <w:rPr>
-          <w:rFonts w:ascii="TH Sarabun New" w:hAnsi="TH Sarabun New" w:cs="TH Sarabun New"/>
-          <w:sz w:val="32"/>
-          <w:szCs w:val="32"/>
-        </w:rPr>
-        <w:t>prof_method3_research</w:t>
+        <w:t>{{prof_method3_research</w:t>
       </w:r>
       <w:r>
         <w:rPr>
@@ -9410,16 +9280,7 @@
           <w:sz w:val="32"/>
           <w:szCs w:val="32"/>
         </w:rPr>
-        <w:t>{{prof_m3_q1</w:t>
-      </w:r>
-      <w:proofErr w:type="gramStart"/>
-      <w:r>
-        <w:rPr>
-          <w:rFonts w:ascii="TH Sarabun New" w:hAnsi="TH Sarabun New" w:cs="TH Sarabun New"/>
-          <w:sz w:val="32"/>
-          <w:szCs w:val="32"/>
-        </w:rPr>
-        <w:t>}}</w:t>
+        <w:t>{{prof_m3_q1}}</w:t>
       </w:r>
       <w:r>
         <w:rPr>
@@ -9447,7 +9308,6 @@
         </w:rPr>
         <w:t>Quartile</w:t>
       </w:r>
-      <w:proofErr w:type="gramEnd"/>
       <w:r>
         <w:rPr>
           <w:rFonts w:ascii="TH Sarabun New" w:hAnsi="TH Sarabun New" w:cs="TH Sarabun New"/>
@@ -9457,7 +9317,6 @@
         </w:rPr>
         <w:t xml:space="preserve">1 </w:t>
       </w:r>
-      <w:proofErr w:type="gramStart"/>
       <w:r>
         <w:rPr>
           <w:rFonts w:ascii="TH Sarabun New" w:hAnsi="TH Sarabun New" w:cs="TH Sarabun New"/>
@@ -9474,16 +9333,7 @@
           <w:sz w:val="32"/>
           <w:szCs w:val="32"/>
         </w:rPr>
-        <w:t>{</w:t>
-      </w:r>
-      <w:proofErr w:type="gramEnd"/>
-      <w:r>
-        <w:rPr>
-          <w:rFonts w:ascii="TH Sarabun New" w:hAnsi="TH Sarabun New" w:cs="TH Sarabun New"/>
-          <w:sz w:val="32"/>
-          <w:szCs w:val="32"/>
-        </w:rPr>
-        <w:t>{prof_m3_q2}}</w:t>
+        <w:t>{{prof_m3_q2}}</w:t>
       </w:r>
       <w:r>
         <w:rPr>
@@ -10030,16 +9880,7 @@
           <w:sz w:val="32"/>
           <w:szCs w:val="32"/>
         </w:rPr>
-        <w:t>{{prof_pi_project_</w:t>
-      </w:r>
-      <w:proofErr w:type="gramStart"/>
-      <w:r>
-        <w:rPr>
-          <w:rFonts w:ascii="TH Sarabun New" w:hAnsi="TH Sarabun New" w:cs="TH Sarabun New"/>
-          <w:sz w:val="32"/>
-          <w:szCs w:val="32"/>
-        </w:rPr>
-        <w:t>no}}</w:t>
+        <w:t>{{prof_pi_project_no}}</w:t>
       </w:r>
       <w:r>
         <w:rPr>
@@ -10065,16 +9906,7 @@
           <w:sz w:val="32"/>
           <w:szCs w:val="32"/>
         </w:rPr>
-        <w:t>{{</w:t>
-      </w:r>
-      <w:proofErr w:type="gramEnd"/>
-      <w:r>
-        <w:rPr>
-          <w:rFonts w:ascii="TH Sarabun New" w:hAnsi="TH Sarabun New" w:cs="TH Sarabun New"/>
-          <w:sz w:val="32"/>
-          <w:szCs w:val="32"/>
-        </w:rPr>
-        <w:t>prof_pi_project}}</w:t>
+        <w:t>{{prof_pi_project}}</w:t>
       </w:r>
     </w:p>
     <w:p>

</xml_diff>

<commit_message>
Enhance autosave, date autofill, and dynamic rows
Add MutationObserver to auto_draft.js so dynamic DOM changes (added/removed rows) trigger draft saves; standardize saved form serialization (store unchecked checkboxes as "☐" and default empty strings for other fields).

Update thai_date_autofill.js to use NO_AUTOFILL semantics (fields still get a datepicker but won't be auto-filled) and avoid setting ISO value for skipped fields.

Improve draft restore logic in multiple doc_form templates (admin/applicant, forms 1 & 7): detect max indices for various dynamic row/block groups, create missing rows/blocks before populating values, re-trigger visibility and radio events after restore, and log errors on failure. Also switch numbering helper from toThaiDigits to toThaiNum in education rows.

Update binary docx/.DS_Store files and uploaded p2doc_1.docx (template/content changes).
</commit_message>
<xml_diff>
--- a/HRCP-KKU-Academic/src/main/resources/templates/docx/Phase2/p2doc_1.docx
+++ b/HRCP-KKU-Academic/src/main/resources/templates/docx/Phase2/p2doc_1.docx
@@ -1184,7 +1184,7 @@
     </w:p>
     <w:tbl>
       <w:tblPr>
-        <w:tblStyle w:val="a8"/>
+        <w:tblStyle w:val="TableGrid"/>
         <w:tblW w:w="0" w:type="auto"/>
         <w:jc w:val="center"/>
         <w:tblBorders>
@@ -1740,7 +1740,7 @@
           <w:szCs w:val="32"/>
           <w:cs/>
         </w:rPr>
-        <w:t>๒.๒ ได้รับแต่งตั้งให้ดำรงตำแหน่งอาจารย์ เมื่อวันที่</w:t>
+        <w:t>๒.๒ ได้รับแต่งตั้งให้ดำรงตำแหน่งอาจารย์ เมื่อ</w:t>
       </w:r>
       <w:r>
         <w:rPr>
@@ -1906,7 +1906,7 @@
           <w:szCs w:val="32"/>
           <w:cs/>
         </w:rPr>
-        <w:t>เมื่อวันที่</w:t>
+        <w:t>เมื่อ</w:t>
       </w:r>
       <w:r>
         <w:rPr>
@@ -2105,7 +2105,7 @@
           <w:szCs w:val="32"/>
           <w:cs/>
         </w:rPr>
-        <w:t>เมื่อวันที่</w:t>
+        <w:t>เมื่อ</w:t>
       </w:r>
       <w:r>
         <w:rPr>
@@ -2627,7 +2627,7 @@
     </w:p>
     <w:tbl>
       <w:tblPr>
-        <w:tblStyle w:val="a8"/>
+        <w:tblStyle w:val="TableGrid"/>
         <w:tblW w:w="0" w:type="auto"/>
         <w:tblBorders>
           <w:top w:val="none" w:sz="0" w:space="0" w:color="auto"/>
@@ -3446,7 +3446,7 @@
         <w:spacing w:after="0" w:line="240" w:lineRule="auto"/>
         <w:ind w:left="1755" w:firstLine="720"/>
         <w:rPr>
-          <w:rFonts w:ascii="TH Sarabun New" w:hAnsi="TH Sarabun New" w:cs="TH Sarabun New" w:hint="cs"/>
+          <w:rFonts w:ascii="TH Sarabun New" w:hAnsi="TH Sarabun New" w:cs="TH Sarabun New"/>
           <w:sz w:val="32"/>
           <w:szCs w:val="32"/>
           <w:cs/>
@@ -3988,7 +3988,7 @@
         <w:spacing w:after="0" w:line="240" w:lineRule="auto"/>
         <w:ind w:left="1755" w:firstLine="720"/>
         <w:rPr>
-          <w:rFonts w:ascii="TH Sarabun New" w:hAnsi="TH Sarabun New" w:cs="TH Sarabun New" w:hint="cs"/>
+          <w:rFonts w:ascii="TH Sarabun New" w:hAnsi="TH Sarabun New" w:cs="TH Sarabun New"/>
           <w:sz w:val="32"/>
           <w:szCs w:val="32"/>
           <w:cs/>
@@ -4518,7 +4518,7 @@
         <w:spacing w:after="0" w:line="240" w:lineRule="auto"/>
         <w:ind w:left="1755" w:firstLine="720"/>
         <w:rPr>
-          <w:rFonts w:ascii="TH Sarabun New" w:hAnsi="TH Sarabun New" w:cs="TH Sarabun New" w:hint="cs"/>
+          <w:rFonts w:ascii="TH Sarabun New" w:hAnsi="TH Sarabun New" w:cs="TH Sarabun New"/>
           <w:sz w:val="32"/>
           <w:szCs w:val="32"/>
           <w:cs/>
@@ -5215,7 +5215,7 @@
         <w:spacing w:after="0" w:line="240" w:lineRule="auto"/>
         <w:ind w:left="1755" w:firstLine="720"/>
         <w:rPr>
-          <w:rFonts w:ascii="TH Sarabun New" w:hAnsi="TH Sarabun New" w:cs="TH Sarabun New" w:hint="cs"/>
+          <w:rFonts w:ascii="TH Sarabun New" w:hAnsi="TH Sarabun New" w:cs="TH Sarabun New"/>
           <w:sz w:val="32"/>
           <w:szCs w:val="32"/>
           <w:cs/>
@@ -5752,7 +5752,7 @@
         <w:spacing w:after="0" w:line="240" w:lineRule="auto"/>
         <w:ind w:left="1755" w:firstLine="720"/>
         <w:rPr>
-          <w:rFonts w:ascii="TH Sarabun New" w:hAnsi="TH Sarabun New" w:cs="TH Sarabun New" w:hint="cs"/>
+          <w:rFonts w:ascii="TH Sarabun New" w:hAnsi="TH Sarabun New" w:cs="TH Sarabun New"/>
           <w:sz w:val="32"/>
           <w:szCs w:val="32"/>
         </w:rPr>
@@ -6307,7 +6307,7 @@
         <w:spacing w:after="0" w:line="240" w:lineRule="auto"/>
         <w:ind w:left="1755" w:firstLine="720"/>
         <w:rPr>
-          <w:rFonts w:ascii="TH Sarabun New" w:hAnsi="TH Sarabun New" w:cs="TH Sarabun New" w:hint="cs"/>
+          <w:rFonts w:ascii="TH Sarabun New" w:hAnsi="TH Sarabun New" w:cs="TH Sarabun New"/>
           <w:sz w:val="32"/>
           <w:szCs w:val="32"/>
           <w:cs/>
@@ -7970,7 +7970,7 @@
         <w:spacing w:after="0" w:line="240" w:lineRule="auto"/>
         <w:ind w:left="1755" w:firstLine="720"/>
         <w:rPr>
-          <w:rFonts w:ascii="TH Sarabun New" w:hAnsi="TH Sarabun New" w:cs="TH Sarabun New" w:hint="cs"/>
+          <w:rFonts w:ascii="TH Sarabun New" w:hAnsi="TH Sarabun New" w:cs="TH Sarabun New"/>
           <w:sz w:val="32"/>
           <w:szCs w:val="32"/>
           <w:cs/>
@@ -8442,7 +8442,7 @@
         <w:spacing w:after="0" w:line="240" w:lineRule="auto"/>
         <w:ind w:left="1755" w:firstLine="720"/>
         <w:rPr>
-          <w:rFonts w:ascii="TH Sarabun New" w:hAnsi="TH Sarabun New" w:cs="TH Sarabun New" w:hint="cs"/>
+          <w:rFonts w:ascii="TH Sarabun New" w:hAnsi="TH Sarabun New" w:cs="TH Sarabun New"/>
           <w:sz w:val="32"/>
           <w:szCs w:val="32"/>
           <w:cs/>
@@ -8814,7 +8814,7 @@
         <w:spacing w:after="0" w:line="240" w:lineRule="auto"/>
         <w:ind w:left="1755" w:firstLine="720"/>
         <w:rPr>
-          <w:rFonts w:ascii="TH Sarabun New" w:hAnsi="TH Sarabun New" w:cs="TH Sarabun New" w:hint="cs"/>
+          <w:rFonts w:ascii="TH Sarabun New" w:hAnsi="TH Sarabun New" w:cs="TH Sarabun New"/>
           <w:sz w:val="32"/>
           <w:szCs w:val="32"/>
           <w:cs/>
@@ -10285,24 +10285,6 @@
           <w:cs/>
         </w:rPr>
       </w:pPr>
-      <w:r>
-        <w:rPr>
-          <w:rFonts w:ascii="TH Sarabun New" w:hAnsi="TH Sarabun New" w:cs="TH Sarabun New"/>
-          <w:sz w:val="32"/>
-          <w:szCs w:val="32"/>
-          <w:cs/>
-        </w:rPr>
-        <w:t>วันที่</w:t>
-      </w:r>
-      <w:r>
-        <w:rPr>
-          <w:rFonts w:ascii="TH Sarabun New" w:hAnsi="TH Sarabun New" w:cs="TH Sarabun New"/>
-          <w:sz w:val="32"/>
-          <w:szCs w:val="32"/>
-          <w:cs/>
-        </w:rPr>
-        <w:t xml:space="preserve"> </w:t>
-      </w:r>
       <w:r>
         <w:rPr>
           <w:rFonts w:ascii="TH Sarabun New" w:hAnsi="TH Sarabun New" w:cs="TH Sarabun New"/>
@@ -11213,16 +11195,16 @@
     <w:lsdException w:name="Unresolved Mention" w:semiHidden="1" w:unhideWhenUsed="1"/>
     <w:lsdException w:name="Smart Link" w:semiHidden="1" w:unhideWhenUsed="1"/>
   </w:latentStyles>
-  <w:style w:type="paragraph" w:default="1" w:styleId="a">
+  <w:style w:type="paragraph" w:default="1" w:styleId="Normal">
     <w:name w:val="Normal"/>
     <w:qFormat/>
     <w:rsid w:val="00EA52CC"/>
   </w:style>
-  <w:style w:type="paragraph" w:styleId="1">
+  <w:style w:type="paragraph" w:styleId="Heading1">
     <w:name w:val="heading 1"/>
-    <w:basedOn w:val="a"/>
-    <w:next w:val="a"/>
-    <w:link w:val="10"/>
+    <w:basedOn w:val="Normal"/>
+    <w:next w:val="Normal"/>
+    <w:link w:val="Heading1Char"/>
     <w:qFormat/>
     <w:rsid w:val="009A19D5"/>
     <w:pPr>
@@ -11238,13 +11220,13 @@
       <w:szCs w:val="32"/>
     </w:rPr>
   </w:style>
-  <w:style w:type="character" w:default="1" w:styleId="a0">
+  <w:style w:type="character" w:default="1" w:styleId="DefaultParagraphFont">
     <w:name w:val="Default Paragraph Font"/>
     <w:uiPriority w:val="1"/>
     <w:semiHidden/>
     <w:unhideWhenUsed/>
   </w:style>
-  <w:style w:type="table" w:default="1" w:styleId="a1">
+  <w:style w:type="table" w:default="1" w:styleId="TableNormal">
     <w:name w:val="Normal Table"/>
     <w:uiPriority w:val="99"/>
     <w:semiHidden/>
@@ -11259,15 +11241,15 @@
       </w:tblCellMar>
     </w:tblPr>
   </w:style>
-  <w:style w:type="numbering" w:default="1" w:styleId="a2">
+  <w:style w:type="numbering" w:default="1" w:styleId="NoList">
     <w:name w:val="No List"/>
     <w:uiPriority w:val="99"/>
     <w:semiHidden/>
     <w:unhideWhenUsed/>
   </w:style>
-  <w:style w:type="paragraph" w:styleId="a3">
+  <w:style w:type="paragraph" w:styleId="ListParagraph">
     <w:name w:val="List Paragraph"/>
-    <w:basedOn w:val="a"/>
+    <w:basedOn w:val="Normal"/>
     <w:uiPriority w:val="34"/>
     <w:qFormat/>
     <w:rsid w:val="00EA52CC"/>
@@ -11276,10 +11258,10 @@
       <w:contextualSpacing/>
     </w:pPr>
   </w:style>
-  <w:style w:type="paragraph" w:styleId="a4">
+  <w:style w:type="paragraph" w:styleId="Header">
     <w:name w:val="header"/>
-    <w:basedOn w:val="a"/>
-    <w:link w:val="a5"/>
+    <w:basedOn w:val="Normal"/>
+    <w:link w:val="HeaderChar"/>
     <w:uiPriority w:val="99"/>
     <w:unhideWhenUsed/>
     <w:rsid w:val="00EA52CC"/>
@@ -11291,17 +11273,17 @@
       <w:spacing w:after="0" w:line="240" w:lineRule="auto"/>
     </w:pPr>
   </w:style>
-  <w:style w:type="character" w:customStyle="1" w:styleId="a5">
-    <w:name w:val="หัวกระดาษ อักขระ"/>
-    <w:basedOn w:val="a0"/>
-    <w:link w:val="a4"/>
+  <w:style w:type="character" w:customStyle="1" w:styleId="HeaderChar">
+    <w:name w:val="Header Char"/>
+    <w:basedOn w:val="DefaultParagraphFont"/>
+    <w:link w:val="Header"/>
     <w:uiPriority w:val="99"/>
     <w:rsid w:val="00EA52CC"/>
   </w:style>
-  <w:style w:type="paragraph" w:styleId="a6">
+  <w:style w:type="paragraph" w:styleId="Footer">
     <w:name w:val="footer"/>
-    <w:basedOn w:val="a"/>
-    <w:link w:val="a7"/>
+    <w:basedOn w:val="Normal"/>
+    <w:link w:val="FooterChar"/>
     <w:uiPriority w:val="99"/>
     <w:unhideWhenUsed/>
     <w:rsid w:val="00EA52CC"/>
@@ -11313,16 +11295,16 @@
       <w:spacing w:after="0" w:line="240" w:lineRule="auto"/>
     </w:pPr>
   </w:style>
-  <w:style w:type="character" w:customStyle="1" w:styleId="a7">
-    <w:name w:val="ท้ายกระดาษ อักขระ"/>
-    <w:basedOn w:val="a0"/>
-    <w:link w:val="a6"/>
+  <w:style w:type="character" w:customStyle="1" w:styleId="FooterChar">
+    <w:name w:val="Footer Char"/>
+    <w:basedOn w:val="DefaultParagraphFont"/>
+    <w:link w:val="Footer"/>
     <w:uiPriority w:val="99"/>
     <w:rsid w:val="00EA52CC"/>
   </w:style>
-  <w:style w:type="table" w:styleId="a8">
+  <w:style w:type="table" w:styleId="TableGrid">
     <w:name w:val="Table Grid"/>
-    <w:basedOn w:val="a1"/>
+    <w:basedOn w:val="TableNormal"/>
     <w:uiPriority w:val="39"/>
     <w:rsid w:val="00CD3705"/>
     <w:pPr>
@@ -11339,10 +11321,10 @@
       </w:tblBorders>
     </w:tblPr>
   </w:style>
-  <w:style w:type="character" w:customStyle="1" w:styleId="10">
-    <w:name w:val="หัวเรื่อง 1 อักขระ"/>
-    <w:basedOn w:val="a0"/>
-    <w:link w:val="1"/>
+  <w:style w:type="character" w:customStyle="1" w:styleId="Heading1Char">
+    <w:name w:val="Heading 1 Char"/>
+    <w:basedOn w:val="DefaultParagraphFont"/>
+    <w:link w:val="Heading1"/>
     <w:rsid w:val="009A19D5"/>
     <w:rPr>
       <w:rFonts w:ascii="Angsana New" w:eastAsia="Cordia New" w:hAnsi="Angsana New" w:cs="Angsana New"/>

</xml_diff>

<commit_message>
Add used/not-used radios and year inputs
Replace single year text inputs with a pair of radio buttons ("ไม่เคยใช้" / "เคยใช้") plus a dedicated year input (placeholder "ปี พ.ศ.") and adjusted column layout. Changes apply to associated and professor sections for research, other works, and books in doc_form_1.html to better capture whether a work was previously used and its year. Also update binary template HRCP-KKU-Academic/src/main/resources/templates/docx/Phase2/p2doc_1.docx.
</commit_message>
<xml_diff>
--- a/HRCP-KKU-Academic/src/main/resources/templates/docx/Phase2/p2doc_1.docx
+++ b/HRCP-KKU-Academic/src/main/resources/templates/docx/Phase2/p2doc_1.docx
@@ -1008,49 +1008,23 @@
           <w:cs/>
         </w:rPr>
         <w:tab/>
-        <w:t>วัน</w:t>
-      </w:r>
-      <w:r>
-        <w:rPr>
-          <w:rFonts w:ascii="TH Sarabun New" w:hAnsi="TH Sarabun New" w:cs="TH Sarabun New"/>
-          <w:sz w:val="32"/>
-          <w:szCs w:val="32"/>
-        </w:rPr>
-        <w:t xml:space="preserve">    </w:t>
-      </w:r>
-      <w:r>
-        <w:rPr>
-          <w:rFonts w:ascii="TH Sarabun New" w:hAnsi="TH Sarabun New" w:cs="TH Sarabun New"/>
-          <w:sz w:val="32"/>
-          <w:szCs w:val="32"/>
-          <w:cs/>
-        </w:rPr>
-        <w:t>เดือน</w:t>
-      </w:r>
-      <w:r>
-        <w:rPr>
-          <w:rFonts w:ascii="TH Sarabun New" w:hAnsi="TH Sarabun New" w:cs="TH Sarabun New"/>
-          <w:sz w:val="32"/>
-          <w:szCs w:val="32"/>
-        </w:rPr>
-        <w:t xml:space="preserve">    </w:t>
-      </w:r>
-      <w:r>
-        <w:rPr>
-          <w:rFonts w:ascii="TH Sarabun New" w:hAnsi="TH Sarabun New" w:cs="TH Sarabun New"/>
-          <w:sz w:val="32"/>
-          <w:szCs w:val="32"/>
-          <w:cs/>
-        </w:rPr>
-        <w:t xml:space="preserve"> ปีเกิด</w:t>
-      </w:r>
-      <w:r>
-        <w:rPr>
-          <w:rFonts w:ascii="TH Sarabun New" w:hAnsi="TH Sarabun New" w:cs="TH Sarabun New"/>
-          <w:sz w:val="32"/>
-          <w:szCs w:val="32"/>
-        </w:rPr>
-        <w:t xml:space="preserve"> {{birth_date}}</w:t>
+      </w:r>
+      <w:r>
+        <w:rPr>
+          <w:rFonts w:ascii="TH Sarabun New" w:hAnsi="TH Sarabun New" w:cs="TH Sarabun New" w:hint="cs"/>
+          <w:sz w:val="32"/>
+          <w:szCs w:val="32"/>
+          <w:cs/>
+        </w:rPr>
+        <w:t xml:space="preserve">เกิดเมื่อ </w:t>
+      </w:r>
+      <w:r>
+        <w:rPr>
+          <w:rFonts w:ascii="TH Sarabun New" w:hAnsi="TH Sarabun New" w:cs="TH Sarabun New"/>
+          <w:sz w:val="32"/>
+          <w:szCs w:val="32"/>
+        </w:rPr>
+        <w:t>{{birth_date}}</w:t>
       </w:r>
     </w:p>
     <w:p>

</xml_diff>